<commit_message>
updated as of 30-DEc-20205
</commit_message>
<xml_diff>
--- a/Jenkins/Jenkins-02.docx
+++ b/Jenkins/Jenkins-02.docx
@@ -285,10 +285,28 @@
         <w:t xml:space="preserve">The objective of this task is to </w:t>
       </w:r>
       <w:r>
-        <w:t xml:space="preserve">configure 2 slave machines in Jenkins master. For that, we need to create 2 new instances </w:t>
-      </w:r>
-      <w:r>
-        <w:t xml:space="preserve">and install java </w:t>
+        <w:t xml:space="preserve">configure 2 slave machines </w:t>
+      </w:r>
+      <w:r>
+        <w:t>parallel with</w:t>
+      </w:r>
+      <w:r>
+        <w:t xml:space="preserve"> Jenkins master</w:t>
+      </w:r>
+      <w:r>
+        <w:t xml:space="preserve"> to improve CI/CD efficiency and distribute </w:t>
+      </w:r>
+      <w:r>
+        <w:t>build workloads</w:t>
+      </w:r>
+      <w:r>
+        <w:t xml:space="preserve"> For that, we need to create 2 new instances </w:t>
+      </w:r>
+      <w:r>
+        <w:t>and install java</w:t>
+      </w:r>
+      <w:r>
+        <w:t xml:space="preserve">. </w:t>
       </w:r>
     </w:p>
     <w:p>
@@ -332,6 +350,45 @@
       <w:r>
         <w:t>Jenkins</w:t>
       </w:r>
+      <w:r>
+        <w:t xml:space="preserve"> master </w:t>
+      </w:r>
+    </w:p>
+    <w:p>
+      <w:pPr>
+        <w:pStyle w:val="ListParagraph"/>
+        <w:numPr>
+          <w:ilvl w:val="0"/>
+          <w:numId w:val="3"/>
+        </w:numPr>
+      </w:pPr>
+      <w:r>
+        <w:t>Java installation on slave ec2s</w:t>
+      </w:r>
+    </w:p>
+    <w:p>
+      <w:pPr>
+        <w:pStyle w:val="ListParagraph"/>
+        <w:numPr>
+          <w:ilvl w:val="0"/>
+          <w:numId w:val="3"/>
+        </w:numPr>
+      </w:pPr>
+      <w:r>
+        <w:t>2 slave machines (Agents)</w:t>
+      </w:r>
+    </w:p>
+    <w:p>
+      <w:pPr>
+        <w:pStyle w:val="ListParagraph"/>
+        <w:numPr>
+          <w:ilvl w:val="0"/>
+          <w:numId w:val="3"/>
+        </w:numPr>
+      </w:pPr>
+      <w:r>
+        <w:t>GitHub repo</w:t>
+      </w:r>
     </w:p>
     <w:p>
       <w:pPr>
@@ -362,32 +419,1003 @@
         </w:rPr>
         <w:t xml:space="preserve">Step 1: </w:t>
       </w:r>
-    </w:p>
-    <w:p>
-      <w:pPr>
-        <w:ind w:left="720"/>
-        <w:rPr>
-          <w:b/>
-          <w:bCs/>
-        </w:rPr>
-      </w:pPr>
-    </w:p>
-    <w:p>
-      <w:pPr>
-        <w:ind w:left="720"/>
-        <w:rPr>
-          <w:b/>
-          <w:bCs/>
-        </w:rPr>
-      </w:pPr>
-    </w:p>
-    <w:p>
-      <w:pPr>
-        <w:ind w:left="720"/>
-        <w:rPr>
-          <w:b/>
-          <w:bCs/>
-        </w:rPr>
+      <w:r>
+        <w:t>Navigate to ec2 and launch a instance.</w:t>
+      </w:r>
+      <w:r>
+        <w:rPr>
+          <w:b/>
+          <w:bCs/>
+        </w:rPr>
+        <w:t xml:space="preserve"> </w:t>
+      </w:r>
+    </w:p>
+    <w:p>
+      <w:pPr>
+        <w:ind w:left="720"/>
+        <w:rPr>
+          <w:b/>
+          <w:bCs/>
+        </w:rPr>
+      </w:pPr>
+      <w:r>
+        <w:rPr>
+          <w:b/>
+          <w:bCs/>
+          <w:noProof/>
+        </w:rPr>
+        <w:drawing>
+          <wp:inline distT="0" distB="0" distL="0" distR="0" wp14:anchorId="47F5FA37" wp14:editId="61F530A7">
+            <wp:extent cx="5731510" cy="2402205"/>
+            <wp:effectExtent l="0" t="0" r="2540" b="0"/>
+            <wp:docPr id="2111045938" name="Picture 1"/>
+            <wp:cNvGraphicFramePr>
+              <a:graphicFrameLocks xmlns:a="http://schemas.openxmlformats.org/drawingml/2006/main" noChangeAspect="1"/>
+            </wp:cNvGraphicFramePr>
+            <a:graphic xmlns:a="http://schemas.openxmlformats.org/drawingml/2006/main">
+              <a:graphicData uri="http://schemas.openxmlformats.org/drawingml/2006/picture">
+                <pic:pic xmlns:pic="http://schemas.openxmlformats.org/drawingml/2006/picture">
+                  <pic:nvPicPr>
+                    <pic:cNvPr id="2111045938" name=""/>
+                    <pic:cNvPicPr/>
+                  </pic:nvPicPr>
+                  <pic:blipFill>
+                    <a:blip r:embed="rId5"/>
+                    <a:stretch>
+                      <a:fillRect/>
+                    </a:stretch>
+                  </pic:blipFill>
+                  <pic:spPr>
+                    <a:xfrm>
+                      <a:off x="0" y="0"/>
+                      <a:ext cx="5731510" cy="2402205"/>
+                    </a:xfrm>
+                    <a:prstGeom prst="rect">
+                      <a:avLst/>
+                    </a:prstGeom>
+                  </pic:spPr>
+                </pic:pic>
+              </a:graphicData>
+            </a:graphic>
+          </wp:inline>
+        </w:drawing>
+      </w:r>
+    </w:p>
+    <w:p>
+      <w:pPr>
+        <w:pStyle w:val="ListParagraph"/>
+        <w:numPr>
+          <w:ilvl w:val="0"/>
+          <w:numId w:val="8"/>
+        </w:numPr>
+        <w:rPr>
+          <w:b/>
+          <w:bCs/>
+        </w:rPr>
+      </w:pPr>
+      <w:r>
+        <w:t xml:space="preserve">Instance launched successfully. </w:t>
+      </w:r>
+    </w:p>
+    <w:p>
+      <w:pPr>
+        <w:ind w:left="720"/>
+        <w:rPr>
+          <w:b/>
+          <w:bCs/>
+        </w:rPr>
+      </w:pPr>
+      <w:r>
+        <w:rPr>
+          <w:b/>
+          <w:bCs/>
+          <w:noProof/>
+        </w:rPr>
+        <w:drawing>
+          <wp:inline distT="0" distB="0" distL="0" distR="0" wp14:anchorId="6A1F9F27" wp14:editId="6E6F44BC">
+            <wp:extent cx="5731510" cy="1249680"/>
+            <wp:effectExtent l="0" t="0" r="2540" b="7620"/>
+            <wp:docPr id="1121257840" name="Picture 1" descr="A screenshot of a computer&#10;&#10;AI-generated content may be incorrect."/>
+            <wp:cNvGraphicFramePr>
+              <a:graphicFrameLocks xmlns:a="http://schemas.openxmlformats.org/drawingml/2006/main" noChangeAspect="1"/>
+            </wp:cNvGraphicFramePr>
+            <a:graphic xmlns:a="http://schemas.openxmlformats.org/drawingml/2006/main">
+              <a:graphicData uri="http://schemas.openxmlformats.org/drawingml/2006/picture">
+                <pic:pic xmlns:pic="http://schemas.openxmlformats.org/drawingml/2006/picture">
+                  <pic:nvPicPr>
+                    <pic:cNvPr id="1121257840" name="Picture 1" descr="A screenshot of a computer&#10;&#10;AI-generated content may be incorrect."/>
+                    <pic:cNvPicPr/>
+                  </pic:nvPicPr>
+                  <pic:blipFill>
+                    <a:blip r:embed="rId6"/>
+                    <a:stretch>
+                      <a:fillRect/>
+                    </a:stretch>
+                  </pic:blipFill>
+                  <pic:spPr>
+                    <a:xfrm>
+                      <a:off x="0" y="0"/>
+                      <a:ext cx="5731510" cy="1249680"/>
+                    </a:xfrm>
+                    <a:prstGeom prst="rect">
+                      <a:avLst/>
+                    </a:prstGeom>
+                  </pic:spPr>
+                </pic:pic>
+              </a:graphicData>
+            </a:graphic>
+          </wp:inline>
+        </w:drawing>
+      </w:r>
+    </w:p>
+    <w:p>
+      <w:pPr>
+        <w:ind w:left="720"/>
+        <w:rPr>
+          <w:b/>
+          <w:bCs/>
+        </w:rPr>
+      </w:pPr>
+    </w:p>
+    <w:p>
+      <w:pPr>
+        <w:ind w:left="720"/>
+      </w:pPr>
+      <w:r>
+        <w:rPr>
+          <w:b/>
+          <w:bCs/>
+        </w:rPr>
+        <w:t xml:space="preserve">Step 2: </w:t>
+      </w:r>
+      <w:r>
+        <w:t>Install Java on Slave-01 ec2</w:t>
+      </w:r>
+    </w:p>
+    <w:p>
+      <w:pPr>
+        <w:ind w:left="720"/>
+      </w:pPr>
+      <w:r>
+        <w:rPr>
+          <w:noProof/>
+        </w:rPr>
+        <w:lastRenderedPageBreak/>
+        <w:drawing>
+          <wp:inline distT="0" distB="0" distL="0" distR="0" wp14:anchorId="1A1D943F" wp14:editId="6673327B">
+            <wp:extent cx="5731510" cy="6799580"/>
+            <wp:effectExtent l="0" t="0" r="2540" b="1270"/>
+            <wp:docPr id="919223422" name="Picture 1"/>
+            <wp:cNvGraphicFramePr>
+              <a:graphicFrameLocks xmlns:a="http://schemas.openxmlformats.org/drawingml/2006/main" noChangeAspect="1"/>
+            </wp:cNvGraphicFramePr>
+            <a:graphic xmlns:a="http://schemas.openxmlformats.org/drawingml/2006/main">
+              <a:graphicData uri="http://schemas.openxmlformats.org/drawingml/2006/picture">
+                <pic:pic xmlns:pic="http://schemas.openxmlformats.org/drawingml/2006/picture">
+                  <pic:nvPicPr>
+                    <pic:cNvPr id="919223422" name=""/>
+                    <pic:cNvPicPr/>
+                  </pic:nvPicPr>
+                  <pic:blipFill>
+                    <a:blip r:embed="rId7"/>
+                    <a:stretch>
+                      <a:fillRect/>
+                    </a:stretch>
+                  </pic:blipFill>
+                  <pic:spPr>
+                    <a:xfrm>
+                      <a:off x="0" y="0"/>
+                      <a:ext cx="5731510" cy="6799580"/>
+                    </a:xfrm>
+                    <a:prstGeom prst="rect">
+                      <a:avLst/>
+                    </a:prstGeom>
+                  </pic:spPr>
+                </pic:pic>
+              </a:graphicData>
+            </a:graphic>
+          </wp:inline>
+        </w:drawing>
+      </w:r>
+    </w:p>
+    <w:p>
+      <w:pPr>
+        <w:ind w:left="720"/>
+      </w:pPr>
+    </w:p>
+    <w:p>
+      <w:pPr>
+        <w:ind w:left="720"/>
+        <w:rPr>
+          <w:b/>
+          <w:bCs/>
+        </w:rPr>
+      </w:pPr>
+      <w:r>
+        <w:rPr>
+          <w:b/>
+          <w:bCs/>
+        </w:rPr>
+        <w:t xml:space="preserve">Step 3: </w:t>
+      </w:r>
+      <w:r>
+        <w:t>Steps to be done on Slave machine below.</w:t>
+      </w:r>
+      <w:r>
+        <w:rPr>
+          <w:b/>
+          <w:bCs/>
+        </w:rPr>
+        <w:t xml:space="preserve"> </w:t>
+      </w:r>
+    </w:p>
+    <w:p>
+      <w:pPr>
+        <w:pStyle w:val="ListParagraph"/>
+        <w:numPr>
+          <w:ilvl w:val="0"/>
+          <w:numId w:val="8"/>
+        </w:numPr>
+      </w:pPr>
+      <w:r>
+        <w:t>Ssh-keygen</w:t>
+      </w:r>
+      <w:r>
+        <w:t xml:space="preserve"> -enter, enter.</w:t>
+      </w:r>
+    </w:p>
+    <w:p>
+      <w:pPr>
+        <w:pStyle w:val="ListParagraph"/>
+        <w:numPr>
+          <w:ilvl w:val="0"/>
+          <w:numId w:val="8"/>
+        </w:numPr>
+      </w:pPr>
+      <w:r>
+        <w:t>Change directory to .ssh</w:t>
+      </w:r>
+    </w:p>
+    <w:p>
+      <w:pPr>
+        <w:pStyle w:val="ListParagraph"/>
+        <w:numPr>
+          <w:ilvl w:val="0"/>
+          <w:numId w:val="8"/>
+        </w:numPr>
+      </w:pPr>
+      <w:r>
+        <w:t>Cat id_rsa.pub &gt;&gt; authorized_keys</w:t>
+      </w:r>
+    </w:p>
+    <w:p>
+      <w:pPr>
+        <w:pStyle w:val="ListParagraph"/>
+        <w:numPr>
+          <w:ilvl w:val="0"/>
+          <w:numId w:val="8"/>
+        </w:numPr>
+      </w:pPr>
+      <w:r>
+        <w:t>Cat authorized_keys</w:t>
+      </w:r>
+    </w:p>
+    <w:p>
+      <w:pPr>
+        <w:ind w:left="720"/>
+        <w:rPr>
+          <w:b/>
+          <w:bCs/>
+        </w:rPr>
+      </w:pPr>
+      <w:r>
+        <w:rPr>
+          <w:b/>
+          <w:bCs/>
+          <w:noProof/>
+        </w:rPr>
+        <w:lastRenderedPageBreak/>
+        <w:drawing>
+          <wp:inline distT="0" distB="0" distL="0" distR="0" wp14:anchorId="604040DE" wp14:editId="0DE47671">
+            <wp:extent cx="5731510" cy="2292985"/>
+            <wp:effectExtent l="0" t="0" r="2540" b="0"/>
+            <wp:docPr id="1116805050" name="Picture 1"/>
+            <wp:cNvGraphicFramePr>
+              <a:graphicFrameLocks xmlns:a="http://schemas.openxmlformats.org/drawingml/2006/main" noChangeAspect="1"/>
+            </wp:cNvGraphicFramePr>
+            <a:graphic xmlns:a="http://schemas.openxmlformats.org/drawingml/2006/main">
+              <a:graphicData uri="http://schemas.openxmlformats.org/drawingml/2006/picture">
+                <pic:pic xmlns:pic="http://schemas.openxmlformats.org/drawingml/2006/picture">
+                  <pic:nvPicPr>
+                    <pic:cNvPr id="1116805050" name=""/>
+                    <pic:cNvPicPr/>
+                  </pic:nvPicPr>
+                  <pic:blipFill>
+                    <a:blip r:embed="rId8"/>
+                    <a:stretch>
+                      <a:fillRect/>
+                    </a:stretch>
+                  </pic:blipFill>
+                  <pic:spPr>
+                    <a:xfrm>
+                      <a:off x="0" y="0"/>
+                      <a:ext cx="5731510" cy="2292985"/>
+                    </a:xfrm>
+                    <a:prstGeom prst="rect">
+                      <a:avLst/>
+                    </a:prstGeom>
+                  </pic:spPr>
+                </pic:pic>
+              </a:graphicData>
+            </a:graphic>
+          </wp:inline>
+        </w:drawing>
+      </w:r>
+    </w:p>
+    <w:p>
+      <w:pPr>
+        <w:ind w:left="720"/>
+        <w:rPr>
+          <w:b/>
+          <w:bCs/>
+        </w:rPr>
+      </w:pPr>
+    </w:p>
+    <w:p>
+      <w:pPr>
+        <w:ind w:left="720"/>
+      </w:pPr>
+      <w:r>
+        <w:rPr>
+          <w:b/>
+          <w:bCs/>
+        </w:rPr>
+        <w:t xml:space="preserve">Step 4: </w:t>
+      </w:r>
+      <w:r>
+        <w:t>Steps to be done on Master machine</w:t>
+      </w:r>
+    </w:p>
+    <w:p>
+      <w:pPr>
+        <w:ind w:left="720"/>
+      </w:pPr>
+      <w:r>
+        <w:t>Login</w:t>
+      </w:r>
+    </w:p>
+    <w:p>
+      <w:pPr>
+        <w:ind w:left="720"/>
+      </w:pPr>
+      <w:r>
+        <w:t>Switch to root user</w:t>
+      </w:r>
+    </w:p>
+    <w:p>
+      <w:pPr>
+        <w:ind w:left="720"/>
+      </w:pPr>
+      <w:r>
+        <w:t>Create a directory – Mkdir -p /var/lib/Jenkins/.ssh</w:t>
+      </w:r>
+    </w:p>
+    <w:p>
+      <w:pPr>
+        <w:ind w:left="720"/>
+      </w:pPr>
+      <w:r>
+        <w:t>Change directory- cd /var/lib/Jenkins/.ssh</w:t>
+      </w:r>
+    </w:p>
+    <w:p>
+      <w:pPr>
+        <w:ind w:left="720"/>
+      </w:pPr>
+      <w:r>
+        <w:t>Now</w:t>
+      </w:r>
+      <w:r>
+        <w:t xml:space="preserve"> we need to paste the ssh-key from slave to machine- ssh-keyscan -H &lt;</w:t>
+      </w:r>
+      <w:r>
+        <w:t>Slave IP&gt; /var/lib/Jenkins/.ssh/known_hosts</w:t>
+      </w:r>
+    </w:p>
+    <w:p>
+      <w:pPr>
+        <w:ind w:left="720"/>
+      </w:pPr>
+      <w:r>
+        <w:t>Chown Jenkins: Jenkins known_hosts</w:t>
+      </w:r>
+    </w:p>
+    <w:p>
+      <w:pPr>
+        <w:ind w:left="720"/>
+      </w:pPr>
+      <w:r>
+        <w:t>Chmod 700 known_hosts</w:t>
+      </w:r>
+    </w:p>
+    <w:p>
+      <w:pPr>
+        <w:ind w:left="720"/>
+      </w:pPr>
+      <w:r>
+        <w:rPr>
+          <w:noProof/>
+        </w:rPr>
+        <w:drawing>
+          <wp:inline distT="0" distB="0" distL="0" distR="0" wp14:anchorId="3A43E1BD" wp14:editId="751A2E0D">
+            <wp:extent cx="5731510" cy="2144395"/>
+            <wp:effectExtent l="0" t="0" r="2540" b="8255"/>
+            <wp:docPr id="1259891646" name="Picture 1"/>
+            <wp:cNvGraphicFramePr>
+              <a:graphicFrameLocks xmlns:a="http://schemas.openxmlformats.org/drawingml/2006/main" noChangeAspect="1"/>
+            </wp:cNvGraphicFramePr>
+            <a:graphic xmlns:a="http://schemas.openxmlformats.org/drawingml/2006/main">
+              <a:graphicData uri="http://schemas.openxmlformats.org/drawingml/2006/picture">
+                <pic:pic xmlns:pic="http://schemas.openxmlformats.org/drawingml/2006/picture">
+                  <pic:nvPicPr>
+                    <pic:cNvPr id="1259891646" name=""/>
+                    <pic:cNvPicPr/>
+                  </pic:nvPicPr>
+                  <pic:blipFill>
+                    <a:blip r:embed="rId9"/>
+                    <a:stretch>
+                      <a:fillRect/>
+                    </a:stretch>
+                  </pic:blipFill>
+                  <pic:spPr>
+                    <a:xfrm>
+                      <a:off x="0" y="0"/>
+                      <a:ext cx="5731510" cy="2144395"/>
+                    </a:xfrm>
+                    <a:prstGeom prst="rect">
+                      <a:avLst/>
+                    </a:prstGeom>
+                  </pic:spPr>
+                </pic:pic>
+              </a:graphicData>
+            </a:graphic>
+          </wp:inline>
+        </w:drawing>
+      </w:r>
+    </w:p>
+    <w:p>
+      <w:pPr>
+        <w:ind w:left="720"/>
+      </w:pPr>
+      <w:r>
+        <w:lastRenderedPageBreak/>
+        <w:drawing>
+          <wp:inline distT="0" distB="0" distL="0" distR="0" wp14:anchorId="76244147" wp14:editId="11B75898">
+            <wp:extent cx="5731510" cy="1786255"/>
+            <wp:effectExtent l="0" t="0" r="2540" b="4445"/>
+            <wp:docPr id="788545077" name="Picture 1" descr="A screen shot of a computer&#10;&#10;AI-generated content may be incorrect."/>
+            <wp:cNvGraphicFramePr>
+              <a:graphicFrameLocks xmlns:a="http://schemas.openxmlformats.org/drawingml/2006/main" noChangeAspect="1"/>
+            </wp:cNvGraphicFramePr>
+            <a:graphic xmlns:a="http://schemas.openxmlformats.org/drawingml/2006/main">
+              <a:graphicData uri="http://schemas.openxmlformats.org/drawingml/2006/picture">
+                <pic:pic xmlns:pic="http://schemas.openxmlformats.org/drawingml/2006/picture">
+                  <pic:nvPicPr>
+                    <pic:cNvPr id="788545077" name="Picture 1" descr="A screen shot of a computer&#10;&#10;AI-generated content may be incorrect."/>
+                    <pic:cNvPicPr/>
+                  </pic:nvPicPr>
+                  <pic:blipFill>
+                    <a:blip r:embed="rId10"/>
+                    <a:stretch>
+                      <a:fillRect/>
+                    </a:stretch>
+                  </pic:blipFill>
+                  <pic:spPr>
+                    <a:xfrm>
+                      <a:off x="0" y="0"/>
+                      <a:ext cx="5731510" cy="1786255"/>
+                    </a:xfrm>
+                    <a:prstGeom prst="rect">
+                      <a:avLst/>
+                    </a:prstGeom>
+                  </pic:spPr>
+                </pic:pic>
+              </a:graphicData>
+            </a:graphic>
+          </wp:inline>
+        </w:drawing>
+      </w:r>
+    </w:p>
+    <w:p/>
+    <w:p>
+      <w:pPr>
+        <w:ind w:left="720"/>
+      </w:pPr>
+      <w:r>
+        <w:rPr>
+          <w:b/>
+          <w:bCs/>
+        </w:rPr>
+        <w:t>Step 5:</w:t>
+      </w:r>
+      <w:r>
+        <w:t xml:space="preserve"> Navigate to Jenkins and </w:t>
+      </w:r>
+      <w:r>
+        <w:t>search Nodes in Manage Jenkins</w:t>
+      </w:r>
+    </w:p>
+    <w:p>
+      <w:pPr>
+        <w:ind w:left="720"/>
+      </w:pPr>
+      <w:r>
+        <w:drawing>
+          <wp:inline distT="0" distB="0" distL="0" distR="0" wp14:anchorId="7007AFA7" wp14:editId="2E42F520">
+            <wp:extent cx="5731510" cy="2535555"/>
+            <wp:effectExtent l="0" t="0" r="2540" b="0"/>
+            <wp:docPr id="1107996704" name="Picture 1" descr="A screenshot of a chat&#10;&#10;AI-generated content may be incorrect."/>
+            <wp:cNvGraphicFramePr>
+              <a:graphicFrameLocks xmlns:a="http://schemas.openxmlformats.org/drawingml/2006/main" noChangeAspect="1"/>
+            </wp:cNvGraphicFramePr>
+            <a:graphic xmlns:a="http://schemas.openxmlformats.org/drawingml/2006/main">
+              <a:graphicData uri="http://schemas.openxmlformats.org/drawingml/2006/picture">
+                <pic:pic xmlns:pic="http://schemas.openxmlformats.org/drawingml/2006/picture">
+                  <pic:nvPicPr>
+                    <pic:cNvPr id="1107996704" name="Picture 1" descr="A screenshot of a chat&#10;&#10;AI-generated content may be incorrect."/>
+                    <pic:cNvPicPr/>
+                  </pic:nvPicPr>
+                  <pic:blipFill>
+                    <a:blip r:embed="rId11"/>
+                    <a:stretch>
+                      <a:fillRect/>
+                    </a:stretch>
+                  </pic:blipFill>
+                  <pic:spPr>
+                    <a:xfrm>
+                      <a:off x="0" y="0"/>
+                      <a:ext cx="5731510" cy="2535555"/>
+                    </a:xfrm>
+                    <a:prstGeom prst="rect">
+                      <a:avLst/>
+                    </a:prstGeom>
+                  </pic:spPr>
+                </pic:pic>
+              </a:graphicData>
+            </a:graphic>
+          </wp:inline>
+        </w:drawing>
+      </w:r>
+    </w:p>
+    <w:p>
+      <w:pPr>
+        <w:pStyle w:val="ListParagraph"/>
+        <w:numPr>
+          <w:ilvl w:val="0"/>
+          <w:numId w:val="9"/>
+        </w:numPr>
+      </w:pPr>
+      <w:r>
+        <w:t xml:space="preserve">We have a built-In Node, so we shall create a new node and continue. </w:t>
+      </w:r>
+    </w:p>
+    <w:p>
+      <w:pPr>
+        <w:ind w:left="720"/>
+      </w:pPr>
+      <w:r>
+        <w:drawing>
+          <wp:inline distT="0" distB="0" distL="0" distR="0" wp14:anchorId="43281AF4" wp14:editId="7071E4DE">
+            <wp:extent cx="5731510" cy="1610360"/>
+            <wp:effectExtent l="0" t="0" r="2540" b="8890"/>
+            <wp:docPr id="999471765" name="Picture 1" descr="A screenshot of a computer&#10;&#10;AI-generated content may be incorrect."/>
+            <wp:cNvGraphicFramePr>
+              <a:graphicFrameLocks xmlns:a="http://schemas.openxmlformats.org/drawingml/2006/main" noChangeAspect="1"/>
+            </wp:cNvGraphicFramePr>
+            <a:graphic xmlns:a="http://schemas.openxmlformats.org/drawingml/2006/main">
+              <a:graphicData uri="http://schemas.openxmlformats.org/drawingml/2006/picture">
+                <pic:pic xmlns:pic="http://schemas.openxmlformats.org/drawingml/2006/picture">
+                  <pic:nvPicPr>
+                    <pic:cNvPr id="999471765" name="Picture 1" descr="A screenshot of a computer&#10;&#10;AI-generated content may be incorrect."/>
+                    <pic:cNvPicPr/>
+                  </pic:nvPicPr>
+                  <pic:blipFill>
+                    <a:blip r:embed="rId12"/>
+                    <a:stretch>
+                      <a:fillRect/>
+                    </a:stretch>
+                  </pic:blipFill>
+                  <pic:spPr>
+                    <a:xfrm>
+                      <a:off x="0" y="0"/>
+                      <a:ext cx="5731510" cy="1610360"/>
+                    </a:xfrm>
+                    <a:prstGeom prst="rect">
+                      <a:avLst/>
+                    </a:prstGeom>
+                  </pic:spPr>
+                </pic:pic>
+              </a:graphicData>
+            </a:graphic>
+          </wp:inline>
+        </w:drawing>
+      </w:r>
+    </w:p>
+    <w:p>
+      <w:pPr>
+        <w:ind w:left="720"/>
+      </w:pPr>
+    </w:p>
+    <w:p>
+      <w:pPr>
+        <w:pStyle w:val="ListParagraph"/>
+        <w:numPr>
+          <w:ilvl w:val="0"/>
+          <w:numId w:val="9"/>
+        </w:numPr>
+      </w:pPr>
+      <w:r>
+        <w:t xml:space="preserve">Created a new node name- </w:t>
+      </w:r>
+      <w:r>
+        <w:t xml:space="preserve">Slave-01, as my “slave machine” name is </w:t>
+      </w:r>
+      <w:r>
+        <w:rPr>
+          <w:b/>
+          <w:bCs/>
+        </w:rPr>
+        <w:t>Slave-01</w:t>
+      </w:r>
+      <w:r>
+        <w:t xml:space="preserve"> </w:t>
+      </w:r>
+    </w:p>
+    <w:p>
+      <w:pPr>
+        <w:ind w:left="720"/>
+      </w:pPr>
+      <w:r>
+        <w:lastRenderedPageBreak/>
+        <w:drawing>
+          <wp:inline distT="0" distB="0" distL="0" distR="0" wp14:anchorId="2F0B7C10" wp14:editId="15308644">
+            <wp:extent cx="5731510" cy="3180080"/>
+            <wp:effectExtent l="0" t="0" r="2540" b="1270"/>
+            <wp:docPr id="102465718" name="Picture 1" descr="A screenshot of a computer&#10;&#10;AI-generated content may be incorrect."/>
+            <wp:cNvGraphicFramePr>
+              <a:graphicFrameLocks xmlns:a="http://schemas.openxmlformats.org/drawingml/2006/main" noChangeAspect="1"/>
+            </wp:cNvGraphicFramePr>
+            <a:graphic xmlns:a="http://schemas.openxmlformats.org/drawingml/2006/main">
+              <a:graphicData uri="http://schemas.openxmlformats.org/drawingml/2006/picture">
+                <pic:pic xmlns:pic="http://schemas.openxmlformats.org/drawingml/2006/picture">
+                  <pic:nvPicPr>
+                    <pic:cNvPr id="102465718" name="Picture 1" descr="A screenshot of a computer&#10;&#10;AI-generated content may be incorrect."/>
+                    <pic:cNvPicPr/>
+                  </pic:nvPicPr>
+                  <pic:blipFill>
+                    <a:blip r:embed="rId13"/>
+                    <a:stretch>
+                      <a:fillRect/>
+                    </a:stretch>
+                  </pic:blipFill>
+                  <pic:spPr>
+                    <a:xfrm>
+                      <a:off x="0" y="0"/>
+                      <a:ext cx="5731510" cy="3180080"/>
+                    </a:xfrm>
+                    <a:prstGeom prst="rect">
+                      <a:avLst/>
+                    </a:prstGeom>
+                  </pic:spPr>
+                </pic:pic>
+              </a:graphicData>
+            </a:graphic>
+          </wp:inline>
+        </w:drawing>
+      </w:r>
+    </w:p>
+    <w:p>
+      <w:pPr>
+        <w:pStyle w:val="ListParagraph"/>
+        <w:numPr>
+          <w:ilvl w:val="0"/>
+          <w:numId w:val="9"/>
+        </w:numPr>
+      </w:pPr>
+      <w:r>
+        <w:t xml:space="preserve">Configure the node and add a directory in ec2 in Slave machine. </w:t>
+      </w:r>
+    </w:p>
+    <w:p>
+      <w:pPr>
+        <w:pStyle w:val="ListParagraph"/>
+        <w:numPr>
+          <w:ilvl w:val="0"/>
+          <w:numId w:val="9"/>
+        </w:numPr>
+      </w:pPr>
+      <w:r>
+        <w:t>Added a directory</w:t>
+      </w:r>
+      <w:r>
+        <w:t xml:space="preserve">- </w:t>
+      </w:r>
+      <w:r>
+        <w:rPr>
+          <w:b/>
+          <w:bCs/>
+        </w:rPr>
+        <w:t>workspace</w:t>
+      </w:r>
+    </w:p>
+    <w:p>
+      <w:pPr>
+        <w:ind w:left="720"/>
+      </w:pPr>
+      <w:r>
+        <w:drawing>
+          <wp:inline distT="0" distB="0" distL="0" distR="0" wp14:anchorId="0D5550A6" wp14:editId="49D25D1C">
+            <wp:extent cx="5731510" cy="2760345"/>
+            <wp:effectExtent l="0" t="0" r="2540" b="1905"/>
+            <wp:docPr id="1859860188" name="Picture 1" descr="A screenshot of a computer&#10;&#10;AI-generated content may be incorrect."/>
+            <wp:cNvGraphicFramePr>
+              <a:graphicFrameLocks xmlns:a="http://schemas.openxmlformats.org/drawingml/2006/main" noChangeAspect="1"/>
+            </wp:cNvGraphicFramePr>
+            <a:graphic xmlns:a="http://schemas.openxmlformats.org/drawingml/2006/main">
+              <a:graphicData uri="http://schemas.openxmlformats.org/drawingml/2006/picture">
+                <pic:pic xmlns:pic="http://schemas.openxmlformats.org/drawingml/2006/picture">
+                  <pic:nvPicPr>
+                    <pic:cNvPr id="1859860188" name="Picture 1" descr="A screenshot of a computer&#10;&#10;AI-generated content may be incorrect."/>
+                    <pic:cNvPicPr/>
+                  </pic:nvPicPr>
+                  <pic:blipFill>
+                    <a:blip r:embed="rId14"/>
+                    <a:stretch>
+                      <a:fillRect/>
+                    </a:stretch>
+                  </pic:blipFill>
+                  <pic:spPr>
+                    <a:xfrm>
+                      <a:off x="0" y="0"/>
+                      <a:ext cx="5731510" cy="2760345"/>
+                    </a:xfrm>
+                    <a:prstGeom prst="rect">
+                      <a:avLst/>
+                    </a:prstGeom>
+                  </pic:spPr>
+                </pic:pic>
+              </a:graphicData>
+            </a:graphic>
+          </wp:inline>
+        </w:drawing>
+      </w:r>
+    </w:p>
+    <w:p>
+      <w:pPr>
+        <w:ind w:left="720"/>
+      </w:pPr>
+    </w:p>
+    <w:p>
+      <w:pPr>
+        <w:ind w:left="720"/>
+      </w:pPr>
+    </w:p>
+    <w:p>
+      <w:pPr>
+        <w:pStyle w:val="ListParagraph"/>
+        <w:numPr>
+          <w:ilvl w:val="0"/>
+          <w:numId w:val="10"/>
+        </w:numPr>
+      </w:pPr>
+      <w:r>
+        <w:t xml:space="preserve">Launch method- Via SSH. </w:t>
+      </w:r>
+    </w:p>
+    <w:p>
+      <w:pPr>
+        <w:pStyle w:val="ListParagraph"/>
+        <w:numPr>
+          <w:ilvl w:val="0"/>
+          <w:numId w:val="10"/>
+        </w:numPr>
+      </w:pPr>
+      <w:r>
+        <w:t xml:space="preserve">Credentials- </w:t>
+      </w:r>
+      <w:r>
+        <w:rPr>
+          <w:b/>
+          <w:bCs/>
+        </w:rPr>
+        <w:t>ec2-user</w:t>
+      </w:r>
+    </w:p>
+    <w:p>
+      <w:pPr>
+        <w:pStyle w:val="ListParagraph"/>
+        <w:numPr>
+          <w:ilvl w:val="0"/>
+          <w:numId w:val="10"/>
+        </w:numPr>
+        <w:rPr>
+          <w:b/>
+          <w:bCs/>
+        </w:rPr>
+      </w:pPr>
+      <w:r>
+        <w:t xml:space="preserve">Private IP- </w:t>
+      </w:r>
+      <w:r>
+        <w:rPr>
+          <w:b/>
+          <w:bCs/>
+        </w:rPr>
+        <w:t xml:space="preserve">Pem.key from downloads. </w:t>
+      </w:r>
+    </w:p>
+    <w:p>
+      <w:pPr>
+        <w:pStyle w:val="ListParagraph"/>
+        <w:numPr>
+          <w:ilvl w:val="0"/>
+          <w:numId w:val="10"/>
+        </w:numPr>
+      </w:pPr>
+      <w:r>
+        <w:t xml:space="preserve">Host- </w:t>
+      </w:r>
+      <w:r>
+        <w:t>Slave Public IP.</w:t>
+      </w:r>
+    </w:p>
+    <w:p>
+      <w:pPr>
+        <w:ind w:left="720"/>
+      </w:pPr>
+      <w:r>
+        <w:lastRenderedPageBreak/>
+        <w:drawing>
+          <wp:inline distT="0" distB="0" distL="0" distR="0" wp14:anchorId="12FA2F06" wp14:editId="7D1891DA">
+            <wp:extent cx="5731510" cy="2767965"/>
+            <wp:effectExtent l="0" t="0" r="2540" b="0"/>
+            <wp:docPr id="774074349" name="Picture 1" descr="A screenshot of a computer&#10;&#10;AI-generated content may be incorrect."/>
+            <wp:cNvGraphicFramePr>
+              <a:graphicFrameLocks xmlns:a="http://schemas.openxmlformats.org/drawingml/2006/main" noChangeAspect="1"/>
+            </wp:cNvGraphicFramePr>
+            <a:graphic xmlns:a="http://schemas.openxmlformats.org/drawingml/2006/main">
+              <a:graphicData uri="http://schemas.openxmlformats.org/drawingml/2006/picture">
+                <pic:pic xmlns:pic="http://schemas.openxmlformats.org/drawingml/2006/picture">
+                  <pic:nvPicPr>
+                    <pic:cNvPr id="774074349" name="Picture 1" descr="A screenshot of a computer&#10;&#10;AI-generated content may be incorrect."/>
+                    <pic:cNvPicPr/>
+                  </pic:nvPicPr>
+                  <pic:blipFill>
+                    <a:blip r:embed="rId15"/>
+                    <a:stretch>
+                      <a:fillRect/>
+                    </a:stretch>
+                  </pic:blipFill>
+                  <pic:spPr>
+                    <a:xfrm>
+                      <a:off x="0" y="0"/>
+                      <a:ext cx="5731510" cy="2767965"/>
+                    </a:xfrm>
+                    <a:prstGeom prst="rect">
+                      <a:avLst/>
+                    </a:prstGeom>
+                  </pic:spPr>
+                </pic:pic>
+              </a:graphicData>
+            </a:graphic>
+          </wp:inline>
+        </w:drawing>
+      </w:r>
+    </w:p>
+    <w:p>
+      <w:pPr>
+        <w:ind w:left="720"/>
+      </w:pPr>
+    </w:p>
+    <w:p>
+      <w:pPr>
+        <w:ind w:left="720"/>
+      </w:pPr>
+      <w:r>
+        <w:drawing>
+          <wp:inline distT="0" distB="0" distL="0" distR="0" wp14:anchorId="6DCBF1E2" wp14:editId="2DC5048E">
+            <wp:extent cx="5731510" cy="3034030"/>
+            <wp:effectExtent l="0" t="0" r="2540" b="0"/>
+            <wp:docPr id="933647745" name="Picture 1" descr="A screenshot of a chat&#10;&#10;AI-generated content may be incorrect."/>
+            <wp:cNvGraphicFramePr>
+              <a:graphicFrameLocks xmlns:a="http://schemas.openxmlformats.org/drawingml/2006/main" noChangeAspect="1"/>
+            </wp:cNvGraphicFramePr>
+            <a:graphic xmlns:a="http://schemas.openxmlformats.org/drawingml/2006/main">
+              <a:graphicData uri="http://schemas.openxmlformats.org/drawingml/2006/picture">
+                <pic:pic xmlns:pic="http://schemas.openxmlformats.org/drawingml/2006/picture">
+                  <pic:nvPicPr>
+                    <pic:cNvPr id="933647745" name="Picture 1" descr="A screenshot of a chat&#10;&#10;AI-generated content may be incorrect."/>
+                    <pic:cNvPicPr/>
+                  </pic:nvPicPr>
+                  <pic:blipFill>
+                    <a:blip r:embed="rId16"/>
+                    <a:stretch>
+                      <a:fillRect/>
+                    </a:stretch>
+                  </pic:blipFill>
+                  <pic:spPr>
+                    <a:xfrm>
+                      <a:off x="0" y="0"/>
+                      <a:ext cx="5731510" cy="3034030"/>
+                    </a:xfrm>
+                    <a:prstGeom prst="rect">
+                      <a:avLst/>
+                    </a:prstGeom>
+                  </pic:spPr>
+                </pic:pic>
+              </a:graphicData>
+            </a:graphic>
+          </wp:inline>
+        </w:drawing>
+      </w:r>
+    </w:p>
+    <w:p>
+      <w:pPr>
+        <w:ind w:left="720"/>
+        <w:rPr>
+          <w:b/>
+          <w:bCs/>
+        </w:rPr>
+      </w:pPr>
+    </w:p>
+    <w:p>
+      <w:pPr>
+        <w:ind w:left="720"/>
+      </w:pPr>
+      <w:r>
+        <w:rPr>
+          <w:b/>
+          <w:bCs/>
+        </w:rPr>
+        <w:t>Conclusion</w:t>
+      </w:r>
+      <w:r>
+        <w:t xml:space="preserve">- By creating Slave machines, there are high availability and the offloading helps to </w:t>
+      </w:r>
+      <w:r>
+        <w:t xml:space="preserve">maintain performance as well. </w:t>
+      </w:r>
+    </w:p>
+    <w:p>
+      <w:pPr>
+        <w:ind w:left="720"/>
+      </w:pPr>
+    </w:p>
+    <w:p>
+      <w:pPr>
+        <w:ind w:left="720"/>
+      </w:pPr>
+      <w:r>
+        <w:pict w14:anchorId="42D2D0EA">
+          <v:shape id="Picture 1" o:spid="_x0000_i1032" type="#_x0000_t75" style="width:1pt;height:1pt;visibility:visible;mso-wrap-style:square">
+            <v:imagedata r:id="rId17" o:title=""/>
+          </v:shape>
+        </w:pict>
+      </w:r>
+    </w:p>
+    <w:p>
+      <w:pPr>
+        <w:ind w:left="720"/>
+      </w:pPr>
+    </w:p>
+    <w:p>
+      <w:pPr>
+        <w:ind w:left="720"/>
+      </w:pPr>
+    </w:p>
+    <w:p>
+      <w:pPr>
+        <w:ind w:left="720"/>
       </w:pPr>
     </w:p>
     <w:p>
@@ -406,6 +1434,7 @@
           <w:b/>
           <w:bCs/>
         </w:rPr>
+        <w:lastRenderedPageBreak/>
         <w:t>Configure webhooks to Jenkins job.</w:t>
       </w:r>
     </w:p>
@@ -623,7 +1652,6 @@
           <w:bCs/>
           <w:noProof/>
         </w:rPr>
-        <w:lastRenderedPageBreak/>
         <w:drawing>
           <wp:inline distT="0" distB="0" distL="0" distR="0" wp14:anchorId="0F0192C1" wp14:editId="7F85029A">
             <wp:extent cx="5731510" cy="3316605"/>
@@ -640,7 +1668,7 @@
                     <pic:cNvPicPr/>
                   </pic:nvPicPr>
                   <pic:blipFill>
-                    <a:blip r:embed="rId5"/>
+                    <a:blip r:embed="rId18"/>
                     <a:stretch>
                       <a:fillRect/>
                     </a:stretch>
@@ -700,6 +1728,7 @@
           <w:bCs/>
           <w:noProof/>
         </w:rPr>
+        <w:lastRenderedPageBreak/>
         <w:drawing>
           <wp:inline distT="0" distB="0" distL="0" distR="0" wp14:anchorId="5785149A" wp14:editId="525D2D33">
             <wp:extent cx="5731510" cy="2626995"/>
@@ -716,7 +1745,7 @@
                     <pic:cNvPicPr/>
                   </pic:nvPicPr>
                   <pic:blipFill>
-                    <a:blip r:embed="rId6"/>
+                    <a:blip r:embed="rId19"/>
                     <a:stretch>
                       <a:fillRect/>
                     </a:stretch>
@@ -739,34 +1768,6 @@
     </w:p>
     <w:p>
       <w:pPr>
-        <w:ind w:left="720"/>
-        <w:rPr>
-          <w:b/>
-          <w:bCs/>
-        </w:rPr>
-      </w:pPr>
-    </w:p>
-    <w:p>
-      <w:pPr>
-        <w:ind w:left="720"/>
-        <w:rPr>
-          <w:b/>
-          <w:bCs/>
-        </w:rPr>
-      </w:pPr>
-    </w:p>
-    <w:p>
-      <w:pPr>
-        <w:ind w:left="720"/>
-        <w:rPr>
-          <w:b/>
-          <w:bCs/>
-        </w:rPr>
-      </w:pPr>
-    </w:p>
-    <w:p>
-      <w:pPr>
-        <w:ind w:left="720"/>
         <w:rPr>
           <w:b/>
           <w:bCs/>
@@ -816,7 +1817,6 @@
           <w:bCs/>
           <w:noProof/>
         </w:rPr>
-        <w:lastRenderedPageBreak/>
         <w:drawing>
           <wp:inline distT="0" distB="0" distL="0" distR="0" wp14:anchorId="4ED018EC" wp14:editId="6408538A">
             <wp:extent cx="5731510" cy="2486660"/>
@@ -833,7 +1833,7 @@
                     <pic:cNvPicPr/>
                   </pic:nvPicPr>
                   <pic:blipFill>
-                    <a:blip r:embed="rId7"/>
+                    <a:blip r:embed="rId20"/>
                     <a:stretch>
                       <a:fillRect/>
                     </a:stretch>
@@ -882,6 +1882,7 @@
           <w:noProof/>
           <w:u w:val="single"/>
         </w:rPr>
+        <w:lastRenderedPageBreak/>
         <w:drawing>
           <wp:inline distT="0" distB="0" distL="0" distR="0" wp14:anchorId="37E92135" wp14:editId="4C4D6DAC">
             <wp:extent cx="5731510" cy="2724785"/>
@@ -898,7 +1899,7 @@
                     <pic:cNvPicPr/>
                   </pic:nvPicPr>
                   <pic:blipFill>
-                    <a:blip r:embed="rId8"/>
+                    <a:blip r:embed="rId21"/>
                     <a:stretch>
                       <a:fillRect/>
                     </a:stretch>
@@ -932,6 +1933,7 @@
         <w:rPr>
           <w:b/>
           <w:bCs/>
+          <w:noProof/>
           <w:u w:val="single"/>
         </w:rPr>
         <w:drawing>
@@ -950,7 +1952,7 @@
                     <pic:cNvPicPr/>
                   </pic:nvPicPr>
                   <pic:blipFill>
-                    <a:blip r:embed="rId9"/>
+                    <a:blip r:embed="rId22"/>
                     <a:stretch>
                       <a:fillRect/>
                     </a:stretch>
@@ -1034,7 +2036,9 @@
         <w:rPr>
           <w:b/>
           <w:bCs/>
-        </w:rPr>
+          <w:noProof/>
+        </w:rPr>
+        <w:lastRenderedPageBreak/>
         <w:drawing>
           <wp:inline distT="0" distB="0" distL="0" distR="0" wp14:anchorId="525CC5C2" wp14:editId="1A8B5DFA">
             <wp:extent cx="5731510" cy="2852420"/>
@@ -1051,7 +2055,7 @@
                     <pic:cNvPicPr/>
                   </pic:nvPicPr>
                   <pic:blipFill>
-                    <a:blip r:embed="rId10"/>
+                    <a:blip r:embed="rId23"/>
                     <a:stretch>
                       <a:fillRect/>
                     </a:stretch>
@@ -1103,6 +2107,9 @@
         <w:ind w:left="720"/>
       </w:pPr>
       <w:r>
+        <w:rPr>
+          <w:noProof/>
+        </w:rPr>
         <w:drawing>
           <wp:inline distT="0" distB="0" distL="0" distR="0" wp14:anchorId="776CD000" wp14:editId="1736EB34">
             <wp:extent cx="5731510" cy="1256030"/>
@@ -1119,7 +2126,7 @@
                     <pic:cNvPicPr/>
                   </pic:nvPicPr>
                   <pic:blipFill>
-                    <a:blip r:embed="rId11"/>
+                    <a:blip r:embed="rId24"/>
                     <a:stretch>
                       <a:fillRect/>
                     </a:stretch>
@@ -1196,7 +2203,9 @@
         <w:ind w:left="720"/>
       </w:pPr>
       <w:r>
-        <w:lastRenderedPageBreak/>
+        <w:rPr>
+          <w:noProof/>
+        </w:rPr>
         <w:drawing>
           <wp:inline distT="0" distB="0" distL="0" distR="0" wp14:anchorId="4149D148" wp14:editId="7691D8B6">
             <wp:extent cx="5731510" cy="2190750"/>
@@ -1213,7 +2222,7 @@
                     <pic:cNvPicPr/>
                   </pic:nvPicPr>
                   <pic:blipFill>
-                    <a:blip r:embed="rId12"/>
+                    <a:blip r:embed="rId25"/>
                     <a:stretch>
                       <a:fillRect/>
                     </a:stretch>
@@ -1272,6 +2281,10 @@
         <w:ind w:left="720"/>
       </w:pPr>
       <w:r>
+        <w:rPr>
+          <w:noProof/>
+        </w:rPr>
+        <w:lastRenderedPageBreak/>
         <w:drawing>
           <wp:inline distT="0" distB="0" distL="0" distR="0" wp14:anchorId="4287F6BC" wp14:editId="7685A523">
             <wp:extent cx="5731510" cy="2121535"/>
@@ -1288,7 +2301,7 @@
                     <pic:cNvPicPr/>
                   </pic:nvPicPr>
                   <pic:blipFill>
-                    <a:blip r:embed="rId13"/>
+                    <a:blip r:embed="rId26"/>
                     <a:stretch>
                       <a:fillRect/>
                     </a:stretch>
@@ -1343,6 +2356,9 @@
         <w:ind w:left="720"/>
       </w:pPr>
       <w:r>
+        <w:rPr>
+          <w:noProof/>
+        </w:rPr>
         <w:drawing>
           <wp:inline distT="0" distB="0" distL="0" distR="0" wp14:anchorId="6208AA9D" wp14:editId="2C5F3AFE">
             <wp:extent cx="5731510" cy="2478405"/>
@@ -1359,7 +2375,7 @@
                     <pic:cNvPicPr/>
                   </pic:nvPicPr>
                   <pic:blipFill>
-                    <a:blip r:embed="rId14"/>
+                    <a:blip r:embed="rId27"/>
                     <a:stretch>
                       <a:fillRect/>
                     </a:stretch>
@@ -1400,7 +2416,6 @@
         </w:tabs>
       </w:pPr>
       <w:r>
-        <w:lastRenderedPageBreak/>
         <w:t xml:space="preserve">Webhooks connected successfully. </w:t>
       </w:r>
     </w:p>
@@ -1412,6 +2427,9 @@
         <w:ind w:left="1080"/>
       </w:pPr>
       <w:r>
+        <w:rPr>
+          <w:noProof/>
+        </w:rPr>
         <w:drawing>
           <wp:inline distT="0" distB="0" distL="0" distR="0" wp14:anchorId="7DF97A15" wp14:editId="307CA764">
             <wp:extent cx="2548241" cy="2387600"/>
@@ -1428,7 +2446,7 @@
                     <pic:cNvPicPr/>
                   </pic:nvPicPr>
                   <pic:blipFill>
-                    <a:blip r:embed="rId15"/>
+                    <a:blip r:embed="rId28"/>
                     <a:stretch>
                       <a:fillRect/>
                     </a:stretch>
@@ -1459,6 +2477,70 @@
     </w:p>
     <w:p>
       <w:pPr>
+        <w:pStyle w:val="ListParagraph"/>
+        <w:numPr>
+          <w:ilvl w:val="0"/>
+          <w:numId w:val="7"/>
+        </w:numPr>
+        <w:tabs>
+          <w:tab w:val="left" w:pos="720"/>
+        </w:tabs>
+      </w:pPr>
+      <w:r>
+        <w:lastRenderedPageBreak/>
+        <w:t>Validation: Successful</w:t>
+      </w:r>
+    </w:p>
+    <w:p>
+      <w:pPr>
+        <w:tabs>
+          <w:tab w:val="left" w:pos="720"/>
+        </w:tabs>
+        <w:ind w:left="1080"/>
+      </w:pPr>
+      <w:r>
+        <w:rPr>
+          <w:noProof/>
+        </w:rPr>
+        <w:drawing>
+          <wp:inline distT="0" distB="0" distL="0" distR="0" wp14:anchorId="125C4A9C" wp14:editId="52184034">
+            <wp:extent cx="5731510" cy="1713865"/>
+            <wp:effectExtent l="0" t="0" r="2540" b="635"/>
+            <wp:docPr id="471098016" name="Picture 1" descr="A screenshot of a computer&#10;&#10;AI-generated content may be incorrect."/>
+            <wp:cNvGraphicFramePr>
+              <a:graphicFrameLocks xmlns:a="http://schemas.openxmlformats.org/drawingml/2006/main" noChangeAspect="1"/>
+            </wp:cNvGraphicFramePr>
+            <a:graphic xmlns:a="http://schemas.openxmlformats.org/drawingml/2006/main">
+              <a:graphicData uri="http://schemas.openxmlformats.org/drawingml/2006/picture">
+                <pic:pic xmlns:pic="http://schemas.openxmlformats.org/drawingml/2006/picture">
+                  <pic:nvPicPr>
+                    <pic:cNvPr id="471098016" name="Picture 1" descr="A screenshot of a computer&#10;&#10;AI-generated content may be incorrect."/>
+                    <pic:cNvPicPr/>
+                  </pic:nvPicPr>
+                  <pic:blipFill>
+                    <a:blip r:embed="rId29"/>
+                    <a:stretch>
+                      <a:fillRect/>
+                    </a:stretch>
+                  </pic:blipFill>
+                  <pic:spPr>
+                    <a:xfrm>
+                      <a:off x="0" y="0"/>
+                      <a:ext cx="5731510" cy="1713865"/>
+                    </a:xfrm>
+                    <a:prstGeom prst="rect">
+                      <a:avLst/>
+                    </a:prstGeom>
+                  </pic:spPr>
+                </pic:pic>
+              </a:graphicData>
+            </a:graphic>
+          </wp:inline>
+        </w:drawing>
+      </w:r>
+    </w:p>
+    <w:p>
+      <w:pPr>
         <w:tabs>
           <w:tab w:val="left" w:pos="720"/>
         </w:tabs>
@@ -1765,6 +2847,7 @@
           <w:bCs/>
           <w:u w:val="single"/>
         </w:rPr>
+        <w:lastRenderedPageBreak/>
         <w:t>Objective:</w:t>
       </w:r>
     </w:p>
@@ -2015,6 +3098,32 @@
 
 <file path=word/numbering.xml><?xml version="1.0" encoding="utf-8"?>
 <w:numbering xmlns:wpc="http://schemas.microsoft.com/office/word/2010/wordprocessingCanvas" xmlns:cx="http://schemas.microsoft.com/office/drawing/2014/chartex" xmlns:cx1="http://schemas.microsoft.com/office/drawing/2015/9/8/chartex" xmlns:cx2="http://schemas.microsoft.com/office/drawing/2015/10/21/chartex" xmlns:cx3="http://schemas.microsoft.com/office/drawing/2016/5/9/chartex" xmlns:cx4="http://schemas.microsoft.com/office/drawing/2016/5/10/chartex" xmlns:cx5="http://schemas.microsoft.com/office/drawing/2016/5/11/chartex" xmlns:cx6="http://schemas.microsoft.com/office/drawing/2016/5/12/chartex" xmlns:cx7="http://schemas.microsoft.com/office/drawing/2016/5/13/chartex" xmlns:cx8="http://schemas.microsoft.com/office/drawing/2016/5/14/chartex" xmlns:mc="http://schemas.openxmlformats.org/markup-compatibility/2006" xmlns:aink="http://schemas.microsoft.com/office/drawing/2016/ink" xmlns:am3d="http://schemas.microsoft.com/office/drawing/2017/model3d" xmlns:o="urn:schemas-microsoft-com:office:office" xmlns:oel="http://schemas.microsoft.com/office/2019/extlst" xmlns:r="http://schemas.openxmlformats.org/officeDocument/2006/relationships" xmlns:m="http://schemas.openxmlformats.org/officeDocument/2006/math" xmlns:v="urn:schemas-microsoft-com:vml" xmlns:wp14="http://schemas.microsoft.com/office/word/2010/wordprocessingDrawing" xmlns:wp="http://schemas.openxmlformats.org/drawingml/2006/wordprocessingDrawing" xmlns:w10="urn:schemas-microsoft-com:office:word" xmlns:w="http://schemas.openxmlformats.org/wordprocessingml/2006/main" xmlns:w14="http://schemas.microsoft.com/office/word/2010/wordml" xmlns:w15="http://schemas.microsoft.com/office/word/2012/wordml" xmlns:w16cex="http://schemas.microsoft.com/office/word/2018/wordml/cex" xmlns:w16cid="http://schemas.microsoft.com/office/word/2016/wordml/cid" xmlns:w16="http://schemas.microsoft.com/office/word/2018/wordml" xmlns:w16du="http://schemas.microsoft.com/office/word/2023/wordml/word16du" xmlns:w16sdtdh="http://schemas.microsoft.com/office/word/2020/wordml/sdtdatahash" xmlns:w16sdtfl="http://schemas.microsoft.com/office/word/2024/wordml/sdtformatlock" xmlns:w16se="http://schemas.microsoft.com/office/word/2015/wordml/symex" xmlns:wpg="http://schemas.microsoft.com/office/word/2010/wordprocessingGroup" xmlns:wpi="http://schemas.microsoft.com/office/word/2010/wordprocessingInk" xmlns:wne="http://schemas.microsoft.com/office/word/2006/wordml" xmlns:wps="http://schemas.microsoft.com/office/word/2010/wordprocessingShape" mc:Ignorable="w14 w15 w16se w16cid w16 w16cex w16sdtdh w16sdtfl w16du wp14">
+  <w:numPicBullet w:numPicBulletId="0">
+    <w:pict>
+      <v:shapetype id="_x0000_t75" coordsize="21600,21600" o:spt="75" o:preferrelative="t" path="m@4@5l@4@11@9@11@9@5xe" filled="f" stroked="f">
+        <v:stroke joinstyle="miter"/>
+        <v:formulas>
+          <v:f eqn="if lineDrawn pixelLineWidth 0"/>
+          <v:f eqn="sum @0 1 0"/>
+          <v:f eqn="sum 0 0 @1"/>
+          <v:f eqn="prod @2 1 2"/>
+          <v:f eqn="prod @3 21600 pixelWidth"/>
+          <v:f eqn="prod @3 21600 pixelHeight"/>
+          <v:f eqn="sum @0 0 1"/>
+          <v:f eqn="prod @6 1 2"/>
+          <v:f eqn="prod @7 21600 pixelWidth"/>
+          <v:f eqn="sum @8 21600 0"/>
+          <v:f eqn="prod @7 21600 pixelHeight"/>
+          <v:f eqn="sum @10 21600 0"/>
+        </v:formulas>
+        <v:path o:extrusionok="f" gradientshapeok="t" o:connecttype="rect"/>
+        <o:lock v:ext="edit" aspectratio="t"/>
+      </v:shapetype>
+      <v:shape id="Picture 1" o:spid="_x0000_i1025" type="#_x0000_t75" style="width:1pt;height:1pt;visibility:visible;mso-wrap-style:square" o:bullet="t">
+        <v:imagedata r:id="rId1" o:title=""/>
+      </v:shape>
+    </w:pict>
+  </w:numPicBullet>
   <w:abstractNum w:abstractNumId="0" w15:restartNumberingAfterBreak="0">
     <w:nsid w:val="00C66BBD"/>
     <w:multiLevelType w:val="multilevel"/>
@@ -2129,6 +3238,119 @@
     </w:lvl>
   </w:abstractNum>
   <w:abstractNum w:abstractNumId="1" w15:restartNumberingAfterBreak="0">
+    <w:nsid w:val="0D1E67CA"/>
+    <w:multiLevelType w:val="hybridMultilevel"/>
+    <w:tmpl w:val="F5207A34"/>
+    <w:lvl w:ilvl="0" w:tplc="40090001">
+      <w:start w:val="1"/>
+      <w:numFmt w:val="bullet"/>
+      <w:lvlText w:val=""/>
+      <w:lvlJc w:val="left"/>
+      <w:pPr>
+        <w:ind w:left="1440" w:hanging="360"/>
+      </w:pPr>
+      <w:rPr>
+        <w:rFonts w:ascii="Symbol" w:hAnsi="Symbol" w:hint="default"/>
+      </w:rPr>
+    </w:lvl>
+    <w:lvl w:ilvl="1" w:tplc="40090003" w:tentative="1">
+      <w:start w:val="1"/>
+      <w:numFmt w:val="bullet"/>
+      <w:lvlText w:val="o"/>
+      <w:lvlJc w:val="left"/>
+      <w:pPr>
+        <w:ind w:left="2160" w:hanging="360"/>
+      </w:pPr>
+      <w:rPr>
+        <w:rFonts w:ascii="Courier New" w:hAnsi="Courier New" w:cs="Courier New" w:hint="default"/>
+      </w:rPr>
+    </w:lvl>
+    <w:lvl w:ilvl="2" w:tplc="40090005" w:tentative="1">
+      <w:start w:val="1"/>
+      <w:numFmt w:val="bullet"/>
+      <w:lvlText w:val=""/>
+      <w:lvlJc w:val="left"/>
+      <w:pPr>
+        <w:ind w:left="2880" w:hanging="360"/>
+      </w:pPr>
+      <w:rPr>
+        <w:rFonts w:ascii="Wingdings" w:hAnsi="Wingdings" w:hint="default"/>
+      </w:rPr>
+    </w:lvl>
+    <w:lvl w:ilvl="3" w:tplc="40090001" w:tentative="1">
+      <w:start w:val="1"/>
+      <w:numFmt w:val="bullet"/>
+      <w:lvlText w:val=""/>
+      <w:lvlJc w:val="left"/>
+      <w:pPr>
+        <w:ind w:left="3600" w:hanging="360"/>
+      </w:pPr>
+      <w:rPr>
+        <w:rFonts w:ascii="Symbol" w:hAnsi="Symbol" w:hint="default"/>
+      </w:rPr>
+    </w:lvl>
+    <w:lvl w:ilvl="4" w:tplc="40090003" w:tentative="1">
+      <w:start w:val="1"/>
+      <w:numFmt w:val="bullet"/>
+      <w:lvlText w:val="o"/>
+      <w:lvlJc w:val="left"/>
+      <w:pPr>
+        <w:ind w:left="4320" w:hanging="360"/>
+      </w:pPr>
+      <w:rPr>
+        <w:rFonts w:ascii="Courier New" w:hAnsi="Courier New" w:cs="Courier New" w:hint="default"/>
+      </w:rPr>
+    </w:lvl>
+    <w:lvl w:ilvl="5" w:tplc="40090005" w:tentative="1">
+      <w:start w:val="1"/>
+      <w:numFmt w:val="bullet"/>
+      <w:lvlText w:val=""/>
+      <w:lvlJc w:val="left"/>
+      <w:pPr>
+        <w:ind w:left="5040" w:hanging="360"/>
+      </w:pPr>
+      <w:rPr>
+        <w:rFonts w:ascii="Wingdings" w:hAnsi="Wingdings" w:hint="default"/>
+      </w:rPr>
+    </w:lvl>
+    <w:lvl w:ilvl="6" w:tplc="40090001" w:tentative="1">
+      <w:start w:val="1"/>
+      <w:numFmt w:val="bullet"/>
+      <w:lvlText w:val=""/>
+      <w:lvlJc w:val="left"/>
+      <w:pPr>
+        <w:ind w:left="5760" w:hanging="360"/>
+      </w:pPr>
+      <w:rPr>
+        <w:rFonts w:ascii="Symbol" w:hAnsi="Symbol" w:hint="default"/>
+      </w:rPr>
+    </w:lvl>
+    <w:lvl w:ilvl="7" w:tplc="40090003" w:tentative="1">
+      <w:start w:val="1"/>
+      <w:numFmt w:val="bullet"/>
+      <w:lvlText w:val="o"/>
+      <w:lvlJc w:val="left"/>
+      <w:pPr>
+        <w:ind w:left="6480" w:hanging="360"/>
+      </w:pPr>
+      <w:rPr>
+        <w:rFonts w:ascii="Courier New" w:hAnsi="Courier New" w:cs="Courier New" w:hint="default"/>
+      </w:rPr>
+    </w:lvl>
+    <w:lvl w:ilvl="8" w:tplc="40090005" w:tentative="1">
+      <w:start w:val="1"/>
+      <w:numFmt w:val="bullet"/>
+      <w:lvlText w:val=""/>
+      <w:lvlJc w:val="left"/>
+      <w:pPr>
+        <w:ind w:left="7200" w:hanging="360"/>
+      </w:pPr>
+      <w:rPr>
+        <w:rFonts w:ascii="Wingdings" w:hAnsi="Wingdings" w:hint="default"/>
+      </w:rPr>
+    </w:lvl>
+  </w:abstractNum>
+  <w:abstractNum w:abstractNumId="2" w15:restartNumberingAfterBreak="0">
     <w:nsid w:val="14E53B0D"/>
     <w:multiLevelType w:val="hybridMultilevel"/>
     <w:tmpl w:val="4CC6E0B8"/>
@@ -2241,7 +3463,120 @@
       </w:rPr>
     </w:lvl>
   </w:abstractNum>
-  <w:abstractNum w:abstractNumId="2" w15:restartNumberingAfterBreak="0">
+  <w:abstractNum w:abstractNumId="3" w15:restartNumberingAfterBreak="0">
+    <w:nsid w:val="1991121F"/>
+    <w:multiLevelType w:val="hybridMultilevel"/>
+    <w:tmpl w:val="DAA464FE"/>
+    <w:lvl w:ilvl="0" w:tplc="40090001">
+      <w:start w:val="1"/>
+      <w:numFmt w:val="bullet"/>
+      <w:lvlText w:val=""/>
+      <w:lvlJc w:val="left"/>
+      <w:pPr>
+        <w:ind w:left="1440" w:hanging="360"/>
+      </w:pPr>
+      <w:rPr>
+        <w:rFonts w:ascii="Symbol" w:hAnsi="Symbol" w:hint="default"/>
+      </w:rPr>
+    </w:lvl>
+    <w:lvl w:ilvl="1" w:tplc="40090003" w:tentative="1">
+      <w:start w:val="1"/>
+      <w:numFmt w:val="bullet"/>
+      <w:lvlText w:val="o"/>
+      <w:lvlJc w:val="left"/>
+      <w:pPr>
+        <w:ind w:left="2160" w:hanging="360"/>
+      </w:pPr>
+      <w:rPr>
+        <w:rFonts w:ascii="Courier New" w:hAnsi="Courier New" w:cs="Courier New" w:hint="default"/>
+      </w:rPr>
+    </w:lvl>
+    <w:lvl w:ilvl="2" w:tplc="40090005" w:tentative="1">
+      <w:start w:val="1"/>
+      <w:numFmt w:val="bullet"/>
+      <w:lvlText w:val=""/>
+      <w:lvlJc w:val="left"/>
+      <w:pPr>
+        <w:ind w:left="2880" w:hanging="360"/>
+      </w:pPr>
+      <w:rPr>
+        <w:rFonts w:ascii="Wingdings" w:hAnsi="Wingdings" w:hint="default"/>
+      </w:rPr>
+    </w:lvl>
+    <w:lvl w:ilvl="3" w:tplc="40090001" w:tentative="1">
+      <w:start w:val="1"/>
+      <w:numFmt w:val="bullet"/>
+      <w:lvlText w:val=""/>
+      <w:lvlJc w:val="left"/>
+      <w:pPr>
+        <w:ind w:left="3600" w:hanging="360"/>
+      </w:pPr>
+      <w:rPr>
+        <w:rFonts w:ascii="Symbol" w:hAnsi="Symbol" w:hint="default"/>
+      </w:rPr>
+    </w:lvl>
+    <w:lvl w:ilvl="4" w:tplc="40090003" w:tentative="1">
+      <w:start w:val="1"/>
+      <w:numFmt w:val="bullet"/>
+      <w:lvlText w:val="o"/>
+      <w:lvlJc w:val="left"/>
+      <w:pPr>
+        <w:ind w:left="4320" w:hanging="360"/>
+      </w:pPr>
+      <w:rPr>
+        <w:rFonts w:ascii="Courier New" w:hAnsi="Courier New" w:cs="Courier New" w:hint="default"/>
+      </w:rPr>
+    </w:lvl>
+    <w:lvl w:ilvl="5" w:tplc="40090005" w:tentative="1">
+      <w:start w:val="1"/>
+      <w:numFmt w:val="bullet"/>
+      <w:lvlText w:val=""/>
+      <w:lvlJc w:val="left"/>
+      <w:pPr>
+        <w:ind w:left="5040" w:hanging="360"/>
+      </w:pPr>
+      <w:rPr>
+        <w:rFonts w:ascii="Wingdings" w:hAnsi="Wingdings" w:hint="default"/>
+      </w:rPr>
+    </w:lvl>
+    <w:lvl w:ilvl="6" w:tplc="40090001" w:tentative="1">
+      <w:start w:val="1"/>
+      <w:numFmt w:val="bullet"/>
+      <w:lvlText w:val=""/>
+      <w:lvlJc w:val="left"/>
+      <w:pPr>
+        <w:ind w:left="5760" w:hanging="360"/>
+      </w:pPr>
+      <w:rPr>
+        <w:rFonts w:ascii="Symbol" w:hAnsi="Symbol" w:hint="default"/>
+      </w:rPr>
+    </w:lvl>
+    <w:lvl w:ilvl="7" w:tplc="40090003" w:tentative="1">
+      <w:start w:val="1"/>
+      <w:numFmt w:val="bullet"/>
+      <w:lvlText w:val="o"/>
+      <w:lvlJc w:val="left"/>
+      <w:pPr>
+        <w:ind w:left="6480" w:hanging="360"/>
+      </w:pPr>
+      <w:rPr>
+        <w:rFonts w:ascii="Courier New" w:hAnsi="Courier New" w:cs="Courier New" w:hint="default"/>
+      </w:rPr>
+    </w:lvl>
+    <w:lvl w:ilvl="8" w:tplc="40090005" w:tentative="1">
+      <w:start w:val="1"/>
+      <w:numFmt w:val="bullet"/>
+      <w:lvlText w:val=""/>
+      <w:lvlJc w:val="left"/>
+      <w:pPr>
+        <w:ind w:left="7200" w:hanging="360"/>
+      </w:pPr>
+      <w:rPr>
+        <w:rFonts w:ascii="Wingdings" w:hAnsi="Wingdings" w:hint="default"/>
+      </w:rPr>
+    </w:lvl>
+  </w:abstractNum>
+  <w:abstractNum w:abstractNumId="4" w15:restartNumberingAfterBreak="0">
     <w:nsid w:val="1B473C3E"/>
     <w:multiLevelType w:val="hybridMultilevel"/>
     <w:tmpl w:val="899A6EF8"/>
@@ -2354,7 +3689,7 @@
       </w:rPr>
     </w:lvl>
   </w:abstractNum>
-  <w:abstractNum w:abstractNumId="3" w15:restartNumberingAfterBreak="0">
+  <w:abstractNum w:abstractNumId="5" w15:restartNumberingAfterBreak="0">
     <w:nsid w:val="43415B91"/>
     <w:multiLevelType w:val="hybridMultilevel"/>
     <w:tmpl w:val="3EBACCA4"/>
@@ -2467,10 +3802,10 @@
       </w:rPr>
     </w:lvl>
   </w:abstractNum>
-  <w:abstractNum w:abstractNumId="4" w15:restartNumberingAfterBreak="0">
+  <w:abstractNum w:abstractNumId="6" w15:restartNumberingAfterBreak="0">
     <w:nsid w:val="63E50FEE"/>
     <w:multiLevelType w:val="hybridMultilevel"/>
-    <w:tmpl w:val="81B8DDA0"/>
+    <w:tmpl w:val="36E443B2"/>
     <w:lvl w:ilvl="0" w:tplc="40090001">
       <w:start w:val="1"/>
       <w:numFmt w:val="bullet"/>
@@ -2580,7 +3915,7 @@
       </w:rPr>
     </w:lvl>
   </w:abstractNum>
-  <w:abstractNum w:abstractNumId="5" w15:restartNumberingAfterBreak="0">
+  <w:abstractNum w:abstractNumId="7" w15:restartNumberingAfterBreak="0">
     <w:nsid w:val="6F52624E"/>
     <w:multiLevelType w:val="hybridMultilevel"/>
     <w:tmpl w:val="E97859D0"/>
@@ -2693,7 +4028,7 @@
       </w:rPr>
     </w:lvl>
   </w:abstractNum>
-  <w:abstractNum w:abstractNumId="6" w15:restartNumberingAfterBreak="0">
+  <w:abstractNum w:abstractNumId="8" w15:restartNumberingAfterBreak="0">
     <w:nsid w:val="6F637BA1"/>
     <w:multiLevelType w:val="hybridMultilevel"/>
     <w:tmpl w:val="25C43BFE"/>
@@ -2806,26 +4141,148 @@
       </w:rPr>
     </w:lvl>
   </w:abstractNum>
+  <w:abstractNum w:abstractNumId="9" w15:restartNumberingAfterBreak="0">
+    <w:nsid w:val="747D3423"/>
+    <w:multiLevelType w:val="hybridMultilevel"/>
+    <w:tmpl w:val="8BF80C9C"/>
+    <w:lvl w:ilvl="0" w:tplc="40090001">
+      <w:start w:val="1"/>
+      <w:numFmt w:val="bullet"/>
+      <w:lvlText w:val=""/>
+      <w:lvlJc w:val="left"/>
+      <w:pPr>
+        <w:ind w:left="1440" w:hanging="360"/>
+      </w:pPr>
+      <w:rPr>
+        <w:rFonts w:ascii="Symbol" w:hAnsi="Symbol" w:hint="default"/>
+      </w:rPr>
+    </w:lvl>
+    <w:lvl w:ilvl="1" w:tplc="40090003" w:tentative="1">
+      <w:start w:val="1"/>
+      <w:numFmt w:val="bullet"/>
+      <w:lvlText w:val="o"/>
+      <w:lvlJc w:val="left"/>
+      <w:pPr>
+        <w:ind w:left="2160" w:hanging="360"/>
+      </w:pPr>
+      <w:rPr>
+        <w:rFonts w:ascii="Courier New" w:hAnsi="Courier New" w:cs="Courier New" w:hint="default"/>
+      </w:rPr>
+    </w:lvl>
+    <w:lvl w:ilvl="2" w:tplc="40090005" w:tentative="1">
+      <w:start w:val="1"/>
+      <w:numFmt w:val="bullet"/>
+      <w:lvlText w:val=""/>
+      <w:lvlJc w:val="left"/>
+      <w:pPr>
+        <w:ind w:left="2880" w:hanging="360"/>
+      </w:pPr>
+      <w:rPr>
+        <w:rFonts w:ascii="Wingdings" w:hAnsi="Wingdings" w:hint="default"/>
+      </w:rPr>
+    </w:lvl>
+    <w:lvl w:ilvl="3" w:tplc="40090001" w:tentative="1">
+      <w:start w:val="1"/>
+      <w:numFmt w:val="bullet"/>
+      <w:lvlText w:val=""/>
+      <w:lvlJc w:val="left"/>
+      <w:pPr>
+        <w:ind w:left="3600" w:hanging="360"/>
+      </w:pPr>
+      <w:rPr>
+        <w:rFonts w:ascii="Symbol" w:hAnsi="Symbol" w:hint="default"/>
+      </w:rPr>
+    </w:lvl>
+    <w:lvl w:ilvl="4" w:tplc="40090003" w:tentative="1">
+      <w:start w:val="1"/>
+      <w:numFmt w:val="bullet"/>
+      <w:lvlText w:val="o"/>
+      <w:lvlJc w:val="left"/>
+      <w:pPr>
+        <w:ind w:left="4320" w:hanging="360"/>
+      </w:pPr>
+      <w:rPr>
+        <w:rFonts w:ascii="Courier New" w:hAnsi="Courier New" w:cs="Courier New" w:hint="default"/>
+      </w:rPr>
+    </w:lvl>
+    <w:lvl w:ilvl="5" w:tplc="40090005" w:tentative="1">
+      <w:start w:val="1"/>
+      <w:numFmt w:val="bullet"/>
+      <w:lvlText w:val=""/>
+      <w:lvlJc w:val="left"/>
+      <w:pPr>
+        <w:ind w:left="5040" w:hanging="360"/>
+      </w:pPr>
+      <w:rPr>
+        <w:rFonts w:ascii="Wingdings" w:hAnsi="Wingdings" w:hint="default"/>
+      </w:rPr>
+    </w:lvl>
+    <w:lvl w:ilvl="6" w:tplc="40090001" w:tentative="1">
+      <w:start w:val="1"/>
+      <w:numFmt w:val="bullet"/>
+      <w:lvlText w:val=""/>
+      <w:lvlJc w:val="left"/>
+      <w:pPr>
+        <w:ind w:left="5760" w:hanging="360"/>
+      </w:pPr>
+      <w:rPr>
+        <w:rFonts w:ascii="Symbol" w:hAnsi="Symbol" w:hint="default"/>
+      </w:rPr>
+    </w:lvl>
+    <w:lvl w:ilvl="7" w:tplc="40090003" w:tentative="1">
+      <w:start w:val="1"/>
+      <w:numFmt w:val="bullet"/>
+      <w:lvlText w:val="o"/>
+      <w:lvlJc w:val="left"/>
+      <w:pPr>
+        <w:ind w:left="6480" w:hanging="360"/>
+      </w:pPr>
+      <w:rPr>
+        <w:rFonts w:ascii="Courier New" w:hAnsi="Courier New" w:cs="Courier New" w:hint="default"/>
+      </w:rPr>
+    </w:lvl>
+    <w:lvl w:ilvl="8" w:tplc="40090005" w:tentative="1">
+      <w:start w:val="1"/>
+      <w:numFmt w:val="bullet"/>
+      <w:lvlText w:val=""/>
+      <w:lvlJc w:val="left"/>
+      <w:pPr>
+        <w:ind w:left="7200" w:hanging="360"/>
+      </w:pPr>
+      <w:rPr>
+        <w:rFonts w:ascii="Wingdings" w:hAnsi="Wingdings" w:hint="default"/>
+      </w:rPr>
+    </w:lvl>
+  </w:abstractNum>
   <w:num w:numId="1" w16cid:durableId="335811534">
-    <w:abstractNumId w:val="5"/>
+    <w:abstractNumId w:val="7"/>
   </w:num>
   <w:num w:numId="2" w16cid:durableId="1843156507">
     <w:abstractNumId w:val="0"/>
   </w:num>
   <w:num w:numId="3" w16cid:durableId="1947150590">
+    <w:abstractNumId w:val="5"/>
+  </w:num>
+  <w:num w:numId="4" w16cid:durableId="603539994">
+    <w:abstractNumId w:val="2"/>
+  </w:num>
+  <w:num w:numId="5" w16cid:durableId="1614744212">
+    <w:abstractNumId w:val="8"/>
+  </w:num>
+  <w:num w:numId="6" w16cid:durableId="541400149">
+    <w:abstractNumId w:val="4"/>
+  </w:num>
+  <w:num w:numId="7" w16cid:durableId="1787432973">
+    <w:abstractNumId w:val="6"/>
+  </w:num>
+  <w:num w:numId="8" w16cid:durableId="1836988155">
+    <w:abstractNumId w:val="9"/>
+  </w:num>
+  <w:num w:numId="9" w16cid:durableId="872038818">
     <w:abstractNumId w:val="3"/>
   </w:num>
-  <w:num w:numId="4" w16cid:durableId="603539994">
+  <w:num w:numId="10" w16cid:durableId="682323288">
     <w:abstractNumId w:val="1"/>
-  </w:num>
-  <w:num w:numId="5" w16cid:durableId="1614744212">
-    <w:abstractNumId w:val="6"/>
-  </w:num>
-  <w:num w:numId="6" w16cid:durableId="541400149">
-    <w:abstractNumId w:val="2"/>
-  </w:num>
-  <w:num w:numId="7" w16cid:durableId="1787432973">
-    <w:abstractNumId w:val="4"/>
   </w:num>
 </w:numbering>
 </file>

</xml_diff>

<commit_message>
updated as of 03-Feb-2026
</commit_message>
<xml_diff>
--- a/Jenkins/Jenkins-02.docx
+++ b/Jenkins/Jenkins-02.docx
@@ -300,7 +300,15 @@
         <w:t>build workloads</w:t>
       </w:r>
       <w:r>
-        <w:t xml:space="preserve"> For that, we need to create 2 new instances </w:t>
+        <w:t xml:space="preserve"> </w:t>
+      </w:r>
+      <w:proofErr w:type="gramStart"/>
+      <w:r>
+        <w:t>For</w:t>
+      </w:r>
+      <w:proofErr w:type="gramEnd"/>
+      <w:r>
+        <w:t xml:space="preserve"> that, we need to create 2 new instances </w:t>
       </w:r>
       <w:r>
         <w:t>and install java</w:t>
@@ -420,7 +428,15 @@
         <w:t xml:space="preserve">Step 1: </w:t>
       </w:r>
       <w:r>
-        <w:t>Navigate to ec2 and launch a instance.</w:t>
+        <w:t xml:space="preserve">Navigate to ec2 and launch </w:t>
+      </w:r>
+      <w:proofErr w:type="gramStart"/>
+      <w:r>
+        <w:t>a</w:t>
+      </w:r>
+      <w:proofErr w:type="gramEnd"/>
+      <w:r>
+        <w:t xml:space="preserve"> instance.</w:t>
       </w:r>
       <w:r>
         <w:rPr>
@@ -888,6 +904,9 @@
         <w:ind w:left="720"/>
       </w:pPr>
       <w:r>
+        <w:rPr>
+          <w:noProof/>
+        </w:rPr>
         <w:lastRenderedPageBreak/>
         <w:drawing>
           <wp:inline distT="0" distB="0" distL="0" distR="0" wp14:anchorId="76244147" wp14:editId="11B75898">
@@ -950,6 +969,9 @@
         <w:ind w:left="720"/>
       </w:pPr>
       <w:r>
+        <w:rPr>
+          <w:noProof/>
+        </w:rPr>
         <w:drawing>
           <wp:inline distT="0" distB="0" distL="0" distR="0" wp14:anchorId="7007AFA7" wp14:editId="2E42F520">
             <wp:extent cx="5731510" cy="2535555"/>
@@ -1004,6 +1026,9 @@
         <w:ind w:left="720"/>
       </w:pPr>
       <w:r>
+        <w:rPr>
+          <w:noProof/>
+        </w:rPr>
         <w:drawing>
           <wp:inline distT="0" distB="0" distL="0" distR="0" wp14:anchorId="43281AF4" wp14:editId="7071E4DE">
             <wp:extent cx="5731510" cy="1610360"/>
@@ -1076,6 +1101,9 @@
         <w:ind w:left="720"/>
       </w:pPr>
       <w:r>
+        <w:rPr>
+          <w:noProof/>
+        </w:rPr>
         <w:lastRenderedPageBreak/>
         <w:drawing>
           <wp:inline distT="0" distB="0" distL="0" distR="0" wp14:anchorId="2F0B7C10" wp14:editId="15308644">
@@ -1153,6 +1181,9 @@
         <w:ind w:left="720"/>
       </w:pPr>
       <w:r>
+        <w:rPr>
+          <w:noProof/>
+        </w:rPr>
         <w:drawing>
           <wp:inline distT="0" distB="0" distL="0" distR="0" wp14:anchorId="0D5550A6" wp14:editId="49D25D1C">
             <wp:extent cx="5731510" cy="2760345"/>
@@ -1274,6 +1305,9 @@
         <w:ind w:left="720"/>
       </w:pPr>
       <w:r>
+        <w:rPr>
+          <w:noProof/>
+        </w:rPr>
         <w:lastRenderedPageBreak/>
         <w:drawing>
           <wp:inline distT="0" distB="0" distL="0" distR="0" wp14:anchorId="12FA2F06" wp14:editId="7D1891DA">
@@ -1322,6 +1356,9 @@
         <w:ind w:left="720"/>
       </w:pPr>
       <w:r>
+        <w:rPr>
+          <w:noProof/>
+        </w:rPr>
         <w:drawing>
           <wp:inline distT="0" distB="0" distL="0" distR="0" wp14:anchorId="6DCBF1E2" wp14:editId="2DC5048E">
             <wp:extent cx="5731510" cy="3034030"/>
@@ -1397,7 +1434,7 @@
       </w:pPr>
       <w:r>
         <w:pict w14:anchorId="42D2D0EA">
-          <v:shape id="Picture 1" o:spid="_x0000_i1032" type="#_x0000_t75" style="width:1pt;height:1pt;visibility:visible;mso-wrap-style:square">
+          <v:shape id="Picture 1" o:spid="_x0000_i1026" type="#_x0000_t75" style="width:1.1pt;height:1.1pt;visibility:visible;mso-wrap-style:square">
             <v:imagedata r:id="rId17" o:title=""/>
           </v:shape>
         </w:pict>
@@ -2591,11 +2628,27 @@
     <w:p>
       <w:pPr>
         <w:ind w:left="720"/>
-        <w:rPr>
-          <w:b/>
-          <w:bCs/>
-        </w:rPr>
-      </w:pPr>
+      </w:pPr>
+      <w:r>
+        <w:t>The objective of this task is to configure poll scm</w:t>
+      </w:r>
+      <w:r>
+        <w:t xml:space="preserve"> and </w:t>
+      </w:r>
+      <w:r>
+        <w:t>build periodically options in Jenkins by adding Cronjobs</w:t>
+      </w:r>
+      <w:r>
+        <w:t xml:space="preserve">. </w:t>
+      </w:r>
+    </w:p>
+    <w:p>
+      <w:pPr>
+        <w:ind w:left="720"/>
+      </w:pPr>
+      <w:r>
+        <w:t>To automate job triggers wither by checking source code repositories for changes (poll scm) or by scheduling builds at fixed intervals (Build Periodically).</w:t>
+      </w:r>
     </w:p>
     <w:p>
       <w:pPr>
@@ -2617,7 +2670,11 @@
     </w:p>
     <w:p>
       <w:pPr>
-        <w:ind w:left="720"/>
+        <w:pStyle w:val="ListParagraph"/>
+        <w:numPr>
+          <w:ilvl w:val="0"/>
+          <w:numId w:val="7"/>
+        </w:numPr>
         <w:rPr>
           <w:b/>
           <w:bCs/>
@@ -2646,12 +2703,491 @@
     <w:p>
       <w:pPr>
         <w:ind w:left="720"/>
+      </w:pPr>
+      <w:r>
+        <w:rPr>
+          <w:b/>
+          <w:bCs/>
+        </w:rPr>
+        <w:t xml:space="preserve">Step 1: </w:t>
+      </w:r>
+      <w:r>
+        <w:t xml:space="preserve">Navigate to a job already created and available. </w:t>
+      </w:r>
+    </w:p>
+    <w:p>
+      <w:pPr>
+        <w:ind w:left="720"/>
+      </w:pPr>
+      <w:r>
+        <w:drawing>
+          <wp:inline distT="0" distB="0" distL="0" distR="0" wp14:anchorId="3CA62502" wp14:editId="3574F06C">
+            <wp:extent cx="5731510" cy="2181225"/>
+            <wp:effectExtent l="0" t="0" r="2540" b="9525"/>
+            <wp:docPr id="1564446386" name="Picture 1"/>
+            <wp:cNvGraphicFramePr>
+              <a:graphicFrameLocks xmlns:a="http://schemas.openxmlformats.org/drawingml/2006/main" noChangeAspect="1"/>
+            </wp:cNvGraphicFramePr>
+            <a:graphic xmlns:a="http://schemas.openxmlformats.org/drawingml/2006/main">
+              <a:graphicData uri="http://schemas.openxmlformats.org/drawingml/2006/picture">
+                <pic:pic xmlns:pic="http://schemas.openxmlformats.org/drawingml/2006/picture">
+                  <pic:nvPicPr>
+                    <pic:cNvPr id="1564446386" name=""/>
+                    <pic:cNvPicPr/>
+                  </pic:nvPicPr>
+                  <pic:blipFill>
+                    <a:blip r:embed="rId30"/>
+                    <a:stretch>
+                      <a:fillRect/>
+                    </a:stretch>
+                  </pic:blipFill>
+                  <pic:spPr>
+                    <a:xfrm>
+                      <a:off x="0" y="0"/>
+                      <a:ext cx="5731510" cy="2181225"/>
+                    </a:xfrm>
+                    <a:prstGeom prst="rect">
+                      <a:avLst/>
+                    </a:prstGeom>
+                  </pic:spPr>
+                </pic:pic>
+              </a:graphicData>
+            </a:graphic>
+          </wp:inline>
+        </w:drawing>
+      </w:r>
+    </w:p>
+    <w:p>
+      <w:pPr>
+        <w:ind w:left="720"/>
+      </w:pPr>
+    </w:p>
+    <w:p>
+      <w:pPr>
+        <w:rPr>
+          <w:b/>
+          <w:bCs/>
+        </w:rPr>
+      </w:pPr>
+      <w:r>
+        <w:rPr>
+          <w:b/>
+          <w:bCs/>
+        </w:rPr>
+        <w:t xml:space="preserve">Step 2: </w:t>
+      </w:r>
+      <w:r>
+        <w:t xml:space="preserve">Go to the </w:t>
+      </w:r>
+      <w:r>
+        <w:t>configure now and scroll down to the triggers.</w:t>
+      </w:r>
+      <w:r>
+        <w:rPr>
+          <w:b/>
+          <w:bCs/>
+        </w:rPr>
+        <w:t xml:space="preserve"> </w:t>
+      </w:r>
+    </w:p>
+    <w:p>
+      <w:pPr>
+        <w:pStyle w:val="ListParagraph"/>
+        <w:numPr>
+          <w:ilvl w:val="0"/>
+          <w:numId w:val="7"/>
+        </w:numPr>
+      </w:pPr>
+      <w:r>
+        <w:t xml:space="preserve">We are going to trigger 2 triggers- Build Periodically and Poll SCM. </w:t>
+      </w:r>
+    </w:p>
+    <w:p>
+      <w:pPr>
+        <w:pStyle w:val="ListParagraph"/>
+        <w:numPr>
+          <w:ilvl w:val="0"/>
+          <w:numId w:val="7"/>
+        </w:numPr>
+      </w:pPr>
+      <w:r>
+        <w:t xml:space="preserve">Build Periodically means Jenkins will run </w:t>
+      </w:r>
+      <w:r>
+        <w:t xml:space="preserve">the job on a fixed schedule. </w:t>
+      </w:r>
+    </w:p>
+    <w:p>
+      <w:pPr>
+        <w:pStyle w:val="ListParagraph"/>
+        <w:numPr>
+          <w:ilvl w:val="0"/>
+          <w:numId w:val="7"/>
+        </w:numPr>
+      </w:pPr>
+      <w:r>
+        <w:lastRenderedPageBreak/>
+        <w:t>Whereas, POLL SCM will trigger when there is a change in repository</w:t>
+      </w:r>
+      <w:r>
+        <w:t xml:space="preserve">. </w:t>
+      </w:r>
+    </w:p>
+    <w:p>
+      <w:pPr>
+        <w:ind w:left="720"/>
+      </w:pPr>
+      <w:r>
+        <w:drawing>
+          <wp:inline distT="0" distB="0" distL="0" distR="0" wp14:anchorId="1E753123" wp14:editId="36D7DC44">
+            <wp:extent cx="5731510" cy="2112645"/>
+            <wp:effectExtent l="0" t="0" r="2540" b="1905"/>
+            <wp:docPr id="792202943" name="Picture 1" descr="A screenshot of a computer&#10;&#10;AI-generated content may be incorrect."/>
+            <wp:cNvGraphicFramePr>
+              <a:graphicFrameLocks xmlns:a="http://schemas.openxmlformats.org/drawingml/2006/main" noChangeAspect="1"/>
+            </wp:cNvGraphicFramePr>
+            <a:graphic xmlns:a="http://schemas.openxmlformats.org/drawingml/2006/main">
+              <a:graphicData uri="http://schemas.openxmlformats.org/drawingml/2006/picture">
+                <pic:pic xmlns:pic="http://schemas.openxmlformats.org/drawingml/2006/picture">
+                  <pic:nvPicPr>
+                    <pic:cNvPr id="792202943" name="Picture 1" descr="A screenshot of a computer&#10;&#10;AI-generated content may be incorrect."/>
+                    <pic:cNvPicPr/>
+                  </pic:nvPicPr>
+                  <pic:blipFill>
+                    <a:blip r:embed="rId31"/>
+                    <a:stretch>
+                      <a:fillRect/>
+                    </a:stretch>
+                  </pic:blipFill>
+                  <pic:spPr>
+                    <a:xfrm>
+                      <a:off x="0" y="0"/>
+                      <a:ext cx="5731510" cy="2112645"/>
+                    </a:xfrm>
+                    <a:prstGeom prst="rect">
+                      <a:avLst/>
+                    </a:prstGeom>
+                  </pic:spPr>
+                </pic:pic>
+              </a:graphicData>
+            </a:graphic>
+          </wp:inline>
+        </w:drawing>
+      </w:r>
+    </w:p>
+    <w:p>
+      <w:pPr>
+        <w:ind w:left="720"/>
+      </w:pPr>
+    </w:p>
+    <w:p>
+      <w:pPr>
+        <w:pStyle w:val="ListParagraph"/>
+        <w:numPr>
+          <w:ilvl w:val="0"/>
+          <w:numId w:val="12"/>
+        </w:numPr>
+      </w:pPr>
+      <w:r>
+        <w:t xml:space="preserve">Poll SCM configured. </w:t>
+      </w:r>
+    </w:p>
+    <w:p>
+      <w:pPr>
+        <w:ind w:left="720"/>
+      </w:pPr>
+      <w:r>
+        <w:drawing>
+          <wp:inline distT="0" distB="0" distL="0" distR="0" wp14:anchorId="01A42749" wp14:editId="6E4BDFF9">
+            <wp:extent cx="5731510" cy="1697355"/>
+            <wp:effectExtent l="0" t="0" r="2540" b="0"/>
+            <wp:docPr id="852368248" name="Picture 1" descr="A screenshot of a computer&#10;&#10;AI-generated content may be incorrect."/>
+            <wp:cNvGraphicFramePr>
+              <a:graphicFrameLocks xmlns:a="http://schemas.openxmlformats.org/drawingml/2006/main" noChangeAspect="1"/>
+            </wp:cNvGraphicFramePr>
+            <a:graphic xmlns:a="http://schemas.openxmlformats.org/drawingml/2006/main">
+              <a:graphicData uri="http://schemas.openxmlformats.org/drawingml/2006/picture">
+                <pic:pic xmlns:pic="http://schemas.openxmlformats.org/drawingml/2006/picture">
+                  <pic:nvPicPr>
+                    <pic:cNvPr id="852368248" name="Picture 1" descr="A screenshot of a computer&#10;&#10;AI-generated content may be incorrect."/>
+                    <pic:cNvPicPr/>
+                  </pic:nvPicPr>
+                  <pic:blipFill>
+                    <a:blip r:embed="rId32"/>
+                    <a:stretch>
+                      <a:fillRect/>
+                    </a:stretch>
+                  </pic:blipFill>
+                  <pic:spPr>
+                    <a:xfrm>
+                      <a:off x="0" y="0"/>
+                      <a:ext cx="5731510" cy="1697355"/>
+                    </a:xfrm>
+                    <a:prstGeom prst="rect">
+                      <a:avLst/>
+                    </a:prstGeom>
+                  </pic:spPr>
+                </pic:pic>
+              </a:graphicData>
+            </a:graphic>
+          </wp:inline>
+        </w:drawing>
+      </w:r>
+    </w:p>
+    <w:p>
+      <w:pPr>
+        <w:pStyle w:val="ListParagraph"/>
+        <w:numPr>
+          <w:ilvl w:val="0"/>
+          <w:numId w:val="12"/>
+        </w:numPr>
+      </w:pPr>
+      <w:r>
+        <w:t xml:space="preserve">Triggers updated and build completed for Build Periodically and Poll SCM. </w:t>
+      </w:r>
+    </w:p>
+    <w:p>
+      <w:pPr>
+        <w:ind w:left="720"/>
+      </w:pPr>
+      <w:r>
+        <w:drawing>
+          <wp:inline distT="0" distB="0" distL="0" distR="0" wp14:anchorId="5BC30711" wp14:editId="562F3EB9">
+            <wp:extent cx="5731510" cy="3182620"/>
+            <wp:effectExtent l="0" t="0" r="2540" b="0"/>
+            <wp:docPr id="235357848" name="Picture 1" descr="A screenshot of a computer&#10;&#10;AI-generated content may be incorrect."/>
+            <wp:cNvGraphicFramePr>
+              <a:graphicFrameLocks xmlns:a="http://schemas.openxmlformats.org/drawingml/2006/main" noChangeAspect="1"/>
+            </wp:cNvGraphicFramePr>
+            <a:graphic xmlns:a="http://schemas.openxmlformats.org/drawingml/2006/main">
+              <a:graphicData uri="http://schemas.openxmlformats.org/drawingml/2006/picture">
+                <pic:pic xmlns:pic="http://schemas.openxmlformats.org/drawingml/2006/picture">
+                  <pic:nvPicPr>
+                    <pic:cNvPr id="235357848" name="Picture 1" descr="A screenshot of a computer&#10;&#10;AI-generated content may be incorrect."/>
+                    <pic:cNvPicPr/>
+                  </pic:nvPicPr>
+                  <pic:blipFill>
+                    <a:blip r:embed="rId33"/>
+                    <a:stretch>
+                      <a:fillRect/>
+                    </a:stretch>
+                  </pic:blipFill>
+                  <pic:spPr>
+                    <a:xfrm>
+                      <a:off x="0" y="0"/>
+                      <a:ext cx="5731510" cy="3182620"/>
+                    </a:xfrm>
+                    <a:prstGeom prst="rect">
+                      <a:avLst/>
+                    </a:prstGeom>
+                  </pic:spPr>
+                </pic:pic>
+              </a:graphicData>
+            </a:graphic>
+          </wp:inline>
+        </w:drawing>
+      </w:r>
+    </w:p>
+    <w:p>
+      <w:pPr>
+        <w:ind w:left="720"/>
+      </w:pPr>
+      <w:r>
+        <w:rPr>
+          <w:b/>
+          <w:bCs/>
+        </w:rPr>
+        <w:lastRenderedPageBreak/>
+        <w:t xml:space="preserve">Step 3: </w:t>
+      </w:r>
+      <w:r>
+        <w:t xml:space="preserve">Navigate to GitHub and </w:t>
+      </w:r>
+      <w:r>
+        <w:t xml:space="preserve">make a change to test, if the triggers are working perfectly. </w:t>
+      </w:r>
+    </w:p>
+    <w:p>
+      <w:pPr>
+        <w:ind w:left="720"/>
+      </w:pPr>
+      <w:r>
+        <w:drawing>
+          <wp:inline distT="0" distB="0" distL="0" distR="0" wp14:anchorId="27C190B8" wp14:editId="61CDD655">
+            <wp:extent cx="5731510" cy="1842770"/>
+            <wp:effectExtent l="0" t="0" r="2540" b="5080"/>
+            <wp:docPr id="682828531" name="Picture 1" descr="A screenshot of a computer&#10;&#10;AI-generated content may be incorrect."/>
+            <wp:cNvGraphicFramePr>
+              <a:graphicFrameLocks xmlns:a="http://schemas.openxmlformats.org/drawingml/2006/main" noChangeAspect="1"/>
+            </wp:cNvGraphicFramePr>
+            <a:graphic xmlns:a="http://schemas.openxmlformats.org/drawingml/2006/main">
+              <a:graphicData uri="http://schemas.openxmlformats.org/drawingml/2006/picture">
+                <pic:pic xmlns:pic="http://schemas.openxmlformats.org/drawingml/2006/picture">
+                  <pic:nvPicPr>
+                    <pic:cNvPr id="682828531" name="Picture 1" descr="A screenshot of a computer&#10;&#10;AI-generated content may be incorrect."/>
+                    <pic:cNvPicPr/>
+                  </pic:nvPicPr>
+                  <pic:blipFill>
+                    <a:blip r:embed="rId34"/>
+                    <a:stretch>
+                      <a:fillRect/>
+                    </a:stretch>
+                  </pic:blipFill>
+                  <pic:spPr>
+                    <a:xfrm>
+                      <a:off x="0" y="0"/>
+                      <a:ext cx="5731510" cy="1842770"/>
+                    </a:xfrm>
+                    <a:prstGeom prst="rect">
+                      <a:avLst/>
+                    </a:prstGeom>
+                  </pic:spPr>
+                </pic:pic>
+              </a:graphicData>
+            </a:graphic>
+          </wp:inline>
+        </w:drawing>
+      </w:r>
+    </w:p>
+    <w:p>
+      <w:pPr>
+        <w:pStyle w:val="ListParagraph"/>
+        <w:numPr>
+          <w:ilvl w:val="0"/>
+          <w:numId w:val="12"/>
+        </w:numPr>
+      </w:pPr>
+      <w:r>
+        <w:t xml:space="preserve">We can see in the below, there are jobs being run as per the triggers. </w:t>
+      </w:r>
+    </w:p>
+    <w:p>
+      <w:pPr>
+        <w:ind w:left="720"/>
+      </w:pPr>
+      <w:r>
+        <w:drawing>
+          <wp:inline distT="0" distB="0" distL="0" distR="0" wp14:anchorId="12300E61" wp14:editId="339C3AF5">
+            <wp:extent cx="5731510" cy="5168900"/>
+            <wp:effectExtent l="0" t="0" r="2540" b="0"/>
+            <wp:docPr id="1342325635" name="Picture 1" descr="A screenshot of a computer&#10;&#10;AI-generated content may be incorrect."/>
+            <wp:cNvGraphicFramePr>
+              <a:graphicFrameLocks xmlns:a="http://schemas.openxmlformats.org/drawingml/2006/main" noChangeAspect="1"/>
+            </wp:cNvGraphicFramePr>
+            <a:graphic xmlns:a="http://schemas.openxmlformats.org/drawingml/2006/main">
+              <a:graphicData uri="http://schemas.openxmlformats.org/drawingml/2006/picture">
+                <pic:pic xmlns:pic="http://schemas.openxmlformats.org/drawingml/2006/picture">
+                  <pic:nvPicPr>
+                    <pic:cNvPr id="1342325635" name="Picture 1" descr="A screenshot of a computer&#10;&#10;AI-generated content may be incorrect."/>
+                    <pic:cNvPicPr/>
+                  </pic:nvPicPr>
+                  <pic:blipFill>
+                    <a:blip r:embed="rId35"/>
+                    <a:stretch>
+                      <a:fillRect/>
+                    </a:stretch>
+                  </pic:blipFill>
+                  <pic:spPr>
+                    <a:xfrm>
+                      <a:off x="0" y="0"/>
+                      <a:ext cx="5731510" cy="5168900"/>
+                    </a:xfrm>
+                    <a:prstGeom prst="rect">
+                      <a:avLst/>
+                    </a:prstGeom>
+                  </pic:spPr>
+                </pic:pic>
+              </a:graphicData>
+            </a:graphic>
+          </wp:inline>
+        </w:drawing>
+      </w:r>
+    </w:p>
+    <w:p>
+      <w:pPr>
+        <w:ind w:left="720"/>
+      </w:pPr>
+    </w:p>
+    <w:p>
+      <w:pPr>
+        <w:ind w:left="720"/>
+      </w:pPr>
+      <w:r>
+        <w:lastRenderedPageBreak/>
+        <w:drawing>
+          <wp:inline distT="0" distB="0" distL="0" distR="0" wp14:anchorId="6FD91A6A" wp14:editId="463776D8">
+            <wp:extent cx="3193473" cy="5110722"/>
+            <wp:effectExtent l="0" t="0" r="6985" b="0"/>
+            <wp:docPr id="1591754777" name="Picture 1" descr="A screenshot of a phone&#10;&#10;AI-generated content may be incorrect."/>
+            <wp:cNvGraphicFramePr>
+              <a:graphicFrameLocks xmlns:a="http://schemas.openxmlformats.org/drawingml/2006/main" noChangeAspect="1"/>
+            </wp:cNvGraphicFramePr>
+            <a:graphic xmlns:a="http://schemas.openxmlformats.org/drawingml/2006/main">
+              <a:graphicData uri="http://schemas.openxmlformats.org/drawingml/2006/picture">
+                <pic:pic xmlns:pic="http://schemas.openxmlformats.org/drawingml/2006/picture">
+                  <pic:nvPicPr>
+                    <pic:cNvPr id="1591754777" name="Picture 1" descr="A screenshot of a phone&#10;&#10;AI-generated content may be incorrect."/>
+                    <pic:cNvPicPr/>
+                  </pic:nvPicPr>
+                  <pic:blipFill>
+                    <a:blip r:embed="rId36"/>
+                    <a:stretch>
+                      <a:fillRect/>
+                    </a:stretch>
+                  </pic:blipFill>
+                  <pic:spPr>
+                    <a:xfrm>
+                      <a:off x="0" y="0"/>
+                      <a:ext cx="3195614" cy="5114148"/>
+                    </a:xfrm>
+                    <a:prstGeom prst="rect">
+                      <a:avLst/>
+                    </a:prstGeom>
+                  </pic:spPr>
+                </pic:pic>
+              </a:graphicData>
+            </a:graphic>
+          </wp:inline>
+        </w:drawing>
+      </w:r>
+    </w:p>
+    <w:p>
+      <w:pPr>
+        <w:ind w:left="720"/>
+        <w:rPr>
+          <w:b/>
+          <w:bCs/>
+        </w:rPr>
+      </w:pPr>
+    </w:p>
+    <w:p>
+      <w:pPr>
+        <w:ind w:left="720"/>
         <w:rPr>
           <w:b/>
           <w:bCs/>
           <w:u w:val="single"/>
         </w:rPr>
       </w:pPr>
+      <w:r>
+        <w:rPr>
+          <w:b/>
+          <w:bCs/>
+          <w:u w:val="single"/>
+        </w:rPr>
+        <w:t xml:space="preserve">Conclusion: </w:t>
+      </w:r>
+    </w:p>
+    <w:p>
+      <w:pPr>
+        <w:ind w:left="720"/>
+      </w:pPr>
+      <w:r>
+        <w:t xml:space="preserve">Triggers really help </w:t>
+      </w:r>
+      <w:r>
+        <w:t xml:space="preserve">in the automation according to the job created in Jenkins. </w:t>
+      </w:r>
     </w:p>
     <w:p>
       <w:pPr>
@@ -2712,30 +3248,116 @@
     <w:p>
       <w:pPr>
         <w:pStyle w:val="ListParagraph"/>
+      </w:pPr>
+      <w:r>
+        <w:t xml:space="preserve">The objective of this task is to </w:t>
+      </w:r>
+      <w:r>
+        <w:t xml:space="preserve">take backup of Jenkins server using bash script. </w:t>
+      </w:r>
+      <w:r>
+        <w:t>Goal of this task is to prevent disaster recovery and losing data</w:t>
+      </w:r>
+      <w:r>
+        <w:t xml:space="preserve">. </w:t>
+      </w:r>
+    </w:p>
+    <w:p>
+      <w:pPr>
+        <w:pStyle w:val="ListParagraph"/>
+        <w:numPr>
+          <w:ilvl w:val="0"/>
+          <w:numId w:val="13"/>
+        </w:numPr>
+      </w:pPr>
+      <w:r>
+        <w:t>Disaster recovery.</w:t>
+      </w:r>
+    </w:p>
+    <w:p>
+      <w:pPr>
+        <w:pStyle w:val="ListParagraph"/>
+        <w:numPr>
+          <w:ilvl w:val="0"/>
+          <w:numId w:val="13"/>
+        </w:numPr>
+      </w:pPr>
+      <w:r>
+        <w:t>Recovering an older configuration (an accidental configuration change may not be discovered for some time).</w:t>
+      </w:r>
+    </w:p>
+    <w:p>
+      <w:pPr>
+        <w:pStyle w:val="ListParagraph"/>
+        <w:numPr>
+          <w:ilvl w:val="0"/>
+          <w:numId w:val="13"/>
+        </w:numPr>
+      </w:pPr>
+      <w:r>
+        <w:t>Recovering a file that is corrupted or was deleted accidentally.</w:t>
+      </w:r>
+    </w:p>
+    <w:p>
+      <w:pPr>
+        <w:pStyle w:val="ListParagraph"/>
+      </w:pPr>
+    </w:p>
+    <w:p>
+      <w:pPr>
+        <w:ind w:left="720"/>
         <w:rPr>
           <w:b/>
           <w:bCs/>
           <w:u w:val="single"/>
         </w:rPr>
       </w:pPr>
-    </w:p>
-    <w:p>
-      <w:pPr>
-        <w:ind w:left="720"/>
+      <w:r>
         <w:rPr>
           <w:b/>
           <w:bCs/>
           <w:u w:val="single"/>
         </w:rPr>
-      </w:pPr>
-      <w:r>
+        <w:lastRenderedPageBreak/>
+        <w:t>Prerequisites:</w:t>
+      </w:r>
+    </w:p>
+    <w:p>
+      <w:pPr>
+        <w:pStyle w:val="ListParagraph"/>
+        <w:numPr>
+          <w:ilvl w:val="0"/>
+          <w:numId w:val="12"/>
+        </w:numPr>
+      </w:pPr>
+      <w:r>
+        <w:t>Jenkins</w:t>
+      </w:r>
+      <w:r>
+        <w:t xml:space="preserve"> installed</w:t>
+      </w:r>
+    </w:p>
+    <w:p>
+      <w:pPr>
+        <w:pStyle w:val="ListParagraph"/>
+        <w:numPr>
+          <w:ilvl w:val="0"/>
+          <w:numId w:val="12"/>
+        </w:numPr>
+      </w:pPr>
+      <w:r>
+        <w:t>Access to Jenkins directory</w:t>
+      </w:r>
+    </w:p>
+    <w:p>
+      <w:pPr>
+        <w:ind w:left="720"/>
         <w:rPr>
           <w:b/>
           <w:bCs/>
           <w:u w:val="single"/>
         </w:rPr>
-        <w:t>Prerequisites:</w:t>
-      </w:r>
+      </w:pPr>
     </w:p>
     <w:p>
       <w:pPr>
@@ -2746,20 +3368,276 @@
           <w:u w:val="single"/>
         </w:rPr>
       </w:pPr>
-    </w:p>
-    <w:p>
-      <w:pPr>
-        <w:ind w:left="720"/>
+      <w:r>
         <w:rPr>
           <w:b/>
           <w:bCs/>
           <w:u w:val="single"/>
         </w:rPr>
-      </w:pPr>
-    </w:p>
-    <w:p>
-      <w:pPr>
-        <w:ind w:left="720"/>
+        <w:t>Step by step Implementation:</w:t>
+      </w:r>
+    </w:p>
+    <w:p>
+      <w:pPr>
+        <w:ind w:left="720"/>
+        <w:rPr>
+          <w:b/>
+          <w:bCs/>
+        </w:rPr>
+      </w:pPr>
+      <w:r>
+        <w:rPr>
+          <w:b/>
+          <w:bCs/>
+        </w:rPr>
+        <w:t xml:space="preserve">Step 1: </w:t>
+      </w:r>
+      <w:r>
+        <w:t xml:space="preserve">Navigate to Jenkins server and </w:t>
+      </w:r>
+      <w:r>
+        <w:t>write a script for the back-ups.</w:t>
+      </w:r>
+      <w:r>
+        <w:rPr>
+          <w:b/>
+          <w:bCs/>
+        </w:rPr>
+        <w:t xml:space="preserve"> </w:t>
+      </w:r>
+    </w:p>
+    <w:p>
+      <w:pPr>
+        <w:ind w:left="720"/>
+      </w:pPr>
+      <w:r>
+        <w:drawing>
+          <wp:inline distT="0" distB="0" distL="0" distR="0" wp14:anchorId="5811B279" wp14:editId="64842782">
+            <wp:extent cx="5307477" cy="4010891"/>
+            <wp:effectExtent l="0" t="0" r="7620" b="8890"/>
+            <wp:docPr id="723179216" name="Picture 1"/>
+            <wp:cNvGraphicFramePr>
+              <a:graphicFrameLocks xmlns:a="http://schemas.openxmlformats.org/drawingml/2006/main" noChangeAspect="1"/>
+            </wp:cNvGraphicFramePr>
+            <a:graphic xmlns:a="http://schemas.openxmlformats.org/drawingml/2006/main">
+              <a:graphicData uri="http://schemas.openxmlformats.org/drawingml/2006/picture">
+                <pic:pic xmlns:pic="http://schemas.openxmlformats.org/drawingml/2006/picture">
+                  <pic:nvPicPr>
+                    <pic:cNvPr id="723179216" name=""/>
+                    <pic:cNvPicPr/>
+                  </pic:nvPicPr>
+                  <pic:blipFill>
+                    <a:blip r:embed="rId37"/>
+                    <a:stretch>
+                      <a:fillRect/>
+                    </a:stretch>
+                  </pic:blipFill>
+                  <pic:spPr>
+                    <a:xfrm>
+                      <a:off x="0" y="0"/>
+                      <a:ext cx="5314984" cy="4016564"/>
+                    </a:xfrm>
+                    <a:prstGeom prst="rect">
+                      <a:avLst/>
+                    </a:prstGeom>
+                  </pic:spPr>
+                </pic:pic>
+              </a:graphicData>
+            </a:graphic>
+          </wp:inline>
+        </w:drawing>
+      </w:r>
+    </w:p>
+    <w:p>
+      <w:pPr>
+        <w:ind w:left="720"/>
+      </w:pPr>
+    </w:p>
+    <w:p>
+      <w:pPr>
+        <w:ind w:left="720"/>
+        <w:rPr>
+          <w:b/>
+          <w:bCs/>
+        </w:rPr>
+      </w:pPr>
+      <w:r>
+        <w:rPr>
+          <w:b/>
+          <w:bCs/>
+        </w:rPr>
+        <w:t xml:space="preserve">Step 2: </w:t>
+      </w:r>
+      <w:r>
+        <w:t>Provide permissions and execute the script. Now, we can see the script got executed.</w:t>
+      </w:r>
+    </w:p>
+    <w:p>
+      <w:pPr>
+        <w:ind w:left="720"/>
+      </w:pPr>
+      <w:r>
+        <w:drawing>
+          <wp:inline distT="0" distB="0" distL="0" distR="0" wp14:anchorId="7B1CA7D6" wp14:editId="67D40B3A">
+            <wp:extent cx="5731510" cy="1120140"/>
+            <wp:effectExtent l="0" t="0" r="2540" b="3810"/>
+            <wp:docPr id="1232454599" name="Picture 1" descr="A computer screen with white text&#10;&#10;AI-generated content may be incorrect."/>
+            <wp:cNvGraphicFramePr>
+              <a:graphicFrameLocks xmlns:a="http://schemas.openxmlformats.org/drawingml/2006/main" noChangeAspect="1"/>
+            </wp:cNvGraphicFramePr>
+            <a:graphic xmlns:a="http://schemas.openxmlformats.org/drawingml/2006/main">
+              <a:graphicData uri="http://schemas.openxmlformats.org/drawingml/2006/picture">
+                <pic:pic xmlns:pic="http://schemas.openxmlformats.org/drawingml/2006/picture">
+                  <pic:nvPicPr>
+                    <pic:cNvPr id="1232454599" name="Picture 1" descr="A computer screen with white text&#10;&#10;AI-generated content may be incorrect."/>
+                    <pic:cNvPicPr/>
+                  </pic:nvPicPr>
+                  <pic:blipFill>
+                    <a:blip r:embed="rId38"/>
+                    <a:stretch>
+                      <a:fillRect/>
+                    </a:stretch>
+                  </pic:blipFill>
+                  <pic:spPr>
+                    <a:xfrm>
+                      <a:off x="0" y="0"/>
+                      <a:ext cx="5731510" cy="1120140"/>
+                    </a:xfrm>
+                    <a:prstGeom prst="rect">
+                      <a:avLst/>
+                    </a:prstGeom>
+                  </pic:spPr>
+                </pic:pic>
+              </a:graphicData>
+            </a:graphic>
+          </wp:inline>
+        </w:drawing>
+      </w:r>
+    </w:p>
+    <w:p>
+      <w:pPr>
+        <w:ind w:left="720"/>
+      </w:pPr>
+    </w:p>
+    <w:p>
+      <w:pPr>
+        <w:pStyle w:val="ListParagraph"/>
+        <w:numPr>
+          <w:ilvl w:val="1"/>
+          <w:numId w:val="15"/>
+        </w:numPr>
+      </w:pPr>
+      <w:r>
+        <w:t xml:space="preserve">Using tar command- we </w:t>
+      </w:r>
+      <w:r>
+        <w:t>bundled the backup and stored in /opt/Jenkins</w:t>
+      </w:r>
+    </w:p>
+    <w:p>
+      <w:pPr>
+        <w:ind w:left="720"/>
+      </w:pPr>
+      <w:r>
+        <w:lastRenderedPageBreak/>
+        <w:drawing>
+          <wp:inline distT="0" distB="0" distL="0" distR="0" wp14:anchorId="0A75A582" wp14:editId="57C1BF63">
+            <wp:extent cx="5731510" cy="1264920"/>
+            <wp:effectExtent l="0" t="0" r="2540" b="0"/>
+            <wp:docPr id="1806877160" name="Picture 1" descr="A computer screen with many colorful text&#10;&#10;AI-generated content may be incorrect."/>
+            <wp:cNvGraphicFramePr>
+              <a:graphicFrameLocks xmlns:a="http://schemas.openxmlformats.org/drawingml/2006/main" noChangeAspect="1"/>
+            </wp:cNvGraphicFramePr>
+            <a:graphic xmlns:a="http://schemas.openxmlformats.org/drawingml/2006/main">
+              <a:graphicData uri="http://schemas.openxmlformats.org/drawingml/2006/picture">
+                <pic:pic xmlns:pic="http://schemas.openxmlformats.org/drawingml/2006/picture">
+                  <pic:nvPicPr>
+                    <pic:cNvPr id="1806877160" name="Picture 1" descr="A computer screen with many colorful text&#10;&#10;AI-generated content may be incorrect."/>
+                    <pic:cNvPicPr/>
+                  </pic:nvPicPr>
+                  <pic:blipFill>
+                    <a:blip r:embed="rId39"/>
+                    <a:stretch>
+                      <a:fillRect/>
+                    </a:stretch>
+                  </pic:blipFill>
+                  <pic:spPr>
+                    <a:xfrm>
+                      <a:off x="0" y="0"/>
+                      <a:ext cx="5731510" cy="1264920"/>
+                    </a:xfrm>
+                    <a:prstGeom prst="rect">
+                      <a:avLst/>
+                    </a:prstGeom>
+                  </pic:spPr>
+                </pic:pic>
+              </a:graphicData>
+            </a:graphic>
+          </wp:inline>
+        </w:drawing>
+      </w:r>
+    </w:p>
+    <w:p>
+      <w:pPr>
+        <w:pStyle w:val="ListParagraph"/>
+        <w:numPr>
+          <w:ilvl w:val="1"/>
+          <w:numId w:val="15"/>
+        </w:numPr>
+      </w:pPr>
+      <w:r>
+        <w:t>Now, we have the backup in /opt/Jenkins-backup</w:t>
+      </w:r>
+      <w:r>
+        <w:t xml:space="preserve">. </w:t>
+      </w:r>
+    </w:p>
+    <w:p>
+      <w:pPr>
+        <w:ind w:left="720"/>
+      </w:pPr>
+      <w:r>
+        <w:drawing>
+          <wp:inline distT="0" distB="0" distL="0" distR="0" wp14:anchorId="51050776" wp14:editId="0515C4B8">
+            <wp:extent cx="5731510" cy="813435"/>
+            <wp:effectExtent l="0" t="0" r="2540" b="5715"/>
+            <wp:docPr id="346554253" name="Picture 1" descr="A screen shot of a computer&#10;&#10;AI-generated content may be incorrect."/>
+            <wp:cNvGraphicFramePr>
+              <a:graphicFrameLocks xmlns:a="http://schemas.openxmlformats.org/drawingml/2006/main" noChangeAspect="1"/>
+            </wp:cNvGraphicFramePr>
+            <a:graphic xmlns:a="http://schemas.openxmlformats.org/drawingml/2006/main">
+              <a:graphicData uri="http://schemas.openxmlformats.org/drawingml/2006/picture">
+                <pic:pic xmlns:pic="http://schemas.openxmlformats.org/drawingml/2006/picture">
+                  <pic:nvPicPr>
+                    <pic:cNvPr id="346554253" name="Picture 1" descr="A screen shot of a computer&#10;&#10;AI-generated content may be incorrect."/>
+                    <pic:cNvPicPr/>
+                  </pic:nvPicPr>
+                  <pic:blipFill>
+                    <a:blip r:embed="rId40"/>
+                    <a:stretch>
+                      <a:fillRect/>
+                    </a:stretch>
+                  </pic:blipFill>
+                  <pic:spPr>
+                    <a:xfrm>
+                      <a:off x="0" y="0"/>
+                      <a:ext cx="5731510" cy="813435"/>
+                    </a:xfrm>
+                    <a:prstGeom prst="rect">
+                      <a:avLst/>
+                    </a:prstGeom>
+                  </pic:spPr>
+                </pic:pic>
+              </a:graphicData>
+            </a:graphic>
+          </wp:inline>
+        </w:drawing>
+      </w:r>
+    </w:p>
+    <w:p/>
+    <w:p>
+      <w:pPr>
+        <w:pStyle w:val="ListParagraph"/>
         <w:rPr>
           <w:b/>
           <w:bCs/>
@@ -2772,28 +3650,40 @@
           <w:bCs/>
           <w:u w:val="single"/>
         </w:rPr>
-        <w:t>Step by step Implementation:</w:t>
-      </w:r>
-    </w:p>
-    <w:p>
-      <w:pPr>
-        <w:ind w:left="720"/>
-        <w:rPr>
-          <w:b/>
-          <w:bCs/>
-          <w:u w:val="single"/>
-        </w:rPr>
-      </w:pPr>
-    </w:p>
-    <w:p>
-      <w:pPr>
-        <w:pStyle w:val="ListParagraph"/>
-        <w:rPr>
-          <w:b/>
-          <w:bCs/>
-          <w:u w:val="single"/>
-        </w:rPr>
-      </w:pPr>
+        <w:t xml:space="preserve">Conclusion: </w:t>
+      </w:r>
+    </w:p>
+    <w:p>
+      <w:pPr>
+        <w:pStyle w:val="ListParagraph"/>
+      </w:pPr>
+    </w:p>
+    <w:p>
+      <w:pPr>
+        <w:pStyle w:val="ListParagraph"/>
+      </w:pPr>
+      <w:r>
+        <w:t xml:space="preserve">The script </w:t>
+      </w:r>
+      <w:r>
+        <w:t xml:space="preserve">backups Jenkins configurations, jobs, plugins into a bundle tar. </w:t>
+      </w:r>
+    </w:p>
+    <w:p>
+      <w:pPr>
+        <w:pStyle w:val="ListParagraph"/>
+      </w:pPr>
+      <w:r>
+        <w:t xml:space="preserve">Backups can be scheduled via Cron jobs for automation. </w:t>
+      </w:r>
+    </w:p>
+    <w:p>
+      <w:pPr>
+        <w:pStyle w:val="ListParagraph"/>
+      </w:pPr>
+      <w:r>
+        <w:t>Ensures Jenkins can be restored quickly in case of server crash</w:t>
+      </w:r>
     </w:p>
     <w:p>
       <w:pPr>
@@ -2847,9 +3737,383 @@
           <w:bCs/>
           <w:u w:val="single"/>
         </w:rPr>
+        <w:t>Objective:</w:t>
+      </w:r>
+    </w:p>
+    <w:p>
+      <w:pPr>
+        <w:pStyle w:val="ListParagraph"/>
+      </w:pPr>
+      <w:r>
+        <w:t xml:space="preserve">The objective of this task is to take backup of Jenkins using rethin backup plugin. </w:t>
+      </w:r>
+    </w:p>
+    <w:p>
+      <w:pPr>
+        <w:pStyle w:val="ListParagraph"/>
+        <w:numPr>
+          <w:ilvl w:val="1"/>
+          <w:numId w:val="15"/>
+        </w:numPr>
+        <w:rPr>
+          <w:b/>
+          <w:bCs/>
+          <w:u w:val="single"/>
+        </w:rPr>
+      </w:pPr>
+      <w:r>
+        <w:t xml:space="preserve">We have already taken backup and its available in a bundle. The goal is to take backup using </w:t>
+      </w:r>
+      <w:r>
+        <w:t xml:space="preserve">rethin plugin which is available in Jenkins. </w:t>
+      </w:r>
+    </w:p>
+    <w:p>
+      <w:pPr>
+        <w:ind w:left="720"/>
+        <w:rPr>
+          <w:b/>
+          <w:bCs/>
+          <w:u w:val="single"/>
+        </w:rPr>
+      </w:pPr>
+      <w:r>
+        <w:rPr>
+          <w:b/>
+          <w:bCs/>
+          <w:u w:val="single"/>
+        </w:rPr>
+        <w:t>Prerequisites:</w:t>
+      </w:r>
+    </w:p>
+    <w:p>
+      <w:pPr>
+        <w:pStyle w:val="ListParagraph"/>
+        <w:numPr>
+          <w:ilvl w:val="1"/>
+          <w:numId w:val="15"/>
+        </w:numPr>
+        <w:rPr>
+          <w:b/>
+          <w:bCs/>
+          <w:u w:val="single"/>
+        </w:rPr>
+      </w:pPr>
+      <w:r>
+        <w:t>Rethin Plugin</w:t>
+      </w:r>
+    </w:p>
+    <w:p>
+      <w:pPr>
+        <w:pStyle w:val="ListParagraph"/>
+        <w:numPr>
+          <w:ilvl w:val="1"/>
+          <w:numId w:val="15"/>
+        </w:numPr>
+        <w:rPr>
+          <w:b/>
+          <w:bCs/>
+          <w:u w:val="single"/>
+        </w:rPr>
+      </w:pPr>
+      <w:r>
+        <w:t>Jenkins</w:t>
+      </w:r>
+    </w:p>
+    <w:p>
+      <w:pPr>
+        <w:ind w:left="720"/>
+        <w:rPr>
+          <w:b/>
+          <w:bCs/>
+          <w:u w:val="single"/>
+        </w:rPr>
+      </w:pPr>
+      <w:r>
+        <w:rPr>
+          <w:b/>
+          <w:bCs/>
+          <w:u w:val="single"/>
+        </w:rPr>
+        <w:t>Step by step Implementation:</w:t>
+      </w:r>
+    </w:p>
+    <w:p>
+      <w:pPr>
+        <w:pStyle w:val="ListParagraph"/>
+        <w:rPr>
+          <w:b/>
+          <w:bCs/>
+        </w:rPr>
+      </w:pPr>
+      <w:r>
+        <w:rPr>
+          <w:b/>
+          <w:bCs/>
+        </w:rPr>
+        <w:t xml:space="preserve">Step 1: </w:t>
+      </w:r>
+      <w:r>
+        <w:t>Navigate to Jenkins and install the rethin plugin.</w:t>
+      </w:r>
+      <w:r>
+        <w:rPr>
+          <w:b/>
+          <w:bCs/>
+        </w:rPr>
+        <w:t xml:space="preserve"> </w:t>
+      </w:r>
+    </w:p>
+    <w:p>
+      <w:pPr>
+        <w:pStyle w:val="ListParagraph"/>
+      </w:pPr>
+    </w:p>
+    <w:p>
+      <w:pPr>
+        <w:pStyle w:val="ListParagraph"/>
+      </w:pPr>
+      <w:r>
         <w:lastRenderedPageBreak/>
-        <w:t>Objective:</w:t>
-      </w:r>
+        <w:drawing>
+          <wp:inline distT="0" distB="0" distL="0" distR="0" wp14:anchorId="21927ECF" wp14:editId="7BD42517">
+            <wp:extent cx="5731510" cy="3129280"/>
+            <wp:effectExtent l="0" t="0" r="2540" b="0"/>
+            <wp:docPr id="1639550723" name="Picture 1"/>
+            <wp:cNvGraphicFramePr>
+              <a:graphicFrameLocks xmlns:a="http://schemas.openxmlformats.org/drawingml/2006/main" noChangeAspect="1"/>
+            </wp:cNvGraphicFramePr>
+            <a:graphic xmlns:a="http://schemas.openxmlformats.org/drawingml/2006/main">
+              <a:graphicData uri="http://schemas.openxmlformats.org/drawingml/2006/picture">
+                <pic:pic xmlns:pic="http://schemas.openxmlformats.org/drawingml/2006/picture">
+                  <pic:nvPicPr>
+                    <pic:cNvPr id="1639550723" name=""/>
+                    <pic:cNvPicPr/>
+                  </pic:nvPicPr>
+                  <pic:blipFill>
+                    <a:blip r:embed="rId41"/>
+                    <a:stretch>
+                      <a:fillRect/>
+                    </a:stretch>
+                  </pic:blipFill>
+                  <pic:spPr>
+                    <a:xfrm>
+                      <a:off x="0" y="0"/>
+                      <a:ext cx="5731510" cy="3129280"/>
+                    </a:xfrm>
+                    <a:prstGeom prst="rect">
+                      <a:avLst/>
+                    </a:prstGeom>
+                  </pic:spPr>
+                </pic:pic>
+              </a:graphicData>
+            </a:graphic>
+          </wp:inline>
+        </w:drawing>
+      </w:r>
+    </w:p>
+    <w:p>
+      <w:pPr>
+        <w:pStyle w:val="ListParagraph"/>
+        <w:numPr>
+          <w:ilvl w:val="1"/>
+          <w:numId w:val="16"/>
+        </w:numPr>
+      </w:pPr>
+      <w:r>
+        <w:t xml:space="preserve">Thin backup is available in Installed Plugins. </w:t>
+      </w:r>
+    </w:p>
+    <w:p>
+      <w:pPr>
+        <w:pStyle w:val="ListParagraph"/>
+      </w:pPr>
+      <w:r>
+        <w:drawing>
+          <wp:inline distT="0" distB="0" distL="0" distR="0" wp14:anchorId="772042AC" wp14:editId="44D92CB2">
+            <wp:extent cx="5731510" cy="1826260"/>
+            <wp:effectExtent l="0" t="0" r="2540" b="2540"/>
+            <wp:docPr id="573261270" name="Picture 1" descr="A screenshot of a computer&#10;&#10;AI-generated content may be incorrect."/>
+            <wp:cNvGraphicFramePr>
+              <a:graphicFrameLocks xmlns:a="http://schemas.openxmlformats.org/drawingml/2006/main" noChangeAspect="1"/>
+            </wp:cNvGraphicFramePr>
+            <a:graphic xmlns:a="http://schemas.openxmlformats.org/drawingml/2006/main">
+              <a:graphicData uri="http://schemas.openxmlformats.org/drawingml/2006/picture">
+                <pic:pic xmlns:pic="http://schemas.openxmlformats.org/drawingml/2006/picture">
+                  <pic:nvPicPr>
+                    <pic:cNvPr id="573261270" name="Picture 1" descr="A screenshot of a computer&#10;&#10;AI-generated content may be incorrect."/>
+                    <pic:cNvPicPr/>
+                  </pic:nvPicPr>
+                  <pic:blipFill>
+                    <a:blip r:embed="rId42"/>
+                    <a:stretch>
+                      <a:fillRect/>
+                    </a:stretch>
+                  </pic:blipFill>
+                  <pic:spPr>
+                    <a:xfrm>
+                      <a:off x="0" y="0"/>
+                      <a:ext cx="5731510" cy="1826260"/>
+                    </a:xfrm>
+                    <a:prstGeom prst="rect">
+                      <a:avLst/>
+                    </a:prstGeom>
+                  </pic:spPr>
+                </pic:pic>
+              </a:graphicData>
+            </a:graphic>
+          </wp:inline>
+        </w:drawing>
+      </w:r>
+    </w:p>
+    <w:p>
+      <w:pPr>
+        <w:pStyle w:val="ListParagraph"/>
+      </w:pPr>
+    </w:p>
+    <w:p>
+      <w:pPr>
+        <w:pStyle w:val="ListParagraph"/>
+      </w:pPr>
+      <w:r>
+        <w:rPr>
+          <w:b/>
+          <w:bCs/>
+        </w:rPr>
+        <w:t xml:space="preserve">Step 2: </w:t>
+      </w:r>
+      <w:r>
+        <w:t xml:space="preserve">Navigate to Manage Jenkins and </w:t>
+      </w:r>
+      <w:r>
+        <w:t xml:space="preserve">click on </w:t>
+      </w:r>
+      <w:proofErr w:type="gramStart"/>
+      <w:r>
+        <w:t>Thin</w:t>
+      </w:r>
+      <w:proofErr w:type="gramEnd"/>
+      <w:r>
+        <w:t xml:space="preserve"> backup</w:t>
+      </w:r>
+    </w:p>
+    <w:p>
+      <w:pPr>
+        <w:pStyle w:val="ListParagraph"/>
+      </w:pPr>
+    </w:p>
+    <w:p>
+      <w:pPr>
+        <w:pStyle w:val="ListParagraph"/>
+      </w:pPr>
+      <w:r>
+        <w:drawing>
+          <wp:inline distT="0" distB="0" distL="0" distR="0" wp14:anchorId="7C69A03D" wp14:editId="2854761C">
+            <wp:extent cx="5731510" cy="2919730"/>
+            <wp:effectExtent l="0" t="0" r="2540" b="0"/>
+            <wp:docPr id="1651363859" name="Picture 1" descr="A screenshot of a computer&#10;&#10;AI-generated content may be incorrect."/>
+            <wp:cNvGraphicFramePr>
+              <a:graphicFrameLocks xmlns:a="http://schemas.openxmlformats.org/drawingml/2006/main" noChangeAspect="1"/>
+            </wp:cNvGraphicFramePr>
+            <a:graphic xmlns:a="http://schemas.openxmlformats.org/drawingml/2006/main">
+              <a:graphicData uri="http://schemas.openxmlformats.org/drawingml/2006/picture">
+                <pic:pic xmlns:pic="http://schemas.openxmlformats.org/drawingml/2006/picture">
+                  <pic:nvPicPr>
+                    <pic:cNvPr id="1651363859" name="Picture 1" descr="A screenshot of a computer&#10;&#10;AI-generated content may be incorrect."/>
+                    <pic:cNvPicPr/>
+                  </pic:nvPicPr>
+                  <pic:blipFill>
+                    <a:blip r:embed="rId43"/>
+                    <a:stretch>
+                      <a:fillRect/>
+                    </a:stretch>
+                  </pic:blipFill>
+                  <pic:spPr>
+                    <a:xfrm>
+                      <a:off x="0" y="0"/>
+                      <a:ext cx="5731510" cy="2919730"/>
+                    </a:xfrm>
+                    <a:prstGeom prst="rect">
+                      <a:avLst/>
+                    </a:prstGeom>
+                  </pic:spPr>
+                </pic:pic>
+              </a:graphicData>
+            </a:graphic>
+          </wp:inline>
+        </w:drawing>
+      </w:r>
+    </w:p>
+    <w:p>
+      <w:pPr>
+        <w:pStyle w:val="ListParagraph"/>
+      </w:pPr>
+      <w:r>
+        <w:rPr>
+          <w:b/>
+          <w:bCs/>
+        </w:rPr>
+        <w:lastRenderedPageBreak/>
+        <w:t xml:space="preserve">Step 3: </w:t>
+      </w:r>
+      <w:r>
+        <w:t xml:space="preserve">Click on Backup now and now the backup is </w:t>
+      </w:r>
+      <w:r>
+        <w:t xml:space="preserve">completed. </w:t>
+      </w:r>
+    </w:p>
+    <w:p>
+      <w:pPr>
+        <w:pStyle w:val="ListParagraph"/>
+      </w:pPr>
+    </w:p>
+    <w:p>
+      <w:pPr>
+        <w:pStyle w:val="ListParagraph"/>
+      </w:pPr>
+      <w:r>
+        <w:drawing>
+          <wp:inline distT="0" distB="0" distL="0" distR="0" wp14:anchorId="703B855D" wp14:editId="1A064C5E">
+            <wp:extent cx="5731510" cy="2688590"/>
+            <wp:effectExtent l="0" t="0" r="2540" b="0"/>
+            <wp:docPr id="2072931689" name="Picture 1" descr="A screenshot of a computer&#10;&#10;AI-generated content may be incorrect."/>
+            <wp:cNvGraphicFramePr>
+              <a:graphicFrameLocks xmlns:a="http://schemas.openxmlformats.org/drawingml/2006/main" noChangeAspect="1"/>
+            </wp:cNvGraphicFramePr>
+            <a:graphic xmlns:a="http://schemas.openxmlformats.org/drawingml/2006/main">
+              <a:graphicData uri="http://schemas.openxmlformats.org/drawingml/2006/picture">
+                <pic:pic xmlns:pic="http://schemas.openxmlformats.org/drawingml/2006/picture">
+                  <pic:nvPicPr>
+                    <pic:cNvPr id="2072931689" name="Picture 1" descr="A screenshot of a computer&#10;&#10;AI-generated content may be incorrect."/>
+                    <pic:cNvPicPr/>
+                  </pic:nvPicPr>
+                  <pic:blipFill>
+                    <a:blip r:embed="rId44"/>
+                    <a:stretch>
+                      <a:fillRect/>
+                    </a:stretch>
+                  </pic:blipFill>
+                  <pic:spPr>
+                    <a:xfrm>
+                      <a:off x="0" y="0"/>
+                      <a:ext cx="5731510" cy="2688590"/>
+                    </a:xfrm>
+                    <a:prstGeom prst="rect">
+                      <a:avLst/>
+                    </a:prstGeom>
+                  </pic:spPr>
+                </pic:pic>
+              </a:graphicData>
+            </a:graphic>
+          </wp:inline>
+        </w:drawing>
+      </w:r>
+    </w:p>
+    <w:p>
+      <w:pPr>
+        <w:pStyle w:val="ListParagraph"/>
+      </w:pPr>
     </w:p>
     <w:p>
       <w:pPr>
@@ -2860,76 +4124,52 @@
           <w:u w:val="single"/>
         </w:rPr>
       </w:pPr>
-    </w:p>
-    <w:p>
-      <w:pPr>
-        <w:pStyle w:val="ListParagraph"/>
+      <w:r>
         <w:rPr>
           <w:b/>
           <w:bCs/>
           <w:u w:val="single"/>
         </w:rPr>
-      </w:pPr>
-    </w:p>
-    <w:p>
-      <w:pPr>
-        <w:ind w:left="720"/>
+        <w:t xml:space="preserve">Conclusion: </w:t>
+      </w:r>
+    </w:p>
+    <w:p>
+      <w:pPr>
+        <w:pStyle w:val="ListParagraph"/>
         <w:rPr>
           <w:b/>
           <w:bCs/>
           <w:u w:val="single"/>
         </w:rPr>
       </w:pPr>
-      <w:r>
-        <w:rPr>
-          <w:b/>
-          <w:bCs/>
-          <w:u w:val="single"/>
-        </w:rPr>
-        <w:t>Prerequisites:</w:t>
-      </w:r>
-    </w:p>
-    <w:p>
-      <w:pPr>
-        <w:pStyle w:val="ListParagraph"/>
-        <w:rPr>
-          <w:b/>
-          <w:bCs/>
-          <w:u w:val="single"/>
-        </w:rPr>
-      </w:pPr>
-    </w:p>
-    <w:p>
-      <w:pPr>
-        <w:ind w:left="720"/>
-        <w:rPr>
-          <w:b/>
-          <w:bCs/>
-          <w:u w:val="single"/>
-        </w:rPr>
-      </w:pPr>
-      <w:r>
-        <w:rPr>
-          <w:b/>
-          <w:bCs/>
-          <w:u w:val="single"/>
-        </w:rPr>
-        <w:t>Step by step Implementation:</w:t>
-      </w:r>
-    </w:p>
-    <w:p>
-      <w:pPr>
-        <w:pStyle w:val="ListParagraph"/>
-        <w:rPr>
-          <w:b/>
-          <w:bCs/>
-          <w:u w:val="single"/>
-        </w:rPr>
-      </w:pPr>
-    </w:p>
-    <w:p>
-      <w:pPr>
-        <w:ind w:left="720"/>
+    </w:p>
+    <w:p>
+      <w:pPr>
+        <w:pStyle w:val="ListParagraph"/>
+      </w:pPr>
+      <w:r>
+        <w:t xml:space="preserve">The backup is completed and now its available for restore when there is a disaster recovery and the data is required. </w:t>
+      </w:r>
+    </w:p>
+    <w:p>
+      <w:pPr>
+        <w:pStyle w:val="ListParagraph"/>
+      </w:pPr>
+      <w:r>
+        <w:t xml:space="preserve">Jenkins will resume with the same jobs, plugins and configurations as before and ensures business continuity and minimal downtime after failures. </w:t>
+      </w:r>
+    </w:p>
+    <w:p>
+      <w:pPr>
+        <w:pStyle w:val="ListParagraph"/>
+        <w:rPr>
+          <w:b/>
+          <w:bCs/>
+        </w:rPr>
+      </w:pPr>
+    </w:p>
+    <w:p>
+      <w:pPr>
         <w:rPr>
           <w:b/>
           <w:bCs/>
@@ -2976,6 +4216,14 @@
     <w:p>
       <w:pPr>
         <w:pStyle w:val="ListParagraph"/>
+      </w:pPr>
+      <w:r>
+        <w:t xml:space="preserve">The objective of this task is to set up a new Jenkins server and dump the backup take in task 4 using bash script. </w:t>
+      </w:r>
+    </w:p>
+    <w:p>
+      <w:pPr>
+        <w:pStyle w:val="ListParagraph"/>
         <w:rPr>
           <w:b/>
           <w:bCs/>
@@ -2985,31 +4233,70 @@
     </w:p>
     <w:p>
       <w:pPr>
-        <w:pStyle w:val="ListParagraph"/>
+        <w:ind w:left="720"/>
         <w:rPr>
           <w:b/>
           <w:bCs/>
           <w:u w:val="single"/>
         </w:rPr>
       </w:pPr>
-    </w:p>
-    <w:p>
-      <w:pPr>
-        <w:ind w:left="720"/>
+      <w:r>
         <w:rPr>
           <w:b/>
           <w:bCs/>
           <w:u w:val="single"/>
         </w:rPr>
-      </w:pPr>
-      <w:r>
+        <w:t>Prerequisites:</w:t>
+      </w:r>
+    </w:p>
+    <w:p>
+      <w:pPr>
+        <w:pStyle w:val="ListParagraph"/>
+        <w:numPr>
+          <w:ilvl w:val="1"/>
+          <w:numId w:val="16"/>
+        </w:numPr>
+      </w:pPr>
+      <w:r>
+        <w:t>Ec2</w:t>
+      </w:r>
+      <w:r>
+        <w:t xml:space="preserve"> with Jenkins installed</w:t>
+      </w:r>
+    </w:p>
+    <w:p>
+      <w:pPr>
+        <w:pStyle w:val="ListParagraph"/>
+        <w:numPr>
+          <w:ilvl w:val="1"/>
+          <w:numId w:val="16"/>
+        </w:numPr>
+      </w:pPr>
+      <w:r>
+        <w:t>Admin access to the Jenkins</w:t>
+      </w:r>
+    </w:p>
+    <w:p>
+      <w:pPr>
+        <w:pStyle w:val="ListParagraph"/>
+        <w:numPr>
+          <w:ilvl w:val="1"/>
+          <w:numId w:val="16"/>
+        </w:numPr>
+      </w:pPr>
+      <w:r>
+        <w:t>Thin Backup installed in new Jenkins server</w:t>
+      </w:r>
+    </w:p>
+    <w:p>
+      <w:pPr>
+        <w:ind w:left="720"/>
         <w:rPr>
           <w:b/>
           <w:bCs/>
           <w:u w:val="single"/>
         </w:rPr>
-        <w:t>Prerequisites:</w:t>
-      </w:r>
+      </w:pPr>
     </w:p>
     <w:p>
       <w:pPr>
@@ -3020,63 +4307,1259 @@
           <w:u w:val="single"/>
         </w:rPr>
       </w:pPr>
-    </w:p>
-    <w:p>
-      <w:pPr>
-        <w:ind w:left="720"/>
+      <w:r>
         <w:rPr>
           <w:b/>
           <w:bCs/>
           <w:u w:val="single"/>
         </w:rPr>
-      </w:pPr>
-    </w:p>
-    <w:p>
-      <w:pPr>
-        <w:ind w:left="720"/>
+        <w:t>Step by step Implementation:</w:t>
+      </w:r>
+    </w:p>
+    <w:p>
+      <w:pPr>
+        <w:ind w:left="720"/>
+      </w:pPr>
+      <w:r>
+        <w:rPr>
+          <w:b/>
+          <w:bCs/>
+        </w:rPr>
+        <w:t xml:space="preserve">Step 1: </w:t>
+      </w:r>
+      <w:r>
+        <w:t xml:space="preserve">Navigate to ec2 and launch </w:t>
+      </w:r>
+      <w:proofErr w:type="gramStart"/>
+      <w:r>
+        <w:t>a</w:t>
+      </w:r>
+      <w:proofErr w:type="gramEnd"/>
+      <w:r>
+        <w:t xml:space="preserve"> instance with Jenkins. </w:t>
+      </w:r>
+    </w:p>
+    <w:p>
+      <w:pPr>
+        <w:ind w:left="720"/>
+      </w:pPr>
+    </w:p>
+    <w:p>
+      <w:pPr>
+        <w:ind w:left="720"/>
+      </w:pPr>
+      <w:r>
+        <w:lastRenderedPageBreak/>
+        <w:drawing>
+          <wp:inline distT="0" distB="0" distL="0" distR="0" wp14:anchorId="22A816B2" wp14:editId="16747E47">
+            <wp:extent cx="5731510" cy="1136015"/>
+            <wp:effectExtent l="0" t="0" r="2540" b="6985"/>
+            <wp:docPr id="1258043896" name="Picture 1" descr="A screenshot of a computer&#10;&#10;AI-generated content may be incorrect."/>
+            <wp:cNvGraphicFramePr>
+              <a:graphicFrameLocks xmlns:a="http://schemas.openxmlformats.org/drawingml/2006/main" noChangeAspect="1"/>
+            </wp:cNvGraphicFramePr>
+            <a:graphic xmlns:a="http://schemas.openxmlformats.org/drawingml/2006/main">
+              <a:graphicData uri="http://schemas.openxmlformats.org/drawingml/2006/picture">
+                <pic:pic xmlns:pic="http://schemas.openxmlformats.org/drawingml/2006/picture">
+                  <pic:nvPicPr>
+                    <pic:cNvPr id="1258043896" name="Picture 1" descr="A screenshot of a computer&#10;&#10;AI-generated content may be incorrect."/>
+                    <pic:cNvPicPr/>
+                  </pic:nvPicPr>
+                  <pic:blipFill>
+                    <a:blip r:embed="rId45"/>
+                    <a:stretch>
+                      <a:fillRect/>
+                    </a:stretch>
+                  </pic:blipFill>
+                  <pic:spPr>
+                    <a:xfrm>
+                      <a:off x="0" y="0"/>
+                      <a:ext cx="5731510" cy="1136015"/>
+                    </a:xfrm>
+                    <a:prstGeom prst="rect">
+                      <a:avLst/>
+                    </a:prstGeom>
+                  </pic:spPr>
+                </pic:pic>
+              </a:graphicData>
+            </a:graphic>
+          </wp:inline>
+        </w:drawing>
+      </w:r>
+    </w:p>
+    <w:p>
+      <w:pPr>
+        <w:ind w:left="720"/>
+      </w:pPr>
+      <w:r>
+        <w:rPr>
+          <w:b/>
+          <w:bCs/>
+        </w:rPr>
+        <w:t>Step 2</w:t>
+      </w:r>
+      <w:r>
+        <w:t xml:space="preserve">: </w:t>
+      </w:r>
+      <w:r>
+        <w:t xml:space="preserve">Install packages and Java as a prerequisite. </w:t>
+      </w:r>
+    </w:p>
+    <w:p>
+      <w:pPr>
+        <w:ind w:left="720"/>
+      </w:pPr>
+      <w:r>
+        <w:drawing>
+          <wp:inline distT="0" distB="0" distL="0" distR="0" wp14:anchorId="0CE60B9C" wp14:editId="48C55A0E">
+            <wp:extent cx="5731510" cy="1570355"/>
+            <wp:effectExtent l="0" t="0" r="2540" b="0"/>
+            <wp:docPr id="1095698931" name="Picture 1" descr="A screen shot of a computer&#10;&#10;AI-generated content may be incorrect."/>
+            <wp:cNvGraphicFramePr>
+              <a:graphicFrameLocks xmlns:a="http://schemas.openxmlformats.org/drawingml/2006/main" noChangeAspect="1"/>
+            </wp:cNvGraphicFramePr>
+            <a:graphic xmlns:a="http://schemas.openxmlformats.org/drawingml/2006/main">
+              <a:graphicData uri="http://schemas.openxmlformats.org/drawingml/2006/picture">
+                <pic:pic xmlns:pic="http://schemas.openxmlformats.org/drawingml/2006/picture">
+                  <pic:nvPicPr>
+                    <pic:cNvPr id="1095698931" name="Picture 1" descr="A screen shot of a computer&#10;&#10;AI-generated content may be incorrect."/>
+                    <pic:cNvPicPr/>
+                  </pic:nvPicPr>
+                  <pic:blipFill>
+                    <a:blip r:embed="rId46"/>
+                    <a:stretch>
+                      <a:fillRect/>
+                    </a:stretch>
+                  </pic:blipFill>
+                  <pic:spPr>
+                    <a:xfrm>
+                      <a:off x="0" y="0"/>
+                      <a:ext cx="5731510" cy="1570355"/>
+                    </a:xfrm>
+                    <a:prstGeom prst="rect">
+                      <a:avLst/>
+                    </a:prstGeom>
+                  </pic:spPr>
+                </pic:pic>
+              </a:graphicData>
+            </a:graphic>
+          </wp:inline>
+        </w:drawing>
+      </w:r>
+    </w:p>
+    <w:p>
+      <w:pPr>
+        <w:ind w:left="720"/>
+        <w:rPr>
+          <w:b/>
+          <w:bCs/>
+        </w:rPr>
+      </w:pPr>
+      <w:r>
+        <w:rPr>
+          <w:b/>
+          <w:bCs/>
+        </w:rPr>
+        <w:t xml:space="preserve">Step 3: </w:t>
+      </w:r>
+      <w:r>
+        <w:t xml:space="preserve">Install Jenkins </w:t>
+      </w:r>
+      <w:r>
+        <w:t>packages including rpm keys, package.</w:t>
+      </w:r>
+      <w:r>
+        <w:rPr>
+          <w:b/>
+          <w:bCs/>
+        </w:rPr>
+        <w:t xml:space="preserve"> </w:t>
+      </w:r>
+    </w:p>
+    <w:p>
+      <w:pPr>
+        <w:ind w:left="720"/>
+      </w:pPr>
+      <w:r>
+        <w:drawing>
+          <wp:inline distT="0" distB="0" distL="0" distR="0" wp14:anchorId="6E603320" wp14:editId="058B5BC4">
+            <wp:extent cx="5731510" cy="701675"/>
+            <wp:effectExtent l="0" t="0" r="2540" b="3175"/>
+            <wp:docPr id="922582663" name="Picture 1"/>
+            <wp:cNvGraphicFramePr>
+              <a:graphicFrameLocks xmlns:a="http://schemas.openxmlformats.org/drawingml/2006/main" noChangeAspect="1"/>
+            </wp:cNvGraphicFramePr>
+            <a:graphic xmlns:a="http://schemas.openxmlformats.org/drawingml/2006/main">
+              <a:graphicData uri="http://schemas.openxmlformats.org/drawingml/2006/picture">
+                <pic:pic xmlns:pic="http://schemas.openxmlformats.org/drawingml/2006/picture">
+                  <pic:nvPicPr>
+                    <pic:cNvPr id="922582663" name=""/>
+                    <pic:cNvPicPr/>
+                  </pic:nvPicPr>
+                  <pic:blipFill>
+                    <a:blip r:embed="rId47"/>
+                    <a:stretch>
+                      <a:fillRect/>
+                    </a:stretch>
+                  </pic:blipFill>
+                  <pic:spPr>
+                    <a:xfrm>
+                      <a:off x="0" y="0"/>
+                      <a:ext cx="5731510" cy="701675"/>
+                    </a:xfrm>
+                    <a:prstGeom prst="rect">
+                      <a:avLst/>
+                    </a:prstGeom>
+                  </pic:spPr>
+                </pic:pic>
+              </a:graphicData>
+            </a:graphic>
+          </wp:inline>
+        </w:drawing>
+      </w:r>
+    </w:p>
+    <w:p>
+      <w:pPr>
+        <w:pStyle w:val="ListParagraph"/>
+        <w:numPr>
+          <w:ilvl w:val="1"/>
+          <w:numId w:val="18"/>
+        </w:numPr>
+      </w:pPr>
+      <w:r>
+        <w:t xml:space="preserve">Rpm key package. </w:t>
+      </w:r>
+    </w:p>
+    <w:p>
+      <w:pPr>
+        <w:ind w:left="720"/>
+      </w:pPr>
+      <w:r>
+        <w:drawing>
+          <wp:inline distT="0" distB="0" distL="0" distR="0" wp14:anchorId="1078CB97" wp14:editId="4966EEEB">
+            <wp:extent cx="5731510" cy="1732280"/>
+            <wp:effectExtent l="0" t="0" r="2540" b="1270"/>
+            <wp:docPr id="497898876" name="Picture 1" descr="A screenshot of a computer&#10;&#10;AI-generated content may be incorrect."/>
+            <wp:cNvGraphicFramePr>
+              <a:graphicFrameLocks xmlns:a="http://schemas.openxmlformats.org/drawingml/2006/main" noChangeAspect="1"/>
+            </wp:cNvGraphicFramePr>
+            <a:graphic xmlns:a="http://schemas.openxmlformats.org/drawingml/2006/main">
+              <a:graphicData uri="http://schemas.openxmlformats.org/drawingml/2006/picture">
+                <pic:pic xmlns:pic="http://schemas.openxmlformats.org/drawingml/2006/picture">
+                  <pic:nvPicPr>
+                    <pic:cNvPr id="497898876" name="Picture 1" descr="A screenshot of a computer&#10;&#10;AI-generated content may be incorrect."/>
+                    <pic:cNvPicPr/>
+                  </pic:nvPicPr>
+                  <pic:blipFill>
+                    <a:blip r:embed="rId48"/>
+                    <a:stretch>
+                      <a:fillRect/>
+                    </a:stretch>
+                  </pic:blipFill>
+                  <pic:spPr>
+                    <a:xfrm>
+                      <a:off x="0" y="0"/>
+                      <a:ext cx="5731510" cy="1732280"/>
+                    </a:xfrm>
+                    <a:prstGeom prst="rect">
+                      <a:avLst/>
+                    </a:prstGeom>
+                  </pic:spPr>
+                </pic:pic>
+              </a:graphicData>
+            </a:graphic>
+          </wp:inline>
+        </w:drawing>
+      </w:r>
+    </w:p>
+    <w:p>
+      <w:pPr>
+        <w:pStyle w:val="ListParagraph"/>
+        <w:numPr>
+          <w:ilvl w:val="1"/>
+          <w:numId w:val="18"/>
+        </w:numPr>
+      </w:pPr>
+      <w:r>
+        <w:t xml:space="preserve">Package installation complete. </w:t>
+      </w:r>
+    </w:p>
+    <w:p>
+      <w:pPr>
+        <w:ind w:left="720"/>
+      </w:pPr>
+      <w:r>
+        <w:drawing>
+          <wp:inline distT="0" distB="0" distL="0" distR="0" wp14:anchorId="3DC8EF15" wp14:editId="2409297D">
+            <wp:extent cx="5731510" cy="1051560"/>
+            <wp:effectExtent l="0" t="0" r="2540" b="0"/>
+            <wp:docPr id="1529314140" name="Picture 1" descr="A black background with a black square&#10;&#10;AI-generated content may be incorrect."/>
+            <wp:cNvGraphicFramePr>
+              <a:graphicFrameLocks xmlns:a="http://schemas.openxmlformats.org/drawingml/2006/main" noChangeAspect="1"/>
+            </wp:cNvGraphicFramePr>
+            <a:graphic xmlns:a="http://schemas.openxmlformats.org/drawingml/2006/main">
+              <a:graphicData uri="http://schemas.openxmlformats.org/drawingml/2006/picture">
+                <pic:pic xmlns:pic="http://schemas.openxmlformats.org/drawingml/2006/picture">
+                  <pic:nvPicPr>
+                    <pic:cNvPr id="1529314140" name="Picture 1" descr="A black background with a black square&#10;&#10;AI-generated content may be incorrect."/>
+                    <pic:cNvPicPr/>
+                  </pic:nvPicPr>
+                  <pic:blipFill>
+                    <a:blip r:embed="rId49"/>
+                    <a:stretch>
+                      <a:fillRect/>
+                    </a:stretch>
+                  </pic:blipFill>
+                  <pic:spPr>
+                    <a:xfrm>
+                      <a:off x="0" y="0"/>
+                      <a:ext cx="5731510" cy="1051560"/>
+                    </a:xfrm>
+                    <a:prstGeom prst="rect">
+                      <a:avLst/>
+                    </a:prstGeom>
+                  </pic:spPr>
+                </pic:pic>
+              </a:graphicData>
+            </a:graphic>
+          </wp:inline>
+        </w:drawing>
+      </w:r>
+    </w:p>
+    <w:p>
+      <w:pPr>
+        <w:pStyle w:val="ListParagraph"/>
+        <w:numPr>
+          <w:ilvl w:val="1"/>
+          <w:numId w:val="18"/>
+        </w:numPr>
+      </w:pPr>
+      <w:r>
+        <w:t xml:space="preserve">System enabled, started and status checked. </w:t>
+      </w:r>
+    </w:p>
+    <w:p>
+      <w:pPr>
+        <w:ind w:left="720"/>
+      </w:pPr>
+      <w:r>
+        <w:lastRenderedPageBreak/>
+        <w:drawing>
+          <wp:inline distT="0" distB="0" distL="0" distR="0" wp14:anchorId="6ECB2BC6" wp14:editId="5B4CE767">
+            <wp:extent cx="5731510" cy="1395095"/>
+            <wp:effectExtent l="0" t="0" r="2540" b="0"/>
+            <wp:docPr id="474051133" name="Picture 1" descr="A black and white screen&#10;&#10;AI-generated content may be incorrect."/>
+            <wp:cNvGraphicFramePr>
+              <a:graphicFrameLocks xmlns:a="http://schemas.openxmlformats.org/drawingml/2006/main" noChangeAspect="1"/>
+            </wp:cNvGraphicFramePr>
+            <a:graphic xmlns:a="http://schemas.openxmlformats.org/drawingml/2006/main">
+              <a:graphicData uri="http://schemas.openxmlformats.org/drawingml/2006/picture">
+                <pic:pic xmlns:pic="http://schemas.openxmlformats.org/drawingml/2006/picture">
+                  <pic:nvPicPr>
+                    <pic:cNvPr id="474051133" name="Picture 1" descr="A black and white screen&#10;&#10;AI-generated content may be incorrect."/>
+                    <pic:cNvPicPr/>
+                  </pic:nvPicPr>
+                  <pic:blipFill>
+                    <a:blip r:embed="rId50"/>
+                    <a:stretch>
+                      <a:fillRect/>
+                    </a:stretch>
+                  </pic:blipFill>
+                  <pic:spPr>
+                    <a:xfrm>
+                      <a:off x="0" y="0"/>
+                      <a:ext cx="5731510" cy="1395095"/>
+                    </a:xfrm>
+                    <a:prstGeom prst="rect">
+                      <a:avLst/>
+                    </a:prstGeom>
+                  </pic:spPr>
+                </pic:pic>
+              </a:graphicData>
+            </a:graphic>
+          </wp:inline>
+        </w:drawing>
+      </w:r>
+    </w:p>
+    <w:p>
+      <w:pPr>
+        <w:ind w:left="720"/>
+      </w:pPr>
+      <w:r>
+        <w:rPr>
+          <w:b/>
+          <w:bCs/>
+        </w:rPr>
+        <w:t xml:space="preserve">Step </w:t>
+      </w:r>
+      <w:r>
+        <w:rPr>
+          <w:b/>
+          <w:bCs/>
+        </w:rPr>
+        <w:t xml:space="preserve">4: </w:t>
+      </w:r>
+      <w:r>
+        <w:t xml:space="preserve">Copy pasted the unlock Jenkins password from the secrets folder in deployment location. </w:t>
+      </w:r>
+    </w:p>
+    <w:p>
+      <w:pPr>
+        <w:ind w:left="720"/>
+      </w:pPr>
+      <w:r>
+        <w:drawing>
+          <wp:inline distT="0" distB="0" distL="0" distR="0" wp14:anchorId="0092DFA6" wp14:editId="75A99BBF">
+            <wp:extent cx="5731510" cy="3825875"/>
+            <wp:effectExtent l="0" t="0" r="2540" b="3175"/>
+            <wp:docPr id="435839391" name="Picture 1" descr="A screenshot of a computer screen&#10;&#10;AI-generated content may be incorrect."/>
+            <wp:cNvGraphicFramePr>
+              <a:graphicFrameLocks xmlns:a="http://schemas.openxmlformats.org/drawingml/2006/main" noChangeAspect="1"/>
+            </wp:cNvGraphicFramePr>
+            <a:graphic xmlns:a="http://schemas.openxmlformats.org/drawingml/2006/main">
+              <a:graphicData uri="http://schemas.openxmlformats.org/drawingml/2006/picture">
+                <pic:pic xmlns:pic="http://schemas.openxmlformats.org/drawingml/2006/picture">
+                  <pic:nvPicPr>
+                    <pic:cNvPr id="435839391" name="Picture 1" descr="A screenshot of a computer screen&#10;&#10;AI-generated content may be incorrect."/>
+                    <pic:cNvPicPr/>
+                  </pic:nvPicPr>
+                  <pic:blipFill>
+                    <a:blip r:embed="rId51"/>
+                    <a:stretch>
+                      <a:fillRect/>
+                    </a:stretch>
+                  </pic:blipFill>
+                  <pic:spPr>
+                    <a:xfrm>
+                      <a:off x="0" y="0"/>
+                      <a:ext cx="5731510" cy="3825875"/>
+                    </a:xfrm>
+                    <a:prstGeom prst="rect">
+                      <a:avLst/>
+                    </a:prstGeom>
+                  </pic:spPr>
+                </pic:pic>
+              </a:graphicData>
+            </a:graphic>
+          </wp:inline>
+        </w:drawing>
+      </w:r>
+    </w:p>
+    <w:p>
+      <w:pPr>
+        <w:ind w:left="720"/>
+      </w:pPr>
+    </w:p>
+    <w:p>
+      <w:pPr>
+        <w:ind w:left="720"/>
+      </w:pPr>
+    </w:p>
+    <w:p>
+      <w:pPr>
+        <w:ind w:left="720"/>
+      </w:pPr>
+    </w:p>
+    <w:p>
+      <w:pPr>
+        <w:ind w:left="720"/>
+      </w:pPr>
+    </w:p>
+    <w:p>
+      <w:pPr>
+        <w:pStyle w:val="ListParagraph"/>
+        <w:numPr>
+          <w:ilvl w:val="1"/>
+          <w:numId w:val="18"/>
+        </w:numPr>
+      </w:pPr>
+      <w:r>
+        <w:t xml:space="preserve">Jenkins unlocked successfully. </w:t>
+      </w:r>
+    </w:p>
+    <w:p>
+      <w:pPr>
+        <w:ind w:left="720"/>
+      </w:pPr>
+      <w:r>
+        <w:lastRenderedPageBreak/>
+        <w:drawing>
+          <wp:inline distT="0" distB="0" distL="0" distR="0" wp14:anchorId="19BB297A" wp14:editId="2EAC6407">
+            <wp:extent cx="5731510" cy="3562350"/>
+            <wp:effectExtent l="0" t="0" r="2540" b="0"/>
+            <wp:docPr id="255839613" name="Picture 1"/>
+            <wp:cNvGraphicFramePr>
+              <a:graphicFrameLocks xmlns:a="http://schemas.openxmlformats.org/drawingml/2006/main" noChangeAspect="1"/>
+            </wp:cNvGraphicFramePr>
+            <a:graphic xmlns:a="http://schemas.openxmlformats.org/drawingml/2006/main">
+              <a:graphicData uri="http://schemas.openxmlformats.org/drawingml/2006/picture">
+                <pic:pic xmlns:pic="http://schemas.openxmlformats.org/drawingml/2006/picture">
+                  <pic:nvPicPr>
+                    <pic:cNvPr id="255839613" name=""/>
+                    <pic:cNvPicPr/>
+                  </pic:nvPicPr>
+                  <pic:blipFill>
+                    <a:blip r:embed="rId52"/>
+                    <a:stretch>
+                      <a:fillRect/>
+                    </a:stretch>
+                  </pic:blipFill>
+                  <pic:spPr>
+                    <a:xfrm>
+                      <a:off x="0" y="0"/>
+                      <a:ext cx="5731510" cy="3562350"/>
+                    </a:xfrm>
+                    <a:prstGeom prst="rect">
+                      <a:avLst/>
+                    </a:prstGeom>
+                  </pic:spPr>
+                </pic:pic>
+              </a:graphicData>
+            </a:graphic>
+          </wp:inline>
+        </w:drawing>
+      </w:r>
+    </w:p>
+    <w:p>
+      <w:pPr>
+        <w:pStyle w:val="ListParagraph"/>
         <w:rPr>
           <w:b/>
           <w:bCs/>
           <w:u w:val="single"/>
         </w:rPr>
       </w:pPr>
-      <w:r>
+    </w:p>
+    <w:p>
+      <w:pPr>
+        <w:pStyle w:val="ListParagraph"/>
+        <w:numPr>
+          <w:ilvl w:val="1"/>
+          <w:numId w:val="18"/>
+        </w:numPr>
+      </w:pPr>
+      <w:r>
+        <w:t xml:space="preserve">Plugins installed when launched Jenkins. </w:t>
+      </w:r>
+    </w:p>
+    <w:p>
+      <w:pPr>
+        <w:pStyle w:val="ListParagraph"/>
         <w:rPr>
           <w:b/>
           <w:bCs/>
           <w:u w:val="single"/>
         </w:rPr>
-        <w:t>Step by step Implementation:</w:t>
-      </w:r>
-    </w:p>
-    <w:p>
-      <w:pPr>
-        <w:ind w:left="720"/>
+      </w:pPr>
+      <w:r>
         <w:rPr>
           <w:b/>
           <w:bCs/>
           <w:u w:val="single"/>
         </w:rPr>
-      </w:pPr>
-    </w:p>
-    <w:p>
-      <w:pPr>
-        <w:pStyle w:val="ListParagraph"/>
-        <w:rPr>
-          <w:b/>
-          <w:bCs/>
-          <w:u w:val="single"/>
-        </w:rPr>
-      </w:pPr>
-    </w:p>
-    <w:p>
-      <w:pPr>
-        <w:ind w:left="720"/>
-        <w:rPr>
-          <w:b/>
-          <w:bCs/>
-        </w:rPr>
-      </w:pPr>
+        <w:drawing>
+          <wp:inline distT="0" distB="0" distL="0" distR="0" wp14:anchorId="22B13E7A" wp14:editId="51FADDA2">
+            <wp:extent cx="5731510" cy="3679190"/>
+            <wp:effectExtent l="0" t="0" r="2540" b="0"/>
+            <wp:docPr id="1176490392" name="Picture 1" descr="A screenshot of a computer&#10;&#10;AI-generated content may be incorrect."/>
+            <wp:cNvGraphicFramePr>
+              <a:graphicFrameLocks xmlns:a="http://schemas.openxmlformats.org/drawingml/2006/main" noChangeAspect="1"/>
+            </wp:cNvGraphicFramePr>
+            <a:graphic xmlns:a="http://schemas.openxmlformats.org/drawingml/2006/main">
+              <a:graphicData uri="http://schemas.openxmlformats.org/drawingml/2006/picture">
+                <pic:pic xmlns:pic="http://schemas.openxmlformats.org/drawingml/2006/picture">
+                  <pic:nvPicPr>
+                    <pic:cNvPr id="1176490392" name="Picture 1" descr="A screenshot of a computer&#10;&#10;AI-generated content may be incorrect."/>
+                    <pic:cNvPicPr/>
+                  </pic:nvPicPr>
+                  <pic:blipFill>
+                    <a:blip r:embed="rId53"/>
+                    <a:stretch>
+                      <a:fillRect/>
+                    </a:stretch>
+                  </pic:blipFill>
+                  <pic:spPr>
+                    <a:xfrm>
+                      <a:off x="0" y="0"/>
+                      <a:ext cx="5731510" cy="3679190"/>
+                    </a:xfrm>
+                    <a:prstGeom prst="rect">
+                      <a:avLst/>
+                    </a:prstGeom>
+                  </pic:spPr>
+                </pic:pic>
+              </a:graphicData>
+            </a:graphic>
+          </wp:inline>
+        </w:drawing>
+      </w:r>
+    </w:p>
+    <w:p>
+      <w:pPr>
+        <w:ind w:left="720"/>
+      </w:pPr>
+    </w:p>
+    <w:p>
+      <w:pPr>
+        <w:ind w:left="720"/>
+      </w:pPr>
+      <w:r>
+        <w:rPr>
+          <w:b/>
+          <w:bCs/>
+        </w:rPr>
+        <w:t>Step 5:</w:t>
+      </w:r>
+      <w:r>
+        <w:t xml:space="preserve"> </w:t>
+      </w:r>
+      <w:r>
+        <w:t xml:space="preserve">Thin Backup installed </w:t>
+      </w:r>
+      <w:r>
+        <w:t xml:space="preserve">and available for us to dump the backup in new server. </w:t>
+      </w:r>
+    </w:p>
+    <w:p>
+      <w:pPr>
+        <w:ind w:left="720"/>
+        <w:rPr>
+          <w:b/>
+          <w:bCs/>
+        </w:rPr>
+      </w:pPr>
+      <w:r>
+        <w:rPr>
+          <w:b/>
+          <w:bCs/>
+        </w:rPr>
+        <w:lastRenderedPageBreak/>
+        <w:drawing>
+          <wp:inline distT="0" distB="0" distL="0" distR="0" wp14:anchorId="75B383EA" wp14:editId="49DB9692">
+            <wp:extent cx="5731510" cy="2962275"/>
+            <wp:effectExtent l="0" t="0" r="2540" b="9525"/>
+            <wp:docPr id="1307464478" name="Picture 1" descr="A screenshot of a chat&#10;&#10;AI-generated content may be incorrect."/>
+            <wp:cNvGraphicFramePr>
+              <a:graphicFrameLocks xmlns:a="http://schemas.openxmlformats.org/drawingml/2006/main" noChangeAspect="1"/>
+            </wp:cNvGraphicFramePr>
+            <a:graphic xmlns:a="http://schemas.openxmlformats.org/drawingml/2006/main">
+              <a:graphicData uri="http://schemas.openxmlformats.org/drawingml/2006/picture">
+                <pic:pic xmlns:pic="http://schemas.openxmlformats.org/drawingml/2006/picture">
+                  <pic:nvPicPr>
+                    <pic:cNvPr id="1307464478" name="Picture 1" descr="A screenshot of a chat&#10;&#10;AI-generated content may be incorrect."/>
+                    <pic:cNvPicPr/>
+                  </pic:nvPicPr>
+                  <pic:blipFill>
+                    <a:blip r:embed="rId54"/>
+                    <a:stretch>
+                      <a:fillRect/>
+                    </a:stretch>
+                  </pic:blipFill>
+                  <pic:spPr>
+                    <a:xfrm>
+                      <a:off x="0" y="0"/>
+                      <a:ext cx="5731510" cy="2962275"/>
+                    </a:xfrm>
+                    <a:prstGeom prst="rect">
+                      <a:avLst/>
+                    </a:prstGeom>
+                  </pic:spPr>
+                </pic:pic>
+              </a:graphicData>
+            </a:graphic>
+          </wp:inline>
+        </w:drawing>
+      </w:r>
+    </w:p>
+    <w:p>
+      <w:pPr>
+        <w:ind w:left="720"/>
+        <w:rPr>
+          <w:b/>
+          <w:bCs/>
+        </w:rPr>
+      </w:pPr>
+    </w:p>
+    <w:p>
+      <w:pPr>
+        <w:ind w:left="720"/>
+        <w:rPr>
+          <w:b/>
+          <w:bCs/>
+        </w:rPr>
+      </w:pPr>
+      <w:r>
+        <w:rPr>
+          <w:b/>
+          <w:bCs/>
+        </w:rPr>
+        <w:drawing>
+          <wp:inline distT="0" distB="0" distL="0" distR="0" wp14:anchorId="00C50A2E" wp14:editId="45AA8852">
+            <wp:extent cx="5731510" cy="1757680"/>
+            <wp:effectExtent l="0" t="0" r="2540" b="0"/>
+            <wp:docPr id="2104813435" name="Picture 1" descr="A screenshot of a computer&#10;&#10;AI-generated content may be incorrect."/>
+            <wp:cNvGraphicFramePr>
+              <a:graphicFrameLocks xmlns:a="http://schemas.openxmlformats.org/drawingml/2006/main" noChangeAspect="1"/>
+            </wp:cNvGraphicFramePr>
+            <a:graphic xmlns:a="http://schemas.openxmlformats.org/drawingml/2006/main">
+              <a:graphicData uri="http://schemas.openxmlformats.org/drawingml/2006/picture">
+                <pic:pic xmlns:pic="http://schemas.openxmlformats.org/drawingml/2006/picture">
+                  <pic:nvPicPr>
+                    <pic:cNvPr id="2104813435" name="Picture 1" descr="A screenshot of a computer&#10;&#10;AI-generated content may be incorrect."/>
+                    <pic:cNvPicPr/>
+                  </pic:nvPicPr>
+                  <pic:blipFill>
+                    <a:blip r:embed="rId55"/>
+                    <a:stretch>
+                      <a:fillRect/>
+                    </a:stretch>
+                  </pic:blipFill>
+                  <pic:spPr>
+                    <a:xfrm>
+                      <a:off x="0" y="0"/>
+                      <a:ext cx="5731510" cy="1757680"/>
+                    </a:xfrm>
+                    <a:prstGeom prst="rect">
+                      <a:avLst/>
+                    </a:prstGeom>
+                  </pic:spPr>
+                </pic:pic>
+              </a:graphicData>
+            </a:graphic>
+          </wp:inline>
+        </w:drawing>
+      </w:r>
+    </w:p>
+    <w:p>
+      <w:pPr>
+        <w:rPr>
+          <w:b/>
+          <w:bCs/>
+        </w:rPr>
+      </w:pPr>
+    </w:p>
+    <w:p>
+      <w:pPr>
+        <w:ind w:left="720"/>
+        <w:rPr>
+          <w:b/>
+          <w:bCs/>
+        </w:rPr>
+      </w:pPr>
+      <w:r>
+        <w:rPr>
+          <w:b/>
+          <w:bCs/>
+        </w:rPr>
+        <w:t xml:space="preserve">Step 6: </w:t>
+      </w:r>
+      <w:r>
+        <w:t>Now, its time to take the backup from Jenkins server to Backup Jenkins server.</w:t>
+      </w:r>
+      <w:r>
+        <w:rPr>
+          <w:b/>
+          <w:bCs/>
+        </w:rPr>
+        <w:t xml:space="preserve"> </w:t>
+      </w:r>
+    </w:p>
+    <w:p>
+      <w:pPr>
+        <w:ind w:left="720"/>
+      </w:pPr>
+      <w:r>
+        <w:t xml:space="preserve">To create a backup, create a test.pem and paste the private key of </w:t>
+      </w:r>
+      <w:r>
+        <w:t>Jenkins. Pem</w:t>
+      </w:r>
+    </w:p>
+    <w:p>
+      <w:pPr>
+        <w:ind w:left="720"/>
+      </w:pPr>
+      <w:r>
+        <w:t xml:space="preserve">Change the permissions and secure </w:t>
+      </w:r>
+      <w:r>
+        <w:t xml:space="preserve">using secure copy command. </w:t>
+      </w:r>
+    </w:p>
+    <w:p>
+      <w:pPr>
+        <w:ind w:left="720"/>
+      </w:pPr>
+      <w:r>
+        <w:t>s</w:t>
+      </w:r>
+      <w:r>
+        <w:t xml:space="preserve">cp -I test.pem </w:t>
+      </w:r>
+      <w:r>
+        <w:t>jenkins-backup-2025-12-30-13-13.tar.gz</w:t>
+      </w:r>
+      <w:r>
+        <w:t xml:space="preserve"> ec2-user@</w:t>
+      </w:r>
+      <w:r>
+        <w:t>Jenkins-server2 IP</w:t>
+      </w:r>
+      <w:r>
+        <w:t>:/tmp</w:t>
+      </w:r>
+    </w:p>
+    <w:p>
+      <w:pPr>
+        <w:ind w:left="720"/>
+        <w:rPr>
+          <w:b/>
+          <w:bCs/>
+        </w:rPr>
+      </w:pPr>
+    </w:p>
+    <w:p>
+      <w:pPr>
+        <w:ind w:left="720"/>
+        <w:rPr>
+          <w:b/>
+          <w:bCs/>
+        </w:rPr>
+      </w:pPr>
+      <w:r>
+        <w:rPr>
+          <w:b/>
+          <w:bCs/>
+        </w:rPr>
+        <w:drawing>
+          <wp:inline distT="0" distB="0" distL="0" distR="0" wp14:anchorId="1742FC63" wp14:editId="7E8DB02D">
+            <wp:extent cx="5731510" cy="300990"/>
+            <wp:effectExtent l="0" t="0" r="2540" b="3810"/>
+            <wp:docPr id="228295413" name="Picture 1"/>
+            <wp:cNvGraphicFramePr>
+              <a:graphicFrameLocks xmlns:a="http://schemas.openxmlformats.org/drawingml/2006/main" noChangeAspect="1"/>
+            </wp:cNvGraphicFramePr>
+            <a:graphic xmlns:a="http://schemas.openxmlformats.org/drawingml/2006/main">
+              <a:graphicData uri="http://schemas.openxmlformats.org/drawingml/2006/picture">
+                <pic:pic xmlns:pic="http://schemas.openxmlformats.org/drawingml/2006/picture">
+                  <pic:nvPicPr>
+                    <pic:cNvPr id="228295413" name=""/>
+                    <pic:cNvPicPr/>
+                  </pic:nvPicPr>
+                  <pic:blipFill>
+                    <a:blip r:embed="rId56"/>
+                    <a:stretch>
+                      <a:fillRect/>
+                    </a:stretch>
+                  </pic:blipFill>
+                  <pic:spPr>
+                    <a:xfrm>
+                      <a:off x="0" y="0"/>
+                      <a:ext cx="5731510" cy="300990"/>
+                    </a:xfrm>
+                    <a:prstGeom prst="rect">
+                      <a:avLst/>
+                    </a:prstGeom>
+                  </pic:spPr>
+                </pic:pic>
+              </a:graphicData>
+            </a:graphic>
+          </wp:inline>
+        </w:drawing>
+      </w:r>
+    </w:p>
+    <w:p>
+      <w:pPr>
+        <w:ind w:firstLine="720"/>
+        <w:rPr>
+          <w:b/>
+          <w:bCs/>
+        </w:rPr>
+      </w:pPr>
+      <w:r>
+        <w:rPr>
+          <w:b/>
+          <w:bCs/>
+        </w:rPr>
+        <w:drawing>
+          <wp:inline distT="0" distB="0" distL="0" distR="0" wp14:anchorId="4ED3AC5E" wp14:editId="553DFA36">
+            <wp:extent cx="5731510" cy="452120"/>
+            <wp:effectExtent l="0" t="0" r="2540" b="5080"/>
+            <wp:docPr id="1881043818" name="Picture 1"/>
+            <wp:cNvGraphicFramePr>
+              <a:graphicFrameLocks xmlns:a="http://schemas.openxmlformats.org/drawingml/2006/main" noChangeAspect="1"/>
+            </wp:cNvGraphicFramePr>
+            <a:graphic xmlns:a="http://schemas.openxmlformats.org/drawingml/2006/main">
+              <a:graphicData uri="http://schemas.openxmlformats.org/drawingml/2006/picture">
+                <pic:pic xmlns:pic="http://schemas.openxmlformats.org/drawingml/2006/picture">
+                  <pic:nvPicPr>
+                    <pic:cNvPr id="1881043818" name=""/>
+                    <pic:cNvPicPr/>
+                  </pic:nvPicPr>
+                  <pic:blipFill>
+                    <a:blip r:embed="rId57"/>
+                    <a:stretch>
+                      <a:fillRect/>
+                    </a:stretch>
+                  </pic:blipFill>
+                  <pic:spPr>
+                    <a:xfrm>
+                      <a:off x="0" y="0"/>
+                      <a:ext cx="5731510" cy="452120"/>
+                    </a:xfrm>
+                    <a:prstGeom prst="rect">
+                      <a:avLst/>
+                    </a:prstGeom>
+                  </pic:spPr>
+                </pic:pic>
+              </a:graphicData>
+            </a:graphic>
+          </wp:inline>
+        </w:drawing>
+      </w:r>
+    </w:p>
+    <w:p>
+      <w:pPr>
+        <w:ind w:firstLine="720"/>
+        <w:rPr>
+          <w:b/>
+          <w:bCs/>
+        </w:rPr>
+      </w:pPr>
+    </w:p>
+    <w:p>
+      <w:pPr>
+        <w:ind w:firstLine="720"/>
+      </w:pPr>
+      <w:r>
+        <w:rPr>
+          <w:b/>
+          <w:bCs/>
+        </w:rPr>
+        <w:lastRenderedPageBreak/>
+        <w:t xml:space="preserve">Step 7: </w:t>
+      </w:r>
+      <w:r>
+        <w:t xml:space="preserve">Navigate to </w:t>
+      </w:r>
+      <w:r>
+        <w:t>Jenkins-server2 and use the command- cd /tmp/</w:t>
+      </w:r>
+    </w:p>
+    <w:p>
+      <w:pPr>
+        <w:ind w:firstLine="720"/>
+      </w:pPr>
+      <w:r>
+        <w:drawing>
+          <wp:inline distT="0" distB="0" distL="0" distR="0" wp14:anchorId="77FD2D19" wp14:editId="7A56A727">
+            <wp:extent cx="5731510" cy="1127760"/>
+            <wp:effectExtent l="0" t="0" r="2540" b="0"/>
+            <wp:docPr id="1580942466" name="Picture 1" descr="A computer code on a black background&#10;&#10;AI-generated content may be incorrect."/>
+            <wp:cNvGraphicFramePr>
+              <a:graphicFrameLocks xmlns:a="http://schemas.openxmlformats.org/drawingml/2006/main" noChangeAspect="1"/>
+            </wp:cNvGraphicFramePr>
+            <a:graphic xmlns:a="http://schemas.openxmlformats.org/drawingml/2006/main">
+              <a:graphicData uri="http://schemas.openxmlformats.org/drawingml/2006/picture">
+                <pic:pic xmlns:pic="http://schemas.openxmlformats.org/drawingml/2006/picture">
+                  <pic:nvPicPr>
+                    <pic:cNvPr id="1580942466" name="Picture 1" descr="A computer code on a black background&#10;&#10;AI-generated content may be incorrect."/>
+                    <pic:cNvPicPr/>
+                  </pic:nvPicPr>
+                  <pic:blipFill>
+                    <a:blip r:embed="rId58"/>
+                    <a:stretch>
+                      <a:fillRect/>
+                    </a:stretch>
+                  </pic:blipFill>
+                  <pic:spPr>
+                    <a:xfrm>
+                      <a:off x="0" y="0"/>
+                      <a:ext cx="5731510" cy="1127760"/>
+                    </a:xfrm>
+                    <a:prstGeom prst="rect">
+                      <a:avLst/>
+                    </a:prstGeom>
+                  </pic:spPr>
+                </pic:pic>
+              </a:graphicData>
+            </a:graphic>
+          </wp:inline>
+        </w:drawing>
+      </w:r>
+    </w:p>
+    <w:p>
+      <w:pPr>
+        <w:ind w:firstLine="720"/>
+      </w:pPr>
+    </w:p>
+    <w:p>
+      <w:pPr>
+        <w:ind w:firstLine="720"/>
+      </w:pPr>
+      <w:r>
+        <w:rPr>
+          <w:b/>
+          <w:bCs/>
+        </w:rPr>
+        <w:t>Step 8:</w:t>
+      </w:r>
+      <w:r>
+        <w:t xml:space="preserve"> Extract the file using tar command</w:t>
+      </w:r>
+      <w:r>
+        <w:t xml:space="preserve">. </w:t>
+      </w:r>
+    </w:p>
+    <w:p>
+      <w:pPr>
+        <w:ind w:firstLine="720"/>
+        <w:rPr>
+          <w:b/>
+          <w:bCs/>
+        </w:rPr>
+      </w:pPr>
+      <w:r>
+        <w:rPr>
+          <w:b/>
+          <w:bCs/>
+        </w:rPr>
+        <w:t xml:space="preserve">Command- tar </w:t>
+      </w:r>
+      <w:proofErr w:type="spellStart"/>
+      <w:r>
+        <w:rPr>
+          <w:b/>
+          <w:bCs/>
+        </w:rPr>
+        <w:t>xvf</w:t>
+      </w:r>
+      <w:proofErr w:type="spellEnd"/>
+      <w:r>
+        <w:rPr>
+          <w:b/>
+          <w:bCs/>
+        </w:rPr>
+        <w:t xml:space="preserve"> </w:t>
+      </w:r>
+      <w:r>
+        <w:rPr>
+          <w:b/>
+          <w:bCs/>
+        </w:rPr>
+        <w:t>jenkins-backup-2025-12-30-13-13.tar.gz</w:t>
+      </w:r>
+    </w:p>
+    <w:p>
+      <w:pPr>
+        <w:ind w:firstLine="720"/>
+      </w:pPr>
+      <w:r>
+        <w:drawing>
+          <wp:inline distT="0" distB="0" distL="0" distR="0" wp14:anchorId="1B843935" wp14:editId="066B0ED2">
+            <wp:extent cx="5731510" cy="2908935"/>
+            <wp:effectExtent l="0" t="0" r="2540" b="5715"/>
+            <wp:docPr id="1091026267" name="Picture 1" descr="A screenshot of a computer program&#10;&#10;AI-generated content may be incorrect."/>
+            <wp:cNvGraphicFramePr>
+              <a:graphicFrameLocks xmlns:a="http://schemas.openxmlformats.org/drawingml/2006/main" noChangeAspect="1"/>
+            </wp:cNvGraphicFramePr>
+            <a:graphic xmlns:a="http://schemas.openxmlformats.org/drawingml/2006/main">
+              <a:graphicData uri="http://schemas.openxmlformats.org/drawingml/2006/picture">
+                <pic:pic xmlns:pic="http://schemas.openxmlformats.org/drawingml/2006/picture">
+                  <pic:nvPicPr>
+                    <pic:cNvPr id="1091026267" name="Picture 1" descr="A screenshot of a computer program&#10;&#10;AI-generated content may be incorrect."/>
+                    <pic:cNvPicPr/>
+                  </pic:nvPicPr>
+                  <pic:blipFill>
+                    <a:blip r:embed="rId59"/>
+                    <a:stretch>
+                      <a:fillRect/>
+                    </a:stretch>
+                  </pic:blipFill>
+                  <pic:spPr>
+                    <a:xfrm>
+                      <a:off x="0" y="0"/>
+                      <a:ext cx="5731510" cy="2908935"/>
+                    </a:xfrm>
+                    <a:prstGeom prst="rect">
+                      <a:avLst/>
+                    </a:prstGeom>
+                  </pic:spPr>
+                </pic:pic>
+              </a:graphicData>
+            </a:graphic>
+          </wp:inline>
+        </w:drawing>
+      </w:r>
+    </w:p>
+    <w:p>
+      <w:pPr>
+        <w:ind w:firstLine="720"/>
+      </w:pPr>
+    </w:p>
+    <w:p>
+      <w:pPr>
+        <w:ind w:firstLine="720"/>
+      </w:pPr>
+      <w:r>
+        <w:rPr>
+          <w:b/>
+          <w:bCs/>
+        </w:rPr>
+        <w:t>Step 9:</w:t>
+      </w:r>
+      <w:r>
+        <w:t xml:space="preserve"> Navigate to GUI </w:t>
+      </w:r>
+      <w:r>
+        <w:t xml:space="preserve">and in the URL, </w:t>
+      </w:r>
+      <w:r>
+        <w:t>paste restart.</w:t>
+      </w:r>
+    </w:p>
+    <w:p>
+      <w:pPr>
+        <w:ind w:firstLine="720"/>
+      </w:pPr>
+      <w:r>
+        <w:drawing>
+          <wp:inline distT="0" distB="0" distL="0" distR="0" wp14:anchorId="5288BC20" wp14:editId="3B04A732">
+            <wp:extent cx="5731510" cy="2538095"/>
+            <wp:effectExtent l="0" t="0" r="2540" b="0"/>
+            <wp:docPr id="1096789537" name="Picture 1" descr="A screenshot of a computer&#10;&#10;AI-generated content may be incorrect."/>
+            <wp:cNvGraphicFramePr>
+              <a:graphicFrameLocks xmlns:a="http://schemas.openxmlformats.org/drawingml/2006/main" noChangeAspect="1"/>
+            </wp:cNvGraphicFramePr>
+            <a:graphic xmlns:a="http://schemas.openxmlformats.org/drawingml/2006/main">
+              <a:graphicData uri="http://schemas.openxmlformats.org/drawingml/2006/picture">
+                <pic:pic xmlns:pic="http://schemas.openxmlformats.org/drawingml/2006/picture">
+                  <pic:nvPicPr>
+                    <pic:cNvPr id="1096789537" name="Picture 1" descr="A screenshot of a computer&#10;&#10;AI-generated content may be incorrect."/>
+                    <pic:cNvPicPr/>
+                  </pic:nvPicPr>
+                  <pic:blipFill>
+                    <a:blip r:embed="rId60"/>
+                    <a:stretch>
+                      <a:fillRect/>
+                    </a:stretch>
+                  </pic:blipFill>
+                  <pic:spPr>
+                    <a:xfrm>
+                      <a:off x="0" y="0"/>
+                      <a:ext cx="5731510" cy="2538095"/>
+                    </a:xfrm>
+                    <a:prstGeom prst="rect">
+                      <a:avLst/>
+                    </a:prstGeom>
+                  </pic:spPr>
+                </pic:pic>
+              </a:graphicData>
+            </a:graphic>
+          </wp:inline>
+        </w:drawing>
+      </w:r>
+    </w:p>
+    <w:p>
+      <w:pPr>
+        <w:ind w:firstLine="720"/>
+      </w:pPr>
+    </w:p>
+    <w:p>
+      <w:pPr>
+        <w:ind w:left="720"/>
+      </w:pPr>
+      <w:r>
+        <w:rPr>
+          <w:b/>
+          <w:bCs/>
+        </w:rPr>
+        <w:t xml:space="preserve">Step 10: </w:t>
+      </w:r>
+      <w:r>
+        <w:t xml:space="preserve">In Jenkins-server2- verified that all files were backed up. </w:t>
+      </w:r>
+    </w:p>
+    <w:p>
+      <w:pPr>
+        <w:ind w:left="720"/>
+      </w:pPr>
+      <w:r>
+        <w:drawing>
+          <wp:inline distT="0" distB="0" distL="0" distR="0" wp14:anchorId="446CF8F6" wp14:editId="4735005D">
+            <wp:extent cx="5731510" cy="3054985"/>
+            <wp:effectExtent l="0" t="0" r="2540" b="0"/>
+            <wp:docPr id="768087389" name="Picture 1" descr="A screen shot of a computer&#10;&#10;AI-generated content may be incorrect."/>
+            <wp:cNvGraphicFramePr>
+              <a:graphicFrameLocks xmlns:a="http://schemas.openxmlformats.org/drawingml/2006/main" noChangeAspect="1"/>
+            </wp:cNvGraphicFramePr>
+            <a:graphic xmlns:a="http://schemas.openxmlformats.org/drawingml/2006/main">
+              <a:graphicData uri="http://schemas.openxmlformats.org/drawingml/2006/picture">
+                <pic:pic xmlns:pic="http://schemas.openxmlformats.org/drawingml/2006/picture">
+                  <pic:nvPicPr>
+                    <pic:cNvPr id="768087389" name="Picture 1" descr="A screen shot of a computer&#10;&#10;AI-generated content may be incorrect."/>
+                    <pic:cNvPicPr/>
+                  </pic:nvPicPr>
+                  <pic:blipFill>
+                    <a:blip r:embed="rId61"/>
+                    <a:stretch>
+                      <a:fillRect/>
+                    </a:stretch>
+                  </pic:blipFill>
+                  <pic:spPr>
+                    <a:xfrm>
+                      <a:off x="0" y="0"/>
+                      <a:ext cx="5731510" cy="3054985"/>
+                    </a:xfrm>
+                    <a:prstGeom prst="rect">
+                      <a:avLst/>
+                    </a:prstGeom>
+                  </pic:spPr>
+                </pic:pic>
+              </a:graphicData>
+            </a:graphic>
+          </wp:inline>
+        </w:drawing>
+      </w:r>
+    </w:p>
+    <w:p>
+      <w:pPr>
+        <w:rPr>
+          <w:b/>
+          <w:bCs/>
+          <w:color w:val="0070C0"/>
+        </w:rPr>
+      </w:pPr>
+    </w:p>
+    <w:p>
+      <w:pPr>
+        <w:ind w:left="720"/>
+        <w:rPr>
+          <w:b/>
+          <w:bCs/>
+        </w:rPr>
+      </w:pPr>
+      <w:r>
+        <w:rPr>
+          <w:b/>
+          <w:bCs/>
+        </w:rPr>
+        <w:t>Conclusion:</w:t>
+      </w:r>
+    </w:p>
+    <w:p>
+      <w:pPr>
+        <w:ind w:left="720"/>
+      </w:pPr>
+      <w:r>
+        <w:t>By installing Jenkins on a new server, adding the Thin</w:t>
+      </w:r>
+      <w:r>
+        <w:t xml:space="preserve"> </w:t>
+      </w:r>
+      <w:r>
+        <w:t>Backup plugin, and restoring from the backup directory, you can fully recover Jenkins jobs, plugins, and configurations. This ensures smooth migration or disaster recovery with minimal downtime.”</w:t>
+      </w:r>
     </w:p>
     <w:p>
       <w:pPr>
@@ -3119,7 +5602,7 @@
         <v:path o:extrusionok="f" gradientshapeok="t" o:connecttype="rect"/>
         <o:lock v:ext="edit" aspectratio="t"/>
       </v:shapetype>
-      <v:shape id="Picture 1" o:spid="_x0000_i1025" type="#_x0000_t75" style="width:1pt;height:1pt;visibility:visible;mso-wrap-style:square" o:bullet="t">
+      <v:shape id="Picture 1" o:spid="_x0000_i1025" type="#_x0000_t75" style="width:1.1pt;height:1.1pt;visibility:visible;mso-wrap-style:square" o:bullet="t">
         <v:imagedata r:id="rId1" o:title=""/>
       </v:shape>
     </w:pict>
@@ -3690,6 +6173,715 @@
     </w:lvl>
   </w:abstractNum>
   <w:abstractNum w:abstractNumId="5" w15:restartNumberingAfterBreak="0">
+    <w:nsid w:val="1D917AA5"/>
+    <w:multiLevelType w:val="multilevel"/>
+    <w:tmpl w:val="D93C62D0"/>
+    <w:lvl w:ilvl="0">
+      <w:start w:val="1"/>
+      <w:numFmt w:val="bullet"/>
+      <w:lvlText w:val=""/>
+      <w:lvlJc w:val="left"/>
+      <w:pPr>
+        <w:tabs>
+          <w:tab w:val="num" w:pos="720"/>
+        </w:tabs>
+        <w:ind w:left="720" w:hanging="360"/>
+      </w:pPr>
+      <w:rPr>
+        <w:rFonts w:ascii="Symbol" w:hAnsi="Symbol" w:hint="default"/>
+        <w:sz w:val="20"/>
+      </w:rPr>
+    </w:lvl>
+    <w:lvl w:ilvl="1">
+      <w:start w:val="1"/>
+      <w:numFmt w:val="bullet"/>
+      <w:lvlText w:val="o"/>
+      <w:lvlJc w:val="left"/>
+      <w:pPr>
+        <w:tabs>
+          <w:tab w:val="num" w:pos="1440"/>
+        </w:tabs>
+        <w:ind w:left="1440" w:hanging="360"/>
+      </w:pPr>
+      <w:rPr>
+        <w:rFonts w:ascii="Courier New" w:hAnsi="Courier New" w:hint="default"/>
+        <w:sz w:val="20"/>
+      </w:rPr>
+    </w:lvl>
+    <w:lvl w:ilvl="2" w:tentative="1">
+      <w:start w:val="1"/>
+      <w:numFmt w:val="bullet"/>
+      <w:lvlText w:val=""/>
+      <w:lvlJc w:val="left"/>
+      <w:pPr>
+        <w:tabs>
+          <w:tab w:val="num" w:pos="2160"/>
+        </w:tabs>
+        <w:ind w:left="2160" w:hanging="360"/>
+      </w:pPr>
+      <w:rPr>
+        <w:rFonts w:ascii="Wingdings" w:hAnsi="Wingdings" w:hint="default"/>
+        <w:sz w:val="20"/>
+      </w:rPr>
+    </w:lvl>
+    <w:lvl w:ilvl="3" w:tentative="1">
+      <w:start w:val="1"/>
+      <w:numFmt w:val="bullet"/>
+      <w:lvlText w:val=""/>
+      <w:lvlJc w:val="left"/>
+      <w:pPr>
+        <w:tabs>
+          <w:tab w:val="num" w:pos="2880"/>
+        </w:tabs>
+        <w:ind w:left="2880" w:hanging="360"/>
+      </w:pPr>
+      <w:rPr>
+        <w:rFonts w:ascii="Wingdings" w:hAnsi="Wingdings" w:hint="default"/>
+        <w:sz w:val="20"/>
+      </w:rPr>
+    </w:lvl>
+    <w:lvl w:ilvl="4" w:tentative="1">
+      <w:start w:val="1"/>
+      <w:numFmt w:val="bullet"/>
+      <w:lvlText w:val=""/>
+      <w:lvlJc w:val="left"/>
+      <w:pPr>
+        <w:tabs>
+          <w:tab w:val="num" w:pos="3600"/>
+        </w:tabs>
+        <w:ind w:left="3600" w:hanging="360"/>
+      </w:pPr>
+      <w:rPr>
+        <w:rFonts w:ascii="Wingdings" w:hAnsi="Wingdings" w:hint="default"/>
+        <w:sz w:val="20"/>
+      </w:rPr>
+    </w:lvl>
+    <w:lvl w:ilvl="5" w:tentative="1">
+      <w:start w:val="1"/>
+      <w:numFmt w:val="bullet"/>
+      <w:lvlText w:val=""/>
+      <w:lvlJc w:val="left"/>
+      <w:pPr>
+        <w:tabs>
+          <w:tab w:val="num" w:pos="4320"/>
+        </w:tabs>
+        <w:ind w:left="4320" w:hanging="360"/>
+      </w:pPr>
+      <w:rPr>
+        <w:rFonts w:ascii="Wingdings" w:hAnsi="Wingdings" w:hint="default"/>
+        <w:sz w:val="20"/>
+      </w:rPr>
+    </w:lvl>
+    <w:lvl w:ilvl="6" w:tentative="1">
+      <w:start w:val="1"/>
+      <w:numFmt w:val="bullet"/>
+      <w:lvlText w:val=""/>
+      <w:lvlJc w:val="left"/>
+      <w:pPr>
+        <w:tabs>
+          <w:tab w:val="num" w:pos="5040"/>
+        </w:tabs>
+        <w:ind w:left="5040" w:hanging="360"/>
+      </w:pPr>
+      <w:rPr>
+        <w:rFonts w:ascii="Wingdings" w:hAnsi="Wingdings" w:hint="default"/>
+        <w:sz w:val="20"/>
+      </w:rPr>
+    </w:lvl>
+    <w:lvl w:ilvl="7" w:tentative="1">
+      <w:start w:val="1"/>
+      <w:numFmt w:val="bullet"/>
+      <w:lvlText w:val=""/>
+      <w:lvlJc w:val="left"/>
+      <w:pPr>
+        <w:tabs>
+          <w:tab w:val="num" w:pos="5760"/>
+        </w:tabs>
+        <w:ind w:left="5760" w:hanging="360"/>
+      </w:pPr>
+      <w:rPr>
+        <w:rFonts w:ascii="Wingdings" w:hAnsi="Wingdings" w:hint="default"/>
+        <w:sz w:val="20"/>
+      </w:rPr>
+    </w:lvl>
+    <w:lvl w:ilvl="8" w:tentative="1">
+      <w:start w:val="1"/>
+      <w:numFmt w:val="bullet"/>
+      <w:lvlText w:val=""/>
+      <w:lvlJc w:val="left"/>
+      <w:pPr>
+        <w:tabs>
+          <w:tab w:val="num" w:pos="6480"/>
+        </w:tabs>
+        <w:ind w:left="6480" w:hanging="360"/>
+      </w:pPr>
+      <w:rPr>
+        <w:rFonts w:ascii="Wingdings" w:hAnsi="Wingdings" w:hint="default"/>
+        <w:sz w:val="20"/>
+      </w:rPr>
+    </w:lvl>
+  </w:abstractNum>
+  <w:abstractNum w:abstractNumId="6" w15:restartNumberingAfterBreak="0">
+    <w:nsid w:val="26680BFD"/>
+    <w:multiLevelType w:val="multilevel"/>
+    <w:tmpl w:val="D93C62D0"/>
+    <w:lvl w:ilvl="0">
+      <w:start w:val="1"/>
+      <w:numFmt w:val="bullet"/>
+      <w:lvlText w:val=""/>
+      <w:lvlJc w:val="left"/>
+      <w:pPr>
+        <w:tabs>
+          <w:tab w:val="num" w:pos="720"/>
+        </w:tabs>
+        <w:ind w:left="720" w:hanging="360"/>
+      </w:pPr>
+      <w:rPr>
+        <w:rFonts w:ascii="Symbol" w:hAnsi="Symbol" w:hint="default"/>
+        <w:sz w:val="20"/>
+      </w:rPr>
+    </w:lvl>
+    <w:lvl w:ilvl="1">
+      <w:start w:val="1"/>
+      <w:numFmt w:val="bullet"/>
+      <w:lvlText w:val="o"/>
+      <w:lvlJc w:val="left"/>
+      <w:pPr>
+        <w:tabs>
+          <w:tab w:val="num" w:pos="1440"/>
+        </w:tabs>
+        <w:ind w:left="1440" w:hanging="360"/>
+      </w:pPr>
+      <w:rPr>
+        <w:rFonts w:ascii="Courier New" w:hAnsi="Courier New" w:hint="default"/>
+        <w:sz w:val="20"/>
+      </w:rPr>
+    </w:lvl>
+    <w:lvl w:ilvl="2" w:tentative="1">
+      <w:start w:val="1"/>
+      <w:numFmt w:val="bullet"/>
+      <w:lvlText w:val=""/>
+      <w:lvlJc w:val="left"/>
+      <w:pPr>
+        <w:tabs>
+          <w:tab w:val="num" w:pos="2160"/>
+        </w:tabs>
+        <w:ind w:left="2160" w:hanging="360"/>
+      </w:pPr>
+      <w:rPr>
+        <w:rFonts w:ascii="Wingdings" w:hAnsi="Wingdings" w:hint="default"/>
+        <w:sz w:val="20"/>
+      </w:rPr>
+    </w:lvl>
+    <w:lvl w:ilvl="3" w:tentative="1">
+      <w:start w:val="1"/>
+      <w:numFmt w:val="bullet"/>
+      <w:lvlText w:val=""/>
+      <w:lvlJc w:val="left"/>
+      <w:pPr>
+        <w:tabs>
+          <w:tab w:val="num" w:pos="2880"/>
+        </w:tabs>
+        <w:ind w:left="2880" w:hanging="360"/>
+      </w:pPr>
+      <w:rPr>
+        <w:rFonts w:ascii="Wingdings" w:hAnsi="Wingdings" w:hint="default"/>
+        <w:sz w:val="20"/>
+      </w:rPr>
+    </w:lvl>
+    <w:lvl w:ilvl="4" w:tentative="1">
+      <w:start w:val="1"/>
+      <w:numFmt w:val="bullet"/>
+      <w:lvlText w:val=""/>
+      <w:lvlJc w:val="left"/>
+      <w:pPr>
+        <w:tabs>
+          <w:tab w:val="num" w:pos="3600"/>
+        </w:tabs>
+        <w:ind w:left="3600" w:hanging="360"/>
+      </w:pPr>
+      <w:rPr>
+        <w:rFonts w:ascii="Wingdings" w:hAnsi="Wingdings" w:hint="default"/>
+        <w:sz w:val="20"/>
+      </w:rPr>
+    </w:lvl>
+    <w:lvl w:ilvl="5" w:tentative="1">
+      <w:start w:val="1"/>
+      <w:numFmt w:val="bullet"/>
+      <w:lvlText w:val=""/>
+      <w:lvlJc w:val="left"/>
+      <w:pPr>
+        <w:tabs>
+          <w:tab w:val="num" w:pos="4320"/>
+        </w:tabs>
+        <w:ind w:left="4320" w:hanging="360"/>
+      </w:pPr>
+      <w:rPr>
+        <w:rFonts w:ascii="Wingdings" w:hAnsi="Wingdings" w:hint="default"/>
+        <w:sz w:val="20"/>
+      </w:rPr>
+    </w:lvl>
+    <w:lvl w:ilvl="6" w:tentative="1">
+      <w:start w:val="1"/>
+      <w:numFmt w:val="bullet"/>
+      <w:lvlText w:val=""/>
+      <w:lvlJc w:val="left"/>
+      <w:pPr>
+        <w:tabs>
+          <w:tab w:val="num" w:pos="5040"/>
+        </w:tabs>
+        <w:ind w:left="5040" w:hanging="360"/>
+      </w:pPr>
+      <w:rPr>
+        <w:rFonts w:ascii="Wingdings" w:hAnsi="Wingdings" w:hint="default"/>
+        <w:sz w:val="20"/>
+      </w:rPr>
+    </w:lvl>
+    <w:lvl w:ilvl="7" w:tentative="1">
+      <w:start w:val="1"/>
+      <w:numFmt w:val="bullet"/>
+      <w:lvlText w:val=""/>
+      <w:lvlJc w:val="left"/>
+      <w:pPr>
+        <w:tabs>
+          <w:tab w:val="num" w:pos="5760"/>
+        </w:tabs>
+        <w:ind w:left="5760" w:hanging="360"/>
+      </w:pPr>
+      <w:rPr>
+        <w:rFonts w:ascii="Wingdings" w:hAnsi="Wingdings" w:hint="default"/>
+        <w:sz w:val="20"/>
+      </w:rPr>
+    </w:lvl>
+    <w:lvl w:ilvl="8" w:tentative="1">
+      <w:start w:val="1"/>
+      <w:numFmt w:val="bullet"/>
+      <w:lvlText w:val=""/>
+      <w:lvlJc w:val="left"/>
+      <w:pPr>
+        <w:tabs>
+          <w:tab w:val="num" w:pos="6480"/>
+        </w:tabs>
+        <w:ind w:left="6480" w:hanging="360"/>
+      </w:pPr>
+      <w:rPr>
+        <w:rFonts w:ascii="Wingdings" w:hAnsi="Wingdings" w:hint="default"/>
+        <w:sz w:val="20"/>
+      </w:rPr>
+    </w:lvl>
+  </w:abstractNum>
+  <w:abstractNum w:abstractNumId="7" w15:restartNumberingAfterBreak="0">
+    <w:nsid w:val="272F62D6"/>
+    <w:multiLevelType w:val="multilevel"/>
+    <w:tmpl w:val="823E23CE"/>
+    <w:lvl w:ilvl="0">
+      <w:start w:val="1"/>
+      <w:numFmt w:val="bullet"/>
+      <w:lvlText w:val=""/>
+      <w:lvlJc w:val="left"/>
+      <w:pPr>
+        <w:tabs>
+          <w:tab w:val="num" w:pos="720"/>
+        </w:tabs>
+        <w:ind w:left="720" w:hanging="360"/>
+      </w:pPr>
+      <w:rPr>
+        <w:rFonts w:ascii="Symbol" w:hAnsi="Symbol" w:hint="default"/>
+        <w:sz w:val="20"/>
+      </w:rPr>
+    </w:lvl>
+    <w:lvl w:ilvl="1" w:tentative="1">
+      <w:start w:val="1"/>
+      <w:numFmt w:val="bullet"/>
+      <w:lvlText w:val="o"/>
+      <w:lvlJc w:val="left"/>
+      <w:pPr>
+        <w:tabs>
+          <w:tab w:val="num" w:pos="1440"/>
+        </w:tabs>
+        <w:ind w:left="1440" w:hanging="360"/>
+      </w:pPr>
+      <w:rPr>
+        <w:rFonts w:ascii="Courier New" w:hAnsi="Courier New" w:hint="default"/>
+        <w:sz w:val="20"/>
+      </w:rPr>
+    </w:lvl>
+    <w:lvl w:ilvl="2" w:tentative="1">
+      <w:start w:val="1"/>
+      <w:numFmt w:val="bullet"/>
+      <w:lvlText w:val=""/>
+      <w:lvlJc w:val="left"/>
+      <w:pPr>
+        <w:tabs>
+          <w:tab w:val="num" w:pos="2160"/>
+        </w:tabs>
+        <w:ind w:left="2160" w:hanging="360"/>
+      </w:pPr>
+      <w:rPr>
+        <w:rFonts w:ascii="Wingdings" w:hAnsi="Wingdings" w:hint="default"/>
+        <w:sz w:val="20"/>
+      </w:rPr>
+    </w:lvl>
+    <w:lvl w:ilvl="3" w:tentative="1">
+      <w:start w:val="1"/>
+      <w:numFmt w:val="bullet"/>
+      <w:lvlText w:val=""/>
+      <w:lvlJc w:val="left"/>
+      <w:pPr>
+        <w:tabs>
+          <w:tab w:val="num" w:pos="2880"/>
+        </w:tabs>
+        <w:ind w:left="2880" w:hanging="360"/>
+      </w:pPr>
+      <w:rPr>
+        <w:rFonts w:ascii="Wingdings" w:hAnsi="Wingdings" w:hint="default"/>
+        <w:sz w:val="20"/>
+      </w:rPr>
+    </w:lvl>
+    <w:lvl w:ilvl="4" w:tentative="1">
+      <w:start w:val="1"/>
+      <w:numFmt w:val="bullet"/>
+      <w:lvlText w:val=""/>
+      <w:lvlJc w:val="left"/>
+      <w:pPr>
+        <w:tabs>
+          <w:tab w:val="num" w:pos="3600"/>
+        </w:tabs>
+        <w:ind w:left="3600" w:hanging="360"/>
+      </w:pPr>
+      <w:rPr>
+        <w:rFonts w:ascii="Wingdings" w:hAnsi="Wingdings" w:hint="default"/>
+        <w:sz w:val="20"/>
+      </w:rPr>
+    </w:lvl>
+    <w:lvl w:ilvl="5" w:tentative="1">
+      <w:start w:val="1"/>
+      <w:numFmt w:val="bullet"/>
+      <w:lvlText w:val=""/>
+      <w:lvlJc w:val="left"/>
+      <w:pPr>
+        <w:tabs>
+          <w:tab w:val="num" w:pos="4320"/>
+        </w:tabs>
+        <w:ind w:left="4320" w:hanging="360"/>
+      </w:pPr>
+      <w:rPr>
+        <w:rFonts w:ascii="Wingdings" w:hAnsi="Wingdings" w:hint="default"/>
+        <w:sz w:val="20"/>
+      </w:rPr>
+    </w:lvl>
+    <w:lvl w:ilvl="6" w:tentative="1">
+      <w:start w:val="1"/>
+      <w:numFmt w:val="bullet"/>
+      <w:lvlText w:val=""/>
+      <w:lvlJc w:val="left"/>
+      <w:pPr>
+        <w:tabs>
+          <w:tab w:val="num" w:pos="5040"/>
+        </w:tabs>
+        <w:ind w:left="5040" w:hanging="360"/>
+      </w:pPr>
+      <w:rPr>
+        <w:rFonts w:ascii="Wingdings" w:hAnsi="Wingdings" w:hint="default"/>
+        <w:sz w:val="20"/>
+      </w:rPr>
+    </w:lvl>
+    <w:lvl w:ilvl="7" w:tentative="1">
+      <w:start w:val="1"/>
+      <w:numFmt w:val="bullet"/>
+      <w:lvlText w:val=""/>
+      <w:lvlJc w:val="left"/>
+      <w:pPr>
+        <w:tabs>
+          <w:tab w:val="num" w:pos="5760"/>
+        </w:tabs>
+        <w:ind w:left="5760" w:hanging="360"/>
+      </w:pPr>
+      <w:rPr>
+        <w:rFonts w:ascii="Wingdings" w:hAnsi="Wingdings" w:hint="default"/>
+        <w:sz w:val="20"/>
+      </w:rPr>
+    </w:lvl>
+    <w:lvl w:ilvl="8" w:tentative="1">
+      <w:start w:val="1"/>
+      <w:numFmt w:val="bullet"/>
+      <w:lvlText w:val=""/>
+      <w:lvlJc w:val="left"/>
+      <w:pPr>
+        <w:tabs>
+          <w:tab w:val="num" w:pos="6480"/>
+        </w:tabs>
+        <w:ind w:left="6480" w:hanging="360"/>
+      </w:pPr>
+      <w:rPr>
+        <w:rFonts w:ascii="Wingdings" w:hAnsi="Wingdings" w:hint="default"/>
+        <w:sz w:val="20"/>
+      </w:rPr>
+    </w:lvl>
+  </w:abstractNum>
+  <w:abstractNum w:abstractNumId="8" w15:restartNumberingAfterBreak="0">
+    <w:nsid w:val="33550F4C"/>
+    <w:multiLevelType w:val="hybridMultilevel"/>
+    <w:tmpl w:val="4C108384"/>
+    <w:lvl w:ilvl="0" w:tplc="40090001">
+      <w:start w:val="1"/>
+      <w:numFmt w:val="bullet"/>
+      <w:lvlText w:val=""/>
+      <w:lvlJc w:val="left"/>
+      <w:pPr>
+        <w:ind w:left="1440" w:hanging="360"/>
+      </w:pPr>
+      <w:rPr>
+        <w:rFonts w:ascii="Symbol" w:hAnsi="Symbol" w:hint="default"/>
+      </w:rPr>
+    </w:lvl>
+    <w:lvl w:ilvl="1" w:tplc="40090003" w:tentative="1">
+      <w:start w:val="1"/>
+      <w:numFmt w:val="bullet"/>
+      <w:lvlText w:val="o"/>
+      <w:lvlJc w:val="left"/>
+      <w:pPr>
+        <w:ind w:left="2160" w:hanging="360"/>
+      </w:pPr>
+      <w:rPr>
+        <w:rFonts w:ascii="Courier New" w:hAnsi="Courier New" w:cs="Courier New" w:hint="default"/>
+      </w:rPr>
+    </w:lvl>
+    <w:lvl w:ilvl="2" w:tplc="40090005" w:tentative="1">
+      <w:start w:val="1"/>
+      <w:numFmt w:val="bullet"/>
+      <w:lvlText w:val=""/>
+      <w:lvlJc w:val="left"/>
+      <w:pPr>
+        <w:ind w:left="2880" w:hanging="360"/>
+      </w:pPr>
+      <w:rPr>
+        <w:rFonts w:ascii="Wingdings" w:hAnsi="Wingdings" w:hint="default"/>
+      </w:rPr>
+    </w:lvl>
+    <w:lvl w:ilvl="3" w:tplc="40090001" w:tentative="1">
+      <w:start w:val="1"/>
+      <w:numFmt w:val="bullet"/>
+      <w:lvlText w:val=""/>
+      <w:lvlJc w:val="left"/>
+      <w:pPr>
+        <w:ind w:left="3600" w:hanging="360"/>
+      </w:pPr>
+      <w:rPr>
+        <w:rFonts w:ascii="Symbol" w:hAnsi="Symbol" w:hint="default"/>
+      </w:rPr>
+    </w:lvl>
+    <w:lvl w:ilvl="4" w:tplc="40090003" w:tentative="1">
+      <w:start w:val="1"/>
+      <w:numFmt w:val="bullet"/>
+      <w:lvlText w:val="o"/>
+      <w:lvlJc w:val="left"/>
+      <w:pPr>
+        <w:ind w:left="4320" w:hanging="360"/>
+      </w:pPr>
+      <w:rPr>
+        <w:rFonts w:ascii="Courier New" w:hAnsi="Courier New" w:cs="Courier New" w:hint="default"/>
+      </w:rPr>
+    </w:lvl>
+    <w:lvl w:ilvl="5" w:tplc="40090005" w:tentative="1">
+      <w:start w:val="1"/>
+      <w:numFmt w:val="bullet"/>
+      <w:lvlText w:val=""/>
+      <w:lvlJc w:val="left"/>
+      <w:pPr>
+        <w:ind w:left="5040" w:hanging="360"/>
+      </w:pPr>
+      <w:rPr>
+        <w:rFonts w:ascii="Wingdings" w:hAnsi="Wingdings" w:hint="default"/>
+      </w:rPr>
+    </w:lvl>
+    <w:lvl w:ilvl="6" w:tplc="40090001" w:tentative="1">
+      <w:start w:val="1"/>
+      <w:numFmt w:val="bullet"/>
+      <w:lvlText w:val=""/>
+      <w:lvlJc w:val="left"/>
+      <w:pPr>
+        <w:ind w:left="5760" w:hanging="360"/>
+      </w:pPr>
+      <w:rPr>
+        <w:rFonts w:ascii="Symbol" w:hAnsi="Symbol" w:hint="default"/>
+      </w:rPr>
+    </w:lvl>
+    <w:lvl w:ilvl="7" w:tplc="40090003" w:tentative="1">
+      <w:start w:val="1"/>
+      <w:numFmt w:val="bullet"/>
+      <w:lvlText w:val="o"/>
+      <w:lvlJc w:val="left"/>
+      <w:pPr>
+        <w:ind w:left="6480" w:hanging="360"/>
+      </w:pPr>
+      <w:rPr>
+        <w:rFonts w:ascii="Courier New" w:hAnsi="Courier New" w:cs="Courier New" w:hint="default"/>
+      </w:rPr>
+    </w:lvl>
+    <w:lvl w:ilvl="8" w:tplc="40090005" w:tentative="1">
+      <w:start w:val="1"/>
+      <w:numFmt w:val="bullet"/>
+      <w:lvlText w:val=""/>
+      <w:lvlJc w:val="left"/>
+      <w:pPr>
+        <w:ind w:left="7200" w:hanging="360"/>
+      </w:pPr>
+      <w:rPr>
+        <w:rFonts w:ascii="Wingdings" w:hAnsi="Wingdings" w:hint="default"/>
+      </w:rPr>
+    </w:lvl>
+  </w:abstractNum>
+  <w:abstractNum w:abstractNumId="9" w15:restartNumberingAfterBreak="0">
+    <w:nsid w:val="34600574"/>
+    <w:multiLevelType w:val="multilevel"/>
+    <w:tmpl w:val="DFA44364"/>
+    <w:lvl w:ilvl="0">
+      <w:start w:val="1"/>
+      <w:numFmt w:val="bullet"/>
+      <w:lvlText w:val=""/>
+      <w:lvlJc w:val="left"/>
+      <w:pPr>
+        <w:tabs>
+          <w:tab w:val="num" w:pos="720"/>
+        </w:tabs>
+        <w:ind w:left="720" w:hanging="360"/>
+      </w:pPr>
+      <w:rPr>
+        <w:rFonts w:ascii="Symbol" w:hAnsi="Symbol" w:hint="default"/>
+        <w:sz w:val="20"/>
+      </w:rPr>
+    </w:lvl>
+    <w:lvl w:ilvl="1" w:tentative="1">
+      <w:start w:val="1"/>
+      <w:numFmt w:val="bullet"/>
+      <w:lvlText w:val="o"/>
+      <w:lvlJc w:val="left"/>
+      <w:pPr>
+        <w:tabs>
+          <w:tab w:val="num" w:pos="1440"/>
+        </w:tabs>
+        <w:ind w:left="1440" w:hanging="360"/>
+      </w:pPr>
+      <w:rPr>
+        <w:rFonts w:ascii="Courier New" w:hAnsi="Courier New" w:hint="default"/>
+        <w:sz w:val="20"/>
+      </w:rPr>
+    </w:lvl>
+    <w:lvl w:ilvl="2" w:tentative="1">
+      <w:start w:val="1"/>
+      <w:numFmt w:val="bullet"/>
+      <w:lvlText w:val=""/>
+      <w:lvlJc w:val="left"/>
+      <w:pPr>
+        <w:tabs>
+          <w:tab w:val="num" w:pos="2160"/>
+        </w:tabs>
+        <w:ind w:left="2160" w:hanging="360"/>
+      </w:pPr>
+      <w:rPr>
+        <w:rFonts w:ascii="Wingdings" w:hAnsi="Wingdings" w:hint="default"/>
+        <w:sz w:val="20"/>
+      </w:rPr>
+    </w:lvl>
+    <w:lvl w:ilvl="3" w:tentative="1">
+      <w:start w:val="1"/>
+      <w:numFmt w:val="bullet"/>
+      <w:lvlText w:val=""/>
+      <w:lvlJc w:val="left"/>
+      <w:pPr>
+        <w:tabs>
+          <w:tab w:val="num" w:pos="2880"/>
+        </w:tabs>
+        <w:ind w:left="2880" w:hanging="360"/>
+      </w:pPr>
+      <w:rPr>
+        <w:rFonts w:ascii="Wingdings" w:hAnsi="Wingdings" w:hint="default"/>
+        <w:sz w:val="20"/>
+      </w:rPr>
+    </w:lvl>
+    <w:lvl w:ilvl="4" w:tentative="1">
+      <w:start w:val="1"/>
+      <w:numFmt w:val="bullet"/>
+      <w:lvlText w:val=""/>
+      <w:lvlJc w:val="left"/>
+      <w:pPr>
+        <w:tabs>
+          <w:tab w:val="num" w:pos="3600"/>
+        </w:tabs>
+        <w:ind w:left="3600" w:hanging="360"/>
+      </w:pPr>
+      <w:rPr>
+        <w:rFonts w:ascii="Wingdings" w:hAnsi="Wingdings" w:hint="default"/>
+        <w:sz w:val="20"/>
+      </w:rPr>
+    </w:lvl>
+    <w:lvl w:ilvl="5" w:tentative="1">
+      <w:start w:val="1"/>
+      <w:numFmt w:val="bullet"/>
+      <w:lvlText w:val=""/>
+      <w:lvlJc w:val="left"/>
+      <w:pPr>
+        <w:tabs>
+          <w:tab w:val="num" w:pos="4320"/>
+        </w:tabs>
+        <w:ind w:left="4320" w:hanging="360"/>
+      </w:pPr>
+      <w:rPr>
+        <w:rFonts w:ascii="Wingdings" w:hAnsi="Wingdings" w:hint="default"/>
+        <w:sz w:val="20"/>
+      </w:rPr>
+    </w:lvl>
+    <w:lvl w:ilvl="6" w:tentative="1">
+      <w:start w:val="1"/>
+      <w:numFmt w:val="bullet"/>
+      <w:lvlText w:val=""/>
+      <w:lvlJc w:val="left"/>
+      <w:pPr>
+        <w:tabs>
+          <w:tab w:val="num" w:pos="5040"/>
+        </w:tabs>
+        <w:ind w:left="5040" w:hanging="360"/>
+      </w:pPr>
+      <w:rPr>
+        <w:rFonts w:ascii="Wingdings" w:hAnsi="Wingdings" w:hint="default"/>
+        <w:sz w:val="20"/>
+      </w:rPr>
+    </w:lvl>
+    <w:lvl w:ilvl="7" w:tentative="1">
+      <w:start w:val="1"/>
+      <w:numFmt w:val="bullet"/>
+      <w:lvlText w:val=""/>
+      <w:lvlJc w:val="left"/>
+      <w:pPr>
+        <w:tabs>
+          <w:tab w:val="num" w:pos="5760"/>
+        </w:tabs>
+        <w:ind w:left="5760" w:hanging="360"/>
+      </w:pPr>
+      <w:rPr>
+        <w:rFonts w:ascii="Wingdings" w:hAnsi="Wingdings" w:hint="default"/>
+        <w:sz w:val="20"/>
+      </w:rPr>
+    </w:lvl>
+    <w:lvl w:ilvl="8" w:tentative="1">
+      <w:start w:val="1"/>
+      <w:numFmt w:val="bullet"/>
+      <w:lvlText w:val=""/>
+      <w:lvlJc w:val="left"/>
+      <w:pPr>
+        <w:tabs>
+          <w:tab w:val="num" w:pos="6480"/>
+        </w:tabs>
+        <w:ind w:left="6480" w:hanging="360"/>
+      </w:pPr>
+      <w:rPr>
+        <w:rFonts w:ascii="Wingdings" w:hAnsi="Wingdings" w:hint="default"/>
+        <w:sz w:val="20"/>
+      </w:rPr>
+    </w:lvl>
+  </w:abstractNum>
+  <w:abstractNum w:abstractNumId="10" w15:restartNumberingAfterBreak="0">
     <w:nsid w:val="43415B91"/>
     <w:multiLevelType w:val="hybridMultilevel"/>
     <w:tmpl w:val="3EBACCA4"/>
@@ -3802,10 +6994,10 @@
       </w:rPr>
     </w:lvl>
   </w:abstractNum>
-  <w:abstractNum w:abstractNumId="6" w15:restartNumberingAfterBreak="0">
+  <w:abstractNum w:abstractNumId="11" w15:restartNumberingAfterBreak="0">
     <w:nsid w:val="63E50FEE"/>
     <w:multiLevelType w:val="hybridMultilevel"/>
-    <w:tmpl w:val="36E443B2"/>
+    <w:tmpl w:val="CCDEF3F4"/>
     <w:lvl w:ilvl="0" w:tplc="40090001">
       <w:start w:val="1"/>
       <w:numFmt w:val="bullet"/>
@@ -3915,7 +7107,454 @@
       </w:rPr>
     </w:lvl>
   </w:abstractNum>
-  <w:abstractNum w:abstractNumId="7" w15:restartNumberingAfterBreak="0">
+  <w:abstractNum w:abstractNumId="12" w15:restartNumberingAfterBreak="0">
+    <w:nsid w:val="69BC30CD"/>
+    <w:multiLevelType w:val="multilevel"/>
+    <w:tmpl w:val="D93C62D0"/>
+    <w:lvl w:ilvl="0">
+      <w:start w:val="1"/>
+      <w:numFmt w:val="bullet"/>
+      <w:lvlText w:val=""/>
+      <w:lvlJc w:val="left"/>
+      <w:pPr>
+        <w:tabs>
+          <w:tab w:val="num" w:pos="720"/>
+        </w:tabs>
+        <w:ind w:left="720" w:hanging="360"/>
+      </w:pPr>
+      <w:rPr>
+        <w:rFonts w:ascii="Symbol" w:hAnsi="Symbol" w:hint="default"/>
+        <w:sz w:val="20"/>
+      </w:rPr>
+    </w:lvl>
+    <w:lvl w:ilvl="1" w:tentative="1">
+      <w:start w:val="1"/>
+      <w:numFmt w:val="bullet"/>
+      <w:lvlText w:val="o"/>
+      <w:lvlJc w:val="left"/>
+      <w:pPr>
+        <w:tabs>
+          <w:tab w:val="num" w:pos="1440"/>
+        </w:tabs>
+        <w:ind w:left="1440" w:hanging="360"/>
+      </w:pPr>
+      <w:rPr>
+        <w:rFonts w:ascii="Courier New" w:hAnsi="Courier New" w:hint="default"/>
+        <w:sz w:val="20"/>
+      </w:rPr>
+    </w:lvl>
+    <w:lvl w:ilvl="2" w:tentative="1">
+      <w:start w:val="1"/>
+      <w:numFmt w:val="bullet"/>
+      <w:lvlText w:val=""/>
+      <w:lvlJc w:val="left"/>
+      <w:pPr>
+        <w:tabs>
+          <w:tab w:val="num" w:pos="2160"/>
+        </w:tabs>
+        <w:ind w:left="2160" w:hanging="360"/>
+      </w:pPr>
+      <w:rPr>
+        <w:rFonts w:ascii="Wingdings" w:hAnsi="Wingdings" w:hint="default"/>
+        <w:sz w:val="20"/>
+      </w:rPr>
+    </w:lvl>
+    <w:lvl w:ilvl="3" w:tentative="1">
+      <w:start w:val="1"/>
+      <w:numFmt w:val="bullet"/>
+      <w:lvlText w:val=""/>
+      <w:lvlJc w:val="left"/>
+      <w:pPr>
+        <w:tabs>
+          <w:tab w:val="num" w:pos="2880"/>
+        </w:tabs>
+        <w:ind w:left="2880" w:hanging="360"/>
+      </w:pPr>
+      <w:rPr>
+        <w:rFonts w:ascii="Wingdings" w:hAnsi="Wingdings" w:hint="default"/>
+        <w:sz w:val="20"/>
+      </w:rPr>
+    </w:lvl>
+    <w:lvl w:ilvl="4" w:tentative="1">
+      <w:start w:val="1"/>
+      <w:numFmt w:val="bullet"/>
+      <w:lvlText w:val=""/>
+      <w:lvlJc w:val="left"/>
+      <w:pPr>
+        <w:tabs>
+          <w:tab w:val="num" w:pos="3600"/>
+        </w:tabs>
+        <w:ind w:left="3600" w:hanging="360"/>
+      </w:pPr>
+      <w:rPr>
+        <w:rFonts w:ascii="Wingdings" w:hAnsi="Wingdings" w:hint="default"/>
+        <w:sz w:val="20"/>
+      </w:rPr>
+    </w:lvl>
+    <w:lvl w:ilvl="5" w:tentative="1">
+      <w:start w:val="1"/>
+      <w:numFmt w:val="bullet"/>
+      <w:lvlText w:val=""/>
+      <w:lvlJc w:val="left"/>
+      <w:pPr>
+        <w:tabs>
+          <w:tab w:val="num" w:pos="4320"/>
+        </w:tabs>
+        <w:ind w:left="4320" w:hanging="360"/>
+      </w:pPr>
+      <w:rPr>
+        <w:rFonts w:ascii="Wingdings" w:hAnsi="Wingdings" w:hint="default"/>
+        <w:sz w:val="20"/>
+      </w:rPr>
+    </w:lvl>
+    <w:lvl w:ilvl="6" w:tentative="1">
+      <w:start w:val="1"/>
+      <w:numFmt w:val="bullet"/>
+      <w:lvlText w:val=""/>
+      <w:lvlJc w:val="left"/>
+      <w:pPr>
+        <w:tabs>
+          <w:tab w:val="num" w:pos="5040"/>
+        </w:tabs>
+        <w:ind w:left="5040" w:hanging="360"/>
+      </w:pPr>
+      <w:rPr>
+        <w:rFonts w:ascii="Wingdings" w:hAnsi="Wingdings" w:hint="default"/>
+        <w:sz w:val="20"/>
+      </w:rPr>
+    </w:lvl>
+    <w:lvl w:ilvl="7" w:tentative="1">
+      <w:start w:val="1"/>
+      <w:numFmt w:val="bullet"/>
+      <w:lvlText w:val=""/>
+      <w:lvlJc w:val="left"/>
+      <w:pPr>
+        <w:tabs>
+          <w:tab w:val="num" w:pos="5760"/>
+        </w:tabs>
+        <w:ind w:left="5760" w:hanging="360"/>
+      </w:pPr>
+      <w:rPr>
+        <w:rFonts w:ascii="Wingdings" w:hAnsi="Wingdings" w:hint="default"/>
+        <w:sz w:val="20"/>
+      </w:rPr>
+    </w:lvl>
+    <w:lvl w:ilvl="8" w:tentative="1">
+      <w:start w:val="1"/>
+      <w:numFmt w:val="bullet"/>
+      <w:lvlText w:val=""/>
+      <w:lvlJc w:val="left"/>
+      <w:pPr>
+        <w:tabs>
+          <w:tab w:val="num" w:pos="6480"/>
+        </w:tabs>
+        <w:ind w:left="6480" w:hanging="360"/>
+      </w:pPr>
+      <w:rPr>
+        <w:rFonts w:ascii="Wingdings" w:hAnsi="Wingdings" w:hint="default"/>
+        <w:sz w:val="20"/>
+      </w:rPr>
+    </w:lvl>
+  </w:abstractNum>
+  <w:abstractNum w:abstractNumId="13" w15:restartNumberingAfterBreak="0">
+    <w:nsid w:val="6D022B39"/>
+    <w:multiLevelType w:val="multilevel"/>
+    <w:tmpl w:val="D93C62D0"/>
+    <w:lvl w:ilvl="0">
+      <w:start w:val="1"/>
+      <w:numFmt w:val="bullet"/>
+      <w:lvlText w:val=""/>
+      <w:lvlJc w:val="left"/>
+      <w:pPr>
+        <w:tabs>
+          <w:tab w:val="num" w:pos="720"/>
+        </w:tabs>
+        <w:ind w:left="720" w:hanging="360"/>
+      </w:pPr>
+      <w:rPr>
+        <w:rFonts w:ascii="Symbol" w:hAnsi="Symbol" w:hint="default"/>
+        <w:sz w:val="20"/>
+      </w:rPr>
+    </w:lvl>
+    <w:lvl w:ilvl="1">
+      <w:start w:val="1"/>
+      <w:numFmt w:val="bullet"/>
+      <w:lvlText w:val="o"/>
+      <w:lvlJc w:val="left"/>
+      <w:pPr>
+        <w:tabs>
+          <w:tab w:val="num" w:pos="1440"/>
+        </w:tabs>
+        <w:ind w:left="1440" w:hanging="360"/>
+      </w:pPr>
+      <w:rPr>
+        <w:rFonts w:ascii="Courier New" w:hAnsi="Courier New" w:hint="default"/>
+        <w:sz w:val="20"/>
+      </w:rPr>
+    </w:lvl>
+    <w:lvl w:ilvl="2" w:tentative="1">
+      <w:start w:val="1"/>
+      <w:numFmt w:val="bullet"/>
+      <w:lvlText w:val=""/>
+      <w:lvlJc w:val="left"/>
+      <w:pPr>
+        <w:tabs>
+          <w:tab w:val="num" w:pos="2160"/>
+        </w:tabs>
+        <w:ind w:left="2160" w:hanging="360"/>
+      </w:pPr>
+      <w:rPr>
+        <w:rFonts w:ascii="Wingdings" w:hAnsi="Wingdings" w:hint="default"/>
+        <w:sz w:val="20"/>
+      </w:rPr>
+    </w:lvl>
+    <w:lvl w:ilvl="3" w:tentative="1">
+      <w:start w:val="1"/>
+      <w:numFmt w:val="bullet"/>
+      <w:lvlText w:val=""/>
+      <w:lvlJc w:val="left"/>
+      <w:pPr>
+        <w:tabs>
+          <w:tab w:val="num" w:pos="2880"/>
+        </w:tabs>
+        <w:ind w:left="2880" w:hanging="360"/>
+      </w:pPr>
+      <w:rPr>
+        <w:rFonts w:ascii="Wingdings" w:hAnsi="Wingdings" w:hint="default"/>
+        <w:sz w:val="20"/>
+      </w:rPr>
+    </w:lvl>
+    <w:lvl w:ilvl="4" w:tentative="1">
+      <w:start w:val="1"/>
+      <w:numFmt w:val="bullet"/>
+      <w:lvlText w:val=""/>
+      <w:lvlJc w:val="left"/>
+      <w:pPr>
+        <w:tabs>
+          <w:tab w:val="num" w:pos="3600"/>
+        </w:tabs>
+        <w:ind w:left="3600" w:hanging="360"/>
+      </w:pPr>
+      <w:rPr>
+        <w:rFonts w:ascii="Wingdings" w:hAnsi="Wingdings" w:hint="default"/>
+        <w:sz w:val="20"/>
+      </w:rPr>
+    </w:lvl>
+    <w:lvl w:ilvl="5" w:tentative="1">
+      <w:start w:val="1"/>
+      <w:numFmt w:val="bullet"/>
+      <w:lvlText w:val=""/>
+      <w:lvlJc w:val="left"/>
+      <w:pPr>
+        <w:tabs>
+          <w:tab w:val="num" w:pos="4320"/>
+        </w:tabs>
+        <w:ind w:left="4320" w:hanging="360"/>
+      </w:pPr>
+      <w:rPr>
+        <w:rFonts w:ascii="Wingdings" w:hAnsi="Wingdings" w:hint="default"/>
+        <w:sz w:val="20"/>
+      </w:rPr>
+    </w:lvl>
+    <w:lvl w:ilvl="6" w:tentative="1">
+      <w:start w:val="1"/>
+      <w:numFmt w:val="bullet"/>
+      <w:lvlText w:val=""/>
+      <w:lvlJc w:val="left"/>
+      <w:pPr>
+        <w:tabs>
+          <w:tab w:val="num" w:pos="5040"/>
+        </w:tabs>
+        <w:ind w:left="5040" w:hanging="360"/>
+      </w:pPr>
+      <w:rPr>
+        <w:rFonts w:ascii="Wingdings" w:hAnsi="Wingdings" w:hint="default"/>
+        <w:sz w:val="20"/>
+      </w:rPr>
+    </w:lvl>
+    <w:lvl w:ilvl="7" w:tentative="1">
+      <w:start w:val="1"/>
+      <w:numFmt w:val="bullet"/>
+      <w:lvlText w:val=""/>
+      <w:lvlJc w:val="left"/>
+      <w:pPr>
+        <w:tabs>
+          <w:tab w:val="num" w:pos="5760"/>
+        </w:tabs>
+        <w:ind w:left="5760" w:hanging="360"/>
+      </w:pPr>
+      <w:rPr>
+        <w:rFonts w:ascii="Wingdings" w:hAnsi="Wingdings" w:hint="default"/>
+        <w:sz w:val="20"/>
+      </w:rPr>
+    </w:lvl>
+    <w:lvl w:ilvl="8" w:tentative="1">
+      <w:start w:val="1"/>
+      <w:numFmt w:val="bullet"/>
+      <w:lvlText w:val=""/>
+      <w:lvlJc w:val="left"/>
+      <w:pPr>
+        <w:tabs>
+          <w:tab w:val="num" w:pos="6480"/>
+        </w:tabs>
+        <w:ind w:left="6480" w:hanging="360"/>
+      </w:pPr>
+      <w:rPr>
+        <w:rFonts w:ascii="Wingdings" w:hAnsi="Wingdings" w:hint="default"/>
+        <w:sz w:val="20"/>
+      </w:rPr>
+    </w:lvl>
+  </w:abstractNum>
+  <w:abstractNum w:abstractNumId="14" w15:restartNumberingAfterBreak="0">
+    <w:nsid w:val="6D3B4BA9"/>
+    <w:multiLevelType w:val="multilevel"/>
+    <w:tmpl w:val="823E23CE"/>
+    <w:lvl w:ilvl="0">
+      <w:start w:val="1"/>
+      <w:numFmt w:val="bullet"/>
+      <w:lvlText w:val=""/>
+      <w:lvlJc w:val="left"/>
+      <w:pPr>
+        <w:tabs>
+          <w:tab w:val="num" w:pos="720"/>
+        </w:tabs>
+        <w:ind w:left="720" w:hanging="360"/>
+      </w:pPr>
+      <w:rPr>
+        <w:rFonts w:ascii="Symbol" w:hAnsi="Symbol" w:hint="default"/>
+        <w:sz w:val="20"/>
+      </w:rPr>
+    </w:lvl>
+    <w:lvl w:ilvl="1">
+      <w:start w:val="1"/>
+      <w:numFmt w:val="bullet"/>
+      <w:lvlText w:val="o"/>
+      <w:lvlJc w:val="left"/>
+      <w:pPr>
+        <w:tabs>
+          <w:tab w:val="num" w:pos="1440"/>
+        </w:tabs>
+        <w:ind w:left="1440" w:hanging="360"/>
+      </w:pPr>
+      <w:rPr>
+        <w:rFonts w:ascii="Courier New" w:hAnsi="Courier New" w:hint="default"/>
+        <w:sz w:val="20"/>
+      </w:rPr>
+    </w:lvl>
+    <w:lvl w:ilvl="2" w:tentative="1">
+      <w:start w:val="1"/>
+      <w:numFmt w:val="bullet"/>
+      <w:lvlText w:val=""/>
+      <w:lvlJc w:val="left"/>
+      <w:pPr>
+        <w:tabs>
+          <w:tab w:val="num" w:pos="2160"/>
+        </w:tabs>
+        <w:ind w:left="2160" w:hanging="360"/>
+      </w:pPr>
+      <w:rPr>
+        <w:rFonts w:ascii="Wingdings" w:hAnsi="Wingdings" w:hint="default"/>
+        <w:sz w:val="20"/>
+      </w:rPr>
+    </w:lvl>
+    <w:lvl w:ilvl="3" w:tentative="1">
+      <w:start w:val="1"/>
+      <w:numFmt w:val="bullet"/>
+      <w:lvlText w:val=""/>
+      <w:lvlJc w:val="left"/>
+      <w:pPr>
+        <w:tabs>
+          <w:tab w:val="num" w:pos="2880"/>
+        </w:tabs>
+        <w:ind w:left="2880" w:hanging="360"/>
+      </w:pPr>
+      <w:rPr>
+        <w:rFonts w:ascii="Wingdings" w:hAnsi="Wingdings" w:hint="default"/>
+        <w:sz w:val="20"/>
+      </w:rPr>
+    </w:lvl>
+    <w:lvl w:ilvl="4" w:tentative="1">
+      <w:start w:val="1"/>
+      <w:numFmt w:val="bullet"/>
+      <w:lvlText w:val=""/>
+      <w:lvlJc w:val="left"/>
+      <w:pPr>
+        <w:tabs>
+          <w:tab w:val="num" w:pos="3600"/>
+        </w:tabs>
+        <w:ind w:left="3600" w:hanging="360"/>
+      </w:pPr>
+      <w:rPr>
+        <w:rFonts w:ascii="Wingdings" w:hAnsi="Wingdings" w:hint="default"/>
+        <w:sz w:val="20"/>
+      </w:rPr>
+    </w:lvl>
+    <w:lvl w:ilvl="5" w:tentative="1">
+      <w:start w:val="1"/>
+      <w:numFmt w:val="bullet"/>
+      <w:lvlText w:val=""/>
+      <w:lvlJc w:val="left"/>
+      <w:pPr>
+        <w:tabs>
+          <w:tab w:val="num" w:pos="4320"/>
+        </w:tabs>
+        <w:ind w:left="4320" w:hanging="360"/>
+      </w:pPr>
+      <w:rPr>
+        <w:rFonts w:ascii="Wingdings" w:hAnsi="Wingdings" w:hint="default"/>
+        <w:sz w:val="20"/>
+      </w:rPr>
+    </w:lvl>
+    <w:lvl w:ilvl="6" w:tentative="1">
+      <w:start w:val="1"/>
+      <w:numFmt w:val="bullet"/>
+      <w:lvlText w:val=""/>
+      <w:lvlJc w:val="left"/>
+      <w:pPr>
+        <w:tabs>
+          <w:tab w:val="num" w:pos="5040"/>
+        </w:tabs>
+        <w:ind w:left="5040" w:hanging="360"/>
+      </w:pPr>
+      <w:rPr>
+        <w:rFonts w:ascii="Wingdings" w:hAnsi="Wingdings" w:hint="default"/>
+        <w:sz w:val="20"/>
+      </w:rPr>
+    </w:lvl>
+    <w:lvl w:ilvl="7" w:tentative="1">
+      <w:start w:val="1"/>
+      <w:numFmt w:val="bullet"/>
+      <w:lvlText w:val=""/>
+      <w:lvlJc w:val="left"/>
+      <w:pPr>
+        <w:tabs>
+          <w:tab w:val="num" w:pos="5760"/>
+        </w:tabs>
+        <w:ind w:left="5760" w:hanging="360"/>
+      </w:pPr>
+      <w:rPr>
+        <w:rFonts w:ascii="Wingdings" w:hAnsi="Wingdings" w:hint="default"/>
+        <w:sz w:val="20"/>
+      </w:rPr>
+    </w:lvl>
+    <w:lvl w:ilvl="8" w:tentative="1">
+      <w:start w:val="1"/>
+      <w:numFmt w:val="bullet"/>
+      <w:lvlText w:val=""/>
+      <w:lvlJc w:val="left"/>
+      <w:pPr>
+        <w:tabs>
+          <w:tab w:val="num" w:pos="6480"/>
+        </w:tabs>
+        <w:ind w:left="6480" w:hanging="360"/>
+      </w:pPr>
+      <w:rPr>
+        <w:rFonts w:ascii="Wingdings" w:hAnsi="Wingdings" w:hint="default"/>
+        <w:sz w:val="20"/>
+      </w:rPr>
+    </w:lvl>
+  </w:abstractNum>
+  <w:abstractNum w:abstractNumId="15" w15:restartNumberingAfterBreak="0">
     <w:nsid w:val="6F52624E"/>
     <w:multiLevelType w:val="hybridMultilevel"/>
     <w:tmpl w:val="E97859D0"/>
@@ -4028,7 +7667,7 @@
       </w:rPr>
     </w:lvl>
   </w:abstractNum>
-  <w:abstractNum w:abstractNumId="8" w15:restartNumberingAfterBreak="0">
+  <w:abstractNum w:abstractNumId="16" w15:restartNumberingAfterBreak="0">
     <w:nsid w:val="6F637BA1"/>
     <w:multiLevelType w:val="hybridMultilevel"/>
     <w:tmpl w:val="25C43BFE"/>
@@ -4141,7 +7780,7 @@
       </w:rPr>
     </w:lvl>
   </w:abstractNum>
-  <w:abstractNum w:abstractNumId="9" w15:restartNumberingAfterBreak="0">
+  <w:abstractNum w:abstractNumId="17" w15:restartNumberingAfterBreak="0">
     <w:nsid w:val="747D3423"/>
     <w:multiLevelType w:val="hybridMultilevel"/>
     <w:tmpl w:val="8BF80C9C"/>
@@ -4255,34 +7894,58 @@
     </w:lvl>
   </w:abstractNum>
   <w:num w:numId="1" w16cid:durableId="335811534">
-    <w:abstractNumId w:val="7"/>
+    <w:abstractNumId w:val="15"/>
   </w:num>
   <w:num w:numId="2" w16cid:durableId="1843156507">
     <w:abstractNumId w:val="0"/>
   </w:num>
   <w:num w:numId="3" w16cid:durableId="1947150590">
-    <w:abstractNumId w:val="5"/>
+    <w:abstractNumId w:val="10"/>
   </w:num>
   <w:num w:numId="4" w16cid:durableId="603539994">
     <w:abstractNumId w:val="2"/>
   </w:num>
   <w:num w:numId="5" w16cid:durableId="1614744212">
-    <w:abstractNumId w:val="8"/>
+    <w:abstractNumId w:val="16"/>
   </w:num>
   <w:num w:numId="6" w16cid:durableId="541400149">
     <w:abstractNumId w:val="4"/>
   </w:num>
   <w:num w:numId="7" w16cid:durableId="1787432973">
-    <w:abstractNumId w:val="6"/>
+    <w:abstractNumId w:val="11"/>
   </w:num>
   <w:num w:numId="8" w16cid:durableId="1836988155">
-    <w:abstractNumId w:val="9"/>
+    <w:abstractNumId w:val="17"/>
   </w:num>
   <w:num w:numId="9" w16cid:durableId="872038818">
     <w:abstractNumId w:val="3"/>
   </w:num>
   <w:num w:numId="10" w16cid:durableId="682323288">
     <w:abstractNumId w:val="1"/>
+  </w:num>
+  <w:num w:numId="11" w16cid:durableId="1377202142">
+    <w:abstractNumId w:val="9"/>
+  </w:num>
+  <w:num w:numId="12" w16cid:durableId="1805466515">
+    <w:abstractNumId w:val="8"/>
+  </w:num>
+  <w:num w:numId="13" w16cid:durableId="281811730">
+    <w:abstractNumId w:val="12"/>
+  </w:num>
+  <w:num w:numId="14" w16cid:durableId="1300572818">
+    <w:abstractNumId w:val="14"/>
+  </w:num>
+  <w:num w:numId="15" w16cid:durableId="393742930">
+    <w:abstractNumId w:val="5"/>
+  </w:num>
+  <w:num w:numId="16" w16cid:durableId="2136286863">
+    <w:abstractNumId w:val="13"/>
+  </w:num>
+  <w:num w:numId="17" w16cid:durableId="1360819728">
+    <w:abstractNumId w:val="7"/>
+  </w:num>
+  <w:num w:numId="18" w16cid:durableId="1839535389">
+    <w:abstractNumId w:val="6"/>
   </w:num>
 </w:numbering>
 </file>
@@ -4891,7 +8554,6 @@
   <w:style w:type="character" w:default="1" w:styleId="DefaultParagraphFont">
     <w:name w:val="Default Paragraph Font"/>
     <w:uiPriority w:val="1"/>
-    <w:semiHidden/>
     <w:unhideWhenUsed/>
   </w:style>
   <w:style w:type="table" w:default="1" w:styleId="TableNormal">

</xml_diff>